<commit_message>
update cau hoi & cau tra loi dau tien
</commit_message>
<xml_diff>
--- a/doc/05-NguyenKhacDuy.docx
+++ b/doc/05-NguyenKhacDuy.docx
@@ -81,19 +81,27 @@
           <w:szCs w:val="26"/>
         </w:rPr>
       </w:pPr>
-      <w:proofErr w:type="spellStart"/>
-      <w:r>
-        <w:rPr>
-          <w:rFonts w:ascii="Times New Roman" w:hAnsi="Times New Roman" w:cs="Times New Roman"/>
-          <w:sz w:val="26"/>
-          <w:szCs w:val="26"/>
-        </w:rPr>
-        <w:t>Nhóm</w:t>
-      </w:r>
-      <w:proofErr w:type="spellEnd"/>
-      <w:r>
-        <w:rPr>
-          <w:rFonts w:ascii="Times New Roman" w:hAnsi="Times New Roman" w:cs="Times New Roman"/>
+      <w:r>
+        <w:rPr>
+          <w:rFonts w:ascii="Times New Roman" w:hAnsi="Times New Roman" w:cs="Times New Roman"/>
+          <w:sz w:val="26"/>
+          <w:szCs w:val="26"/>
+        </w:rPr>
+        <w:t xml:space="preserve">Nhóm </w:t>
+      </w:r>
+      <w:r>
+        <w:rPr>
+          <w:rFonts w:ascii="Times New Roman" w:hAnsi="Times New Roman" w:cs="Times New Roman"/>
+          <w:color w:val="000000" w:themeColor="text1"/>
+          <w:sz w:val="26"/>
+          <w:szCs w:val="26"/>
+        </w:rPr>
+        <w:t>04</w:t>
+      </w:r>
+      <w:r>
+        <w:rPr>
+          <w:rFonts w:ascii="Times New Roman" w:hAnsi="Times New Roman" w:cs="Times New Roman"/>
+          <w:color w:val="FF0000"/>
           <w:sz w:val="26"/>
           <w:szCs w:val="26"/>
         </w:rPr>
@@ -102,24 +110,6 @@
       <w:r>
         <w:rPr>
           <w:rFonts w:ascii="Times New Roman" w:hAnsi="Times New Roman" w:cs="Times New Roman"/>
-          <w:color w:val="000000" w:themeColor="text1"/>
-          <w:sz w:val="26"/>
-          <w:szCs w:val="26"/>
-        </w:rPr>
-        <w:t>04</w:t>
-      </w:r>
-      <w:r>
-        <w:rPr>
-          <w:rFonts w:ascii="Times New Roman" w:hAnsi="Times New Roman" w:cs="Times New Roman"/>
-          <w:color w:val="FF0000"/>
-          <w:sz w:val="26"/>
-          <w:szCs w:val="26"/>
-        </w:rPr>
-        <w:t xml:space="preserve"> </w:t>
-      </w:r>
-      <w:r>
-        <w:rPr>
-          <w:rFonts w:ascii="Times New Roman" w:hAnsi="Times New Roman" w:cs="Times New Roman"/>
           <w:sz w:val="26"/>
           <w:szCs w:val="26"/>
         </w:rPr>
@@ -131,37 +121,8 @@
           <w:sz w:val="26"/>
           <w:szCs w:val="26"/>
         </w:rPr>
-        <w:t xml:space="preserve">Thành </w:t>
-      </w:r>
-      <w:proofErr w:type="spellStart"/>
-      <w:r>
-        <w:rPr>
-          <w:rFonts w:ascii="Times New Roman" w:hAnsi="Times New Roman" w:cs="Times New Roman"/>
-          <w:sz w:val="26"/>
-          <w:szCs w:val="26"/>
-        </w:rPr>
-        <w:t>viên</w:t>
-      </w:r>
-      <w:proofErr w:type="spellEnd"/>
-      <w:r>
-        <w:rPr>
-          <w:rFonts w:ascii="Times New Roman" w:hAnsi="Times New Roman" w:cs="Times New Roman"/>
-          <w:sz w:val="26"/>
-          <w:szCs w:val="26"/>
-        </w:rPr>
-        <w:t xml:space="preserve"> </w:t>
-      </w:r>
-      <w:proofErr w:type="spellStart"/>
-      <w:proofErr w:type="gramStart"/>
-      <w:r>
-        <w:rPr>
-          <w:rFonts w:ascii="Times New Roman" w:hAnsi="Times New Roman" w:cs="Times New Roman"/>
-          <w:sz w:val="26"/>
-          <w:szCs w:val="26"/>
-        </w:rPr>
-        <w:t>nhóm</w:t>
-      </w:r>
-      <w:proofErr w:type="spellEnd"/>
+        <w:t>Thành viên nhóm</w:t>
+      </w:r>
       <w:r>
         <w:rPr>
           <w:rFonts w:ascii="Times New Roman" w:hAnsi="Times New Roman" w:cs="Times New Roman"/>
@@ -170,7 +131,6 @@
         </w:rPr>
         <w:t xml:space="preserve"> :</w:t>
       </w:r>
-      <w:proofErr w:type="gramEnd"/>
     </w:p>
     <w:p>
       <w:pPr>
@@ -276,47 +236,7 @@
                 <w:sz w:val="26"/>
                 <w:szCs w:val="26"/>
               </w:rPr>
-              <w:t>Lê Trần Quang Thanh (</w:t>
-            </w:r>
-            <w:proofErr w:type="spellStart"/>
-            <w:r>
-              <w:rPr>
-                <w:rFonts w:ascii="Times New Roman" w:hAnsi="Times New Roman" w:cs="Times New Roman"/>
-                <w:color w:val="000000" w:themeColor="text1"/>
-                <w:sz w:val="26"/>
-                <w:szCs w:val="26"/>
-              </w:rPr>
-              <w:t>Nhóm</w:t>
-            </w:r>
-            <w:proofErr w:type="spellEnd"/>
-            <w:r>
-              <w:rPr>
-                <w:rFonts w:ascii="Times New Roman" w:hAnsi="Times New Roman" w:cs="Times New Roman"/>
-                <w:color w:val="000000" w:themeColor="text1"/>
-                <w:sz w:val="26"/>
-                <w:szCs w:val="26"/>
-              </w:rPr>
-              <w:t xml:space="preserve"> </w:t>
-            </w:r>
-            <w:proofErr w:type="spellStart"/>
-            <w:r>
-              <w:rPr>
-                <w:rFonts w:ascii="Times New Roman" w:hAnsi="Times New Roman" w:cs="Times New Roman"/>
-                <w:color w:val="000000" w:themeColor="text1"/>
-                <w:sz w:val="26"/>
-                <w:szCs w:val="26"/>
-              </w:rPr>
-              <w:t>trưởng</w:t>
-            </w:r>
-            <w:proofErr w:type="spellEnd"/>
-            <w:r>
-              <w:rPr>
-                <w:rFonts w:ascii="Times New Roman" w:hAnsi="Times New Roman" w:cs="Times New Roman"/>
-                <w:color w:val="000000" w:themeColor="text1"/>
-                <w:sz w:val="26"/>
-                <w:szCs w:val="26"/>
-              </w:rPr>
-              <w:t>)</w:t>
+              <w:t>Lê Trần Quang Thanh (Nhóm trưởng)</w:t>
             </w:r>
           </w:p>
         </w:tc>
@@ -475,27 +395,7 @@
                 <w:sz w:val="26"/>
                 <w:szCs w:val="26"/>
               </w:rPr>
-              <w:t xml:space="preserve">Nguyễn </w:t>
-            </w:r>
-            <w:proofErr w:type="spellStart"/>
-            <w:r>
-              <w:rPr>
-                <w:rFonts w:ascii="Times New Roman" w:hAnsi="Times New Roman" w:cs="Times New Roman"/>
-                <w:color w:val="000000" w:themeColor="text1"/>
-                <w:sz w:val="26"/>
-                <w:szCs w:val="26"/>
-              </w:rPr>
-              <w:t>Khắc</w:t>
-            </w:r>
-            <w:proofErr w:type="spellEnd"/>
-            <w:r>
-              <w:rPr>
-                <w:rFonts w:ascii="Times New Roman" w:hAnsi="Times New Roman" w:cs="Times New Roman"/>
-                <w:color w:val="000000" w:themeColor="text1"/>
-                <w:sz w:val="26"/>
-                <w:szCs w:val="26"/>
-              </w:rPr>
-              <w:t xml:space="preserve"> Duy</w:t>
+              <w:t>Nguyễn Khắc Duy</w:t>
             </w:r>
           </w:p>
         </w:tc>
@@ -541,7 +441,6 @@
                 <w:szCs w:val="26"/>
               </w:rPr>
             </w:pPr>
-            <w:proofErr w:type="spellStart"/>
             <w:r>
               <w:rPr>
                 <w:rFonts w:ascii="Times New Roman" w:hAnsi="Times New Roman" w:cs="Times New Roman"/>
@@ -549,17 +448,7 @@
                 <w:sz w:val="26"/>
                 <w:szCs w:val="26"/>
               </w:rPr>
-              <w:t>Hồ</w:t>
-            </w:r>
-            <w:proofErr w:type="spellEnd"/>
-            <w:r>
-              <w:rPr>
-                <w:rFonts w:ascii="Times New Roman" w:hAnsi="Times New Roman" w:cs="Times New Roman"/>
-                <w:color w:val="000000" w:themeColor="text1"/>
-                <w:sz w:val="26"/>
-                <w:szCs w:val="26"/>
-              </w:rPr>
-              <w:t xml:space="preserve"> Văn Khánh</w:t>
+              <w:t>Hồ Văn Khánh</w:t>
             </w:r>
           </w:p>
         </w:tc>
@@ -615,7 +504,6 @@
           <w:szCs w:val="26"/>
         </w:rPr>
       </w:pPr>
-      <w:proofErr w:type="spellStart"/>
       <w:r>
         <w:rPr>
           <w:rFonts w:ascii="Times New Roman" w:hAnsi="Times New Roman" w:cs="Times New Roman"/>
@@ -623,57 +511,7 @@
           <w:sz w:val="26"/>
           <w:szCs w:val="26"/>
         </w:rPr>
-        <w:t>Tên</w:t>
-      </w:r>
-      <w:proofErr w:type="spellEnd"/>
-      <w:r>
-        <w:rPr>
-          <w:rFonts w:ascii="Times New Roman" w:hAnsi="Times New Roman" w:cs="Times New Roman"/>
-          <w:i/>
-          <w:sz w:val="26"/>
-          <w:szCs w:val="26"/>
-        </w:rPr>
-        <w:t xml:space="preserve"> </w:t>
-      </w:r>
-      <w:proofErr w:type="spellStart"/>
-      <w:r>
-        <w:rPr>
-          <w:rFonts w:ascii="Times New Roman" w:hAnsi="Times New Roman" w:cs="Times New Roman"/>
-          <w:i/>
-          <w:sz w:val="26"/>
-          <w:szCs w:val="26"/>
-        </w:rPr>
-        <w:t>ứng</w:t>
-      </w:r>
-      <w:proofErr w:type="spellEnd"/>
-      <w:r>
-        <w:rPr>
-          <w:rFonts w:ascii="Times New Roman" w:hAnsi="Times New Roman" w:cs="Times New Roman"/>
-          <w:i/>
-          <w:sz w:val="26"/>
-          <w:szCs w:val="26"/>
-        </w:rPr>
-        <w:t xml:space="preserve"> </w:t>
-      </w:r>
-      <w:proofErr w:type="spellStart"/>
-      <w:r>
-        <w:rPr>
-          <w:rFonts w:ascii="Times New Roman" w:hAnsi="Times New Roman" w:cs="Times New Roman"/>
-          <w:i/>
-          <w:sz w:val="26"/>
-          <w:szCs w:val="26"/>
-        </w:rPr>
-        <w:t>dụng</w:t>
-      </w:r>
-      <w:proofErr w:type="spellEnd"/>
-      <w:r>
-        <w:rPr>
-          <w:rFonts w:ascii="Times New Roman" w:hAnsi="Times New Roman" w:cs="Times New Roman"/>
-          <w:i/>
-          <w:sz w:val="26"/>
-          <w:szCs w:val="26"/>
-        </w:rPr>
-        <w:t>:</w:t>
+        <w:t>Tên ứng dụng:</w:t>
       </w:r>
       <w:r>
         <w:rPr>
@@ -717,16 +555,14 @@
           <w:szCs w:val="26"/>
         </w:rPr>
       </w:pPr>
-      <w:proofErr w:type="spellStart"/>
-      <w:r>
-        <w:rPr>
-          <w:rFonts w:ascii="Times New Roman" w:hAnsi="Times New Roman" w:cs="Times New Roman"/>
-          <w:sz w:val="26"/>
-          <w:szCs w:val="26"/>
-        </w:rPr>
-        <w:t>Thời</w:t>
-      </w:r>
-      <w:proofErr w:type="spellEnd"/>
+      <w:r>
+        <w:rPr>
+          <w:rFonts w:ascii="Times New Roman" w:hAnsi="Times New Roman" w:cs="Times New Roman"/>
+          <w:sz w:val="26"/>
+          <w:szCs w:val="26"/>
+        </w:rPr>
+        <w:t>Thời gian thực hiện: Từ</w:t>
+      </w:r>
       <w:r>
         <w:rPr>
           <w:rFonts w:ascii="Times New Roman" w:hAnsi="Times New Roman" w:cs="Times New Roman"/>
@@ -735,78 +571,6 @@
         </w:rPr>
         <w:t xml:space="preserve"> </w:t>
       </w:r>
-      <w:proofErr w:type="spellStart"/>
-      <w:r>
-        <w:rPr>
-          <w:rFonts w:ascii="Times New Roman" w:hAnsi="Times New Roman" w:cs="Times New Roman"/>
-          <w:sz w:val="26"/>
-          <w:szCs w:val="26"/>
-        </w:rPr>
-        <w:t>gian</w:t>
-      </w:r>
-      <w:proofErr w:type="spellEnd"/>
-      <w:r>
-        <w:rPr>
-          <w:rFonts w:ascii="Times New Roman" w:hAnsi="Times New Roman" w:cs="Times New Roman"/>
-          <w:sz w:val="26"/>
-          <w:szCs w:val="26"/>
-        </w:rPr>
-        <w:t xml:space="preserve"> </w:t>
-      </w:r>
-      <w:proofErr w:type="spellStart"/>
-      <w:r>
-        <w:rPr>
-          <w:rFonts w:ascii="Times New Roman" w:hAnsi="Times New Roman" w:cs="Times New Roman"/>
-          <w:sz w:val="26"/>
-          <w:szCs w:val="26"/>
-        </w:rPr>
-        <w:t>thực</w:t>
-      </w:r>
-      <w:proofErr w:type="spellEnd"/>
-      <w:r>
-        <w:rPr>
-          <w:rFonts w:ascii="Times New Roman" w:hAnsi="Times New Roman" w:cs="Times New Roman"/>
-          <w:sz w:val="26"/>
-          <w:szCs w:val="26"/>
-        </w:rPr>
-        <w:t xml:space="preserve"> </w:t>
-      </w:r>
-      <w:proofErr w:type="spellStart"/>
-      <w:r>
-        <w:rPr>
-          <w:rFonts w:ascii="Times New Roman" w:hAnsi="Times New Roman" w:cs="Times New Roman"/>
-          <w:sz w:val="26"/>
-          <w:szCs w:val="26"/>
-        </w:rPr>
-        <w:t>hiện</w:t>
-      </w:r>
-      <w:proofErr w:type="spellEnd"/>
-      <w:r>
-        <w:rPr>
-          <w:rFonts w:ascii="Times New Roman" w:hAnsi="Times New Roman" w:cs="Times New Roman"/>
-          <w:sz w:val="26"/>
-          <w:szCs w:val="26"/>
-        </w:rPr>
-        <w:t xml:space="preserve">: </w:t>
-      </w:r>
-      <w:proofErr w:type="spellStart"/>
-      <w:r>
-        <w:rPr>
-          <w:rFonts w:ascii="Times New Roman" w:hAnsi="Times New Roman" w:cs="Times New Roman"/>
-          <w:sz w:val="26"/>
-          <w:szCs w:val="26"/>
-        </w:rPr>
-        <w:t>Từ</w:t>
-      </w:r>
-      <w:proofErr w:type="spellEnd"/>
-      <w:r>
-        <w:rPr>
-          <w:rFonts w:ascii="Times New Roman" w:hAnsi="Times New Roman" w:cs="Times New Roman"/>
-          <w:sz w:val="26"/>
-          <w:szCs w:val="26"/>
-        </w:rPr>
-        <w:t xml:space="preserve"> </w:t>
-      </w:r>
       <w:r>
         <w:rPr>
           <w:rFonts w:ascii="Times New Roman" w:hAnsi="Times New Roman" w:cs="Times New Roman"/>
@@ -853,25 +617,7 @@
           <w:sz w:val="26"/>
           <w:szCs w:val="26"/>
         </w:rPr>
-        <w:t xml:space="preserve"> </w:t>
-      </w:r>
-      <w:proofErr w:type="spellStart"/>
-      <w:r>
-        <w:rPr>
-          <w:rFonts w:ascii="Times New Roman" w:hAnsi="Times New Roman" w:cs="Times New Roman"/>
-          <w:sz w:val="26"/>
-          <w:szCs w:val="26"/>
-        </w:rPr>
-        <w:t>đến</w:t>
-      </w:r>
-      <w:proofErr w:type="spellEnd"/>
-      <w:r>
-        <w:rPr>
-          <w:rFonts w:ascii="Times New Roman" w:hAnsi="Times New Roman" w:cs="Times New Roman"/>
-          <w:sz w:val="26"/>
-          <w:szCs w:val="26"/>
-        </w:rPr>
-        <w:t xml:space="preserve"> </w:t>
+        <w:t xml:space="preserve"> đến </w:t>
       </w:r>
       <w:r>
         <w:rPr>
@@ -927,25 +673,7 @@
           <w:sz w:val="26"/>
           <w:szCs w:val="26"/>
         </w:rPr>
-        <w:t xml:space="preserve"> </w:t>
-      </w:r>
-      <w:proofErr w:type="spellStart"/>
-      <w:r>
-        <w:rPr>
-          <w:rFonts w:ascii="Times New Roman" w:hAnsi="Times New Roman" w:cs="Times New Roman"/>
-          <w:sz w:val="26"/>
-          <w:szCs w:val="26"/>
-        </w:rPr>
-        <w:t>tuần</w:t>
-      </w:r>
-      <w:proofErr w:type="spellEnd"/>
-      <w:r>
-        <w:rPr>
-          <w:rFonts w:ascii="Times New Roman" w:hAnsi="Times New Roman" w:cs="Times New Roman"/>
-          <w:sz w:val="26"/>
-          <w:szCs w:val="26"/>
-        </w:rPr>
-        <w:t>)</w:t>
+        <w:t xml:space="preserve"> tuần)</w:t>
       </w:r>
     </w:p>
     <w:p>
@@ -986,67 +714,16 @@
           <w:sz w:val="26"/>
           <w:szCs w:val="26"/>
         </w:rPr>
-        <w:t xml:space="preserve">Thu </w:t>
-      </w:r>
-      <w:proofErr w:type="spellStart"/>
-      <w:r>
-        <w:rPr>
-          <w:rFonts w:ascii="Times New Roman" w:hAnsi="Times New Roman" w:cs="Times New Roman"/>
-          <w:b/>
-          <w:sz w:val="26"/>
-          <w:szCs w:val="26"/>
-        </w:rPr>
-        <w:t>thập</w:t>
-      </w:r>
-      <w:proofErr w:type="spellEnd"/>
-      <w:r>
-        <w:rPr>
-          <w:rFonts w:ascii="Times New Roman" w:hAnsi="Times New Roman" w:cs="Times New Roman"/>
-          <w:b/>
-          <w:sz w:val="26"/>
-          <w:szCs w:val="26"/>
-        </w:rPr>
-        <w:t xml:space="preserve"> </w:t>
-      </w:r>
-      <w:proofErr w:type="spellStart"/>
-      <w:r>
-        <w:rPr>
-          <w:rFonts w:ascii="Times New Roman" w:hAnsi="Times New Roman" w:cs="Times New Roman"/>
-          <w:b/>
-          <w:sz w:val="26"/>
-          <w:szCs w:val="26"/>
-        </w:rPr>
-        <w:t>yêu</w:t>
-      </w:r>
-      <w:proofErr w:type="spellEnd"/>
-      <w:r>
-        <w:rPr>
-          <w:rFonts w:ascii="Times New Roman" w:hAnsi="Times New Roman" w:cs="Times New Roman"/>
-          <w:b/>
-          <w:sz w:val="26"/>
-          <w:szCs w:val="26"/>
-        </w:rPr>
-        <w:t xml:space="preserve"> </w:t>
-      </w:r>
-      <w:proofErr w:type="spellStart"/>
-      <w:r>
-        <w:rPr>
-          <w:rFonts w:ascii="Times New Roman" w:hAnsi="Times New Roman" w:cs="Times New Roman"/>
-          <w:b/>
-          <w:sz w:val="26"/>
-          <w:szCs w:val="26"/>
-        </w:rPr>
-        <w:t>cầu</w:t>
-      </w:r>
-      <w:proofErr w:type="spellEnd"/>
-      <w:r>
-        <w:rPr>
-          <w:rFonts w:ascii="Times New Roman" w:hAnsi="Times New Roman" w:cs="Times New Roman"/>
-          <w:b/>
-          <w:sz w:val="26"/>
-          <w:szCs w:val="26"/>
-        </w:rPr>
-        <w:t>:</w:t>
+        <w:t>Thu thập</w:t>
+      </w:r>
+      <w:r>
+        <w:rPr>
+          <w:rFonts w:ascii="Times New Roman" w:hAnsi="Times New Roman" w:cs="Times New Roman"/>
+          <w:b/>
+          <w:sz w:val="26"/>
+          <w:szCs w:val="26"/>
+        </w:rPr>
+        <w:t xml:space="preserve"> yêu cầu:</w:t>
       </w:r>
     </w:p>
     <w:p>
@@ -1065,77 +742,24 @@
           <w:szCs w:val="26"/>
         </w:rPr>
       </w:pPr>
-      <w:proofErr w:type="spellStart"/>
-      <w:r>
-        <w:rPr>
-          <w:rFonts w:ascii="Times New Roman" w:hAnsi="Times New Roman" w:cs="Times New Roman"/>
-          <w:b/>
-          <w:sz w:val="26"/>
-          <w:szCs w:val="26"/>
-        </w:rPr>
-        <w:t>Khảo</w:t>
-      </w:r>
-      <w:proofErr w:type="spellEnd"/>
-      <w:r>
-        <w:rPr>
-          <w:rFonts w:ascii="Times New Roman" w:hAnsi="Times New Roman" w:cs="Times New Roman"/>
-          <w:b/>
-          <w:sz w:val="26"/>
-          <w:szCs w:val="26"/>
-        </w:rPr>
-        <w:t xml:space="preserve"> </w:t>
-      </w:r>
-      <w:proofErr w:type="spellStart"/>
-      <w:r>
-        <w:rPr>
-          <w:rFonts w:ascii="Times New Roman" w:hAnsi="Times New Roman" w:cs="Times New Roman"/>
-          <w:b/>
-          <w:sz w:val="26"/>
-          <w:szCs w:val="26"/>
-        </w:rPr>
-        <w:t>sát</w:t>
-      </w:r>
-      <w:proofErr w:type="spellEnd"/>
-      <w:r>
-        <w:rPr>
-          <w:rFonts w:ascii="Times New Roman" w:hAnsi="Times New Roman" w:cs="Times New Roman"/>
-          <w:b/>
-          <w:sz w:val="26"/>
-          <w:szCs w:val="26"/>
-        </w:rPr>
-        <w:t xml:space="preserve"> </w:t>
-      </w:r>
-      <w:proofErr w:type="spellStart"/>
-      <w:r>
-        <w:rPr>
-          <w:rFonts w:ascii="Times New Roman" w:hAnsi="Times New Roman" w:cs="Times New Roman"/>
-          <w:b/>
-          <w:sz w:val="26"/>
-          <w:szCs w:val="26"/>
-        </w:rPr>
-        <w:t>hiện</w:t>
-      </w:r>
-      <w:proofErr w:type="spellEnd"/>
-      <w:r>
-        <w:rPr>
-          <w:rFonts w:ascii="Times New Roman" w:hAnsi="Times New Roman" w:cs="Times New Roman"/>
-          <w:b/>
-          <w:sz w:val="26"/>
-          <w:szCs w:val="26"/>
-        </w:rPr>
-        <w:t xml:space="preserve"> </w:t>
-      </w:r>
-      <w:proofErr w:type="spellStart"/>
-      <w:r>
-        <w:rPr>
-          <w:rFonts w:ascii="Times New Roman" w:hAnsi="Times New Roman" w:cs="Times New Roman"/>
-          <w:b/>
-          <w:sz w:val="26"/>
-          <w:szCs w:val="26"/>
-        </w:rPr>
-        <w:t>trạng</w:t>
-      </w:r>
-      <w:proofErr w:type="spellEnd"/>
+      <w:r>
+        <w:rPr>
+          <w:rFonts w:ascii="Times New Roman" w:hAnsi="Times New Roman" w:cs="Times New Roman"/>
+          <w:b/>
+          <w:sz w:val="26"/>
+          <w:szCs w:val="26"/>
+        </w:rPr>
+        <w:t>Khảo sát</w:t>
+      </w:r>
+      <w:r>
+        <w:rPr>
+          <w:rFonts w:ascii="Times New Roman" w:hAnsi="Times New Roman" w:cs="Times New Roman"/>
+          <w:b/>
+          <w:sz w:val="26"/>
+          <w:szCs w:val="26"/>
+        </w:rPr>
+        <w:t xml:space="preserve"> hiện trạng</w:t>
+      </w:r>
       <w:r>
         <w:rPr>
           <w:rFonts w:ascii="Times New Roman" w:hAnsi="Times New Roman" w:cs="Times New Roman"/>
@@ -1169,59 +793,8 @@
           <w:sz w:val="26"/>
           <w:szCs w:val="26"/>
         </w:rPr>
-        <w:t xml:space="preserve">Quy </w:t>
-      </w:r>
-      <w:proofErr w:type="spellStart"/>
-      <w:r>
-        <w:rPr>
-          <w:rFonts w:ascii="Times New Roman" w:hAnsi="Times New Roman" w:cs="Times New Roman"/>
-          <w:b/>
-          <w:sz w:val="26"/>
-          <w:szCs w:val="26"/>
-        </w:rPr>
-        <w:t>trình</w:t>
-      </w:r>
-      <w:proofErr w:type="spellEnd"/>
-      <w:r>
-        <w:rPr>
-          <w:rFonts w:ascii="Times New Roman" w:hAnsi="Times New Roman" w:cs="Times New Roman"/>
-          <w:b/>
-          <w:sz w:val="26"/>
-          <w:szCs w:val="26"/>
-        </w:rPr>
-        <w:t xml:space="preserve"> </w:t>
-      </w:r>
-      <w:proofErr w:type="spellStart"/>
-      <w:r>
-        <w:rPr>
-          <w:rFonts w:ascii="Times New Roman" w:hAnsi="Times New Roman" w:cs="Times New Roman"/>
-          <w:b/>
-          <w:sz w:val="26"/>
-          <w:szCs w:val="26"/>
-        </w:rPr>
-        <w:t>nghiệp</w:t>
-      </w:r>
-      <w:proofErr w:type="spellEnd"/>
-      <w:r>
-        <w:rPr>
-          <w:rFonts w:ascii="Times New Roman" w:hAnsi="Times New Roman" w:cs="Times New Roman"/>
-          <w:b/>
-          <w:sz w:val="26"/>
-          <w:szCs w:val="26"/>
-        </w:rPr>
-        <w:t xml:space="preserve"> </w:t>
-      </w:r>
-      <w:proofErr w:type="spellStart"/>
-      <w:r>
-        <w:rPr>
-          <w:rFonts w:ascii="Times New Roman" w:hAnsi="Times New Roman" w:cs="Times New Roman"/>
-          <w:b/>
-          <w:sz w:val="26"/>
-          <w:szCs w:val="26"/>
-        </w:rPr>
-        <w:t>vụ</w:t>
-      </w:r>
-      <w:proofErr w:type="spellEnd"/>
+        <w:t>Quy trình nghiệp vụ</w:t>
+      </w:r>
     </w:p>
     <w:p>
       <w:pPr>
@@ -1246,27 +819,7 @@
           <w:sz w:val="26"/>
           <w:szCs w:val="26"/>
         </w:rPr>
-        <w:t xml:space="preserve">Quy </w:t>
-      </w:r>
-      <w:proofErr w:type="spellStart"/>
-      <w:r>
-        <w:rPr>
-          <w:rFonts w:ascii="Times New Roman" w:hAnsi="Times New Roman" w:cs="Times New Roman"/>
-          <w:b/>
-          <w:sz w:val="26"/>
-          <w:szCs w:val="26"/>
-        </w:rPr>
-        <w:t>định</w:t>
-      </w:r>
-      <w:proofErr w:type="spellEnd"/>
-      <w:r>
-        <w:rPr>
-          <w:rFonts w:ascii="Times New Roman" w:hAnsi="Times New Roman" w:cs="Times New Roman"/>
-          <w:b/>
-          <w:sz w:val="26"/>
-          <w:szCs w:val="26"/>
-        </w:rPr>
-        <w:t>:</w:t>
+        <w:t>Quy định:</w:t>
       </w:r>
     </w:p>
     <w:p>
@@ -1307,308 +860,44 @@
           <w:sz w:val="26"/>
           <w:szCs w:val="26"/>
         </w:rPr>
-        <w:t xml:space="preserve">Danh </w:t>
-      </w:r>
-      <w:proofErr w:type="spellStart"/>
-      <w:r>
-        <w:rPr>
-          <w:rFonts w:ascii="Times New Roman" w:hAnsi="Times New Roman" w:cs="Times New Roman"/>
-          <w:b/>
-          <w:sz w:val="26"/>
-          <w:szCs w:val="26"/>
-        </w:rPr>
-        <w:t>sách</w:t>
-      </w:r>
-      <w:proofErr w:type="spellEnd"/>
-      <w:r>
-        <w:rPr>
-          <w:rFonts w:ascii="Times New Roman" w:hAnsi="Times New Roman" w:cs="Times New Roman"/>
-          <w:b/>
-          <w:sz w:val="26"/>
-          <w:szCs w:val="26"/>
-        </w:rPr>
-        <w:t xml:space="preserve"> </w:t>
-      </w:r>
-      <w:proofErr w:type="spellStart"/>
-      <w:r>
-        <w:rPr>
-          <w:rFonts w:ascii="Times New Roman" w:hAnsi="Times New Roman" w:cs="Times New Roman"/>
-          <w:b/>
-          <w:sz w:val="26"/>
-          <w:szCs w:val="26"/>
-        </w:rPr>
-        <w:t>các</w:t>
-      </w:r>
-      <w:proofErr w:type="spellEnd"/>
-      <w:r>
-        <w:rPr>
-          <w:rFonts w:ascii="Times New Roman" w:hAnsi="Times New Roman" w:cs="Times New Roman"/>
-          <w:b/>
-          <w:sz w:val="26"/>
-          <w:szCs w:val="26"/>
-        </w:rPr>
-        <w:t xml:space="preserve"> </w:t>
-      </w:r>
-      <w:proofErr w:type="spellStart"/>
-      <w:r>
-        <w:rPr>
-          <w:rFonts w:ascii="Times New Roman" w:hAnsi="Times New Roman" w:cs="Times New Roman"/>
-          <w:b/>
-          <w:sz w:val="26"/>
-          <w:szCs w:val="26"/>
-        </w:rPr>
-        <w:t>c</w:t>
-      </w:r>
-      <w:r>
-        <w:rPr>
-          <w:rFonts w:ascii="Times New Roman" w:hAnsi="Times New Roman" w:cs="Times New Roman"/>
-          <w:b/>
-          <w:sz w:val="26"/>
-          <w:szCs w:val="26"/>
-        </w:rPr>
-        <w:t>âu</w:t>
-      </w:r>
-      <w:proofErr w:type="spellEnd"/>
-      <w:r>
-        <w:rPr>
-          <w:rFonts w:ascii="Times New Roman" w:hAnsi="Times New Roman" w:cs="Times New Roman"/>
-          <w:b/>
-          <w:sz w:val="26"/>
-          <w:szCs w:val="26"/>
-        </w:rPr>
-        <w:t xml:space="preserve"> </w:t>
-      </w:r>
-      <w:proofErr w:type="spellStart"/>
-      <w:r>
-        <w:rPr>
-          <w:rFonts w:ascii="Times New Roman" w:hAnsi="Times New Roman" w:cs="Times New Roman"/>
-          <w:b/>
-          <w:sz w:val="26"/>
-          <w:szCs w:val="26"/>
-        </w:rPr>
-        <w:t>hỏi</w:t>
-      </w:r>
-      <w:proofErr w:type="spellEnd"/>
-      <w:r>
-        <w:rPr>
-          <w:rFonts w:ascii="Times New Roman" w:hAnsi="Times New Roman" w:cs="Times New Roman"/>
-          <w:b/>
-          <w:sz w:val="26"/>
-          <w:szCs w:val="26"/>
-        </w:rPr>
-        <w:t xml:space="preserve"> </w:t>
-      </w:r>
-      <w:proofErr w:type="spellStart"/>
-      <w:r>
-        <w:rPr>
-          <w:rFonts w:ascii="Times New Roman" w:hAnsi="Times New Roman" w:cs="Times New Roman"/>
-          <w:b/>
-          <w:sz w:val="26"/>
-          <w:szCs w:val="26"/>
-        </w:rPr>
-        <w:t>khi</w:t>
-      </w:r>
-      <w:proofErr w:type="spellEnd"/>
-      <w:r>
-        <w:rPr>
-          <w:rFonts w:ascii="Times New Roman" w:hAnsi="Times New Roman" w:cs="Times New Roman"/>
-          <w:b/>
-          <w:sz w:val="26"/>
-          <w:szCs w:val="26"/>
-        </w:rPr>
-        <w:t xml:space="preserve"> </w:t>
-      </w:r>
-      <w:proofErr w:type="spellStart"/>
-      <w:r>
-        <w:rPr>
-          <w:rFonts w:ascii="Times New Roman" w:hAnsi="Times New Roman" w:cs="Times New Roman"/>
-          <w:b/>
-          <w:sz w:val="26"/>
-          <w:szCs w:val="26"/>
-        </w:rPr>
-        <w:t>thu</w:t>
-      </w:r>
-      <w:proofErr w:type="spellEnd"/>
-      <w:r>
-        <w:rPr>
-          <w:rFonts w:ascii="Times New Roman" w:hAnsi="Times New Roman" w:cs="Times New Roman"/>
-          <w:b/>
-          <w:sz w:val="26"/>
-          <w:szCs w:val="26"/>
-        </w:rPr>
-        <w:t xml:space="preserve"> </w:t>
-      </w:r>
-      <w:proofErr w:type="spellStart"/>
-      <w:r>
-        <w:rPr>
-          <w:rFonts w:ascii="Times New Roman" w:hAnsi="Times New Roman" w:cs="Times New Roman"/>
-          <w:b/>
-          <w:sz w:val="26"/>
-          <w:szCs w:val="26"/>
-        </w:rPr>
-        <w:t>thập</w:t>
-      </w:r>
-      <w:proofErr w:type="spellEnd"/>
-      <w:r>
-        <w:rPr>
-          <w:rFonts w:ascii="Times New Roman" w:hAnsi="Times New Roman" w:cs="Times New Roman"/>
-          <w:b/>
-          <w:sz w:val="26"/>
-          <w:szCs w:val="26"/>
-        </w:rPr>
-        <w:t xml:space="preserve"> </w:t>
-      </w:r>
-      <w:proofErr w:type="spellStart"/>
-      <w:r>
-        <w:rPr>
-          <w:rFonts w:ascii="Times New Roman" w:hAnsi="Times New Roman" w:cs="Times New Roman"/>
-          <w:b/>
-          <w:sz w:val="26"/>
-          <w:szCs w:val="26"/>
-        </w:rPr>
-        <w:t>và</w:t>
-      </w:r>
-      <w:proofErr w:type="spellEnd"/>
-      <w:r>
-        <w:rPr>
-          <w:rFonts w:ascii="Times New Roman" w:hAnsi="Times New Roman" w:cs="Times New Roman"/>
-          <w:b/>
-          <w:sz w:val="26"/>
-          <w:szCs w:val="26"/>
-        </w:rPr>
-        <w:t xml:space="preserve"> </w:t>
-      </w:r>
-      <w:proofErr w:type="spellStart"/>
-      <w:r>
-        <w:rPr>
-          <w:rFonts w:ascii="Times New Roman" w:hAnsi="Times New Roman" w:cs="Times New Roman"/>
-          <w:b/>
-          <w:sz w:val="26"/>
-          <w:szCs w:val="26"/>
-        </w:rPr>
-        <w:t>làm</w:t>
-      </w:r>
-      <w:proofErr w:type="spellEnd"/>
-      <w:r>
-        <w:rPr>
-          <w:rFonts w:ascii="Times New Roman" w:hAnsi="Times New Roman" w:cs="Times New Roman"/>
-          <w:b/>
-          <w:sz w:val="26"/>
-          <w:szCs w:val="26"/>
-        </w:rPr>
-        <w:t xml:space="preserve"> </w:t>
-      </w:r>
-      <w:proofErr w:type="spellStart"/>
-      <w:r>
-        <w:rPr>
-          <w:rFonts w:ascii="Times New Roman" w:hAnsi="Times New Roman" w:cs="Times New Roman"/>
-          <w:b/>
-          <w:sz w:val="26"/>
-          <w:szCs w:val="26"/>
-        </w:rPr>
-        <w:t>rõ</w:t>
-      </w:r>
-      <w:proofErr w:type="spellEnd"/>
-      <w:r>
-        <w:rPr>
-          <w:rFonts w:ascii="Times New Roman" w:hAnsi="Times New Roman" w:cs="Times New Roman"/>
-          <w:b/>
-          <w:sz w:val="26"/>
-          <w:szCs w:val="26"/>
-        </w:rPr>
-        <w:t xml:space="preserve"> </w:t>
-      </w:r>
-      <w:proofErr w:type="spellStart"/>
-      <w:r>
-        <w:rPr>
-          <w:rFonts w:ascii="Times New Roman" w:hAnsi="Times New Roman" w:cs="Times New Roman"/>
-          <w:b/>
-          <w:sz w:val="26"/>
-          <w:szCs w:val="26"/>
-        </w:rPr>
-        <w:t>yêu</w:t>
-      </w:r>
-      <w:proofErr w:type="spellEnd"/>
-      <w:r>
-        <w:rPr>
-          <w:rFonts w:ascii="Times New Roman" w:hAnsi="Times New Roman" w:cs="Times New Roman"/>
-          <w:b/>
-          <w:sz w:val="26"/>
-          <w:szCs w:val="26"/>
-        </w:rPr>
-        <w:t xml:space="preserve"> </w:t>
-      </w:r>
-      <w:proofErr w:type="spellStart"/>
-      <w:r>
-        <w:rPr>
-          <w:rFonts w:ascii="Times New Roman" w:hAnsi="Times New Roman" w:cs="Times New Roman"/>
-          <w:b/>
-          <w:sz w:val="26"/>
-          <w:szCs w:val="26"/>
-        </w:rPr>
-        <w:t>cầu</w:t>
-      </w:r>
-      <w:proofErr w:type="spellEnd"/>
-      <w:r>
-        <w:rPr>
-          <w:rFonts w:ascii="Times New Roman" w:hAnsi="Times New Roman" w:cs="Times New Roman"/>
-          <w:b/>
-          <w:sz w:val="26"/>
-          <w:szCs w:val="26"/>
-        </w:rPr>
-        <w:t xml:space="preserve"> </w:t>
-      </w:r>
-      <w:proofErr w:type="spellStart"/>
-      <w:r>
-        <w:rPr>
-          <w:rFonts w:ascii="Times New Roman" w:hAnsi="Times New Roman" w:cs="Times New Roman"/>
-          <w:b/>
-          <w:sz w:val="26"/>
-          <w:szCs w:val="26"/>
-        </w:rPr>
-        <w:t>của</w:t>
-      </w:r>
-      <w:proofErr w:type="spellEnd"/>
-      <w:r>
-        <w:rPr>
-          <w:rFonts w:ascii="Times New Roman" w:hAnsi="Times New Roman" w:cs="Times New Roman"/>
-          <w:b/>
-          <w:sz w:val="26"/>
-          <w:szCs w:val="26"/>
-        </w:rPr>
-        <w:t xml:space="preserve"> </w:t>
-      </w:r>
-      <w:proofErr w:type="spellStart"/>
-      <w:r>
-        <w:rPr>
-          <w:rFonts w:ascii="Times New Roman" w:hAnsi="Times New Roman" w:cs="Times New Roman"/>
-          <w:b/>
-          <w:sz w:val="26"/>
-          <w:szCs w:val="26"/>
-        </w:rPr>
-        <w:t>ứng</w:t>
-      </w:r>
-      <w:proofErr w:type="spellEnd"/>
-      <w:r>
-        <w:rPr>
-          <w:rFonts w:ascii="Times New Roman" w:hAnsi="Times New Roman" w:cs="Times New Roman"/>
-          <w:b/>
-          <w:sz w:val="26"/>
-          <w:szCs w:val="26"/>
-        </w:rPr>
-        <w:t xml:space="preserve"> </w:t>
-      </w:r>
-      <w:proofErr w:type="spellStart"/>
-      <w:r>
-        <w:rPr>
-          <w:rFonts w:ascii="Times New Roman" w:hAnsi="Times New Roman" w:cs="Times New Roman"/>
-          <w:b/>
-          <w:sz w:val="26"/>
-          <w:szCs w:val="26"/>
-        </w:rPr>
-        <w:t>dụng</w:t>
-      </w:r>
-      <w:proofErr w:type="spellEnd"/>
+        <w:t>Danh sách các c</w:t>
+      </w:r>
+      <w:r>
+        <w:rPr>
+          <w:rFonts w:ascii="Times New Roman" w:hAnsi="Times New Roman" w:cs="Times New Roman"/>
+          <w:b/>
+          <w:sz w:val="26"/>
+          <w:szCs w:val="26"/>
+        </w:rPr>
+        <w:t xml:space="preserve">âu hỏi khi thu thập </w:t>
+      </w:r>
+      <w:r>
+        <w:rPr>
+          <w:rFonts w:ascii="Times New Roman" w:hAnsi="Times New Roman" w:cs="Times New Roman"/>
+          <w:b/>
+          <w:sz w:val="26"/>
+          <w:szCs w:val="26"/>
+        </w:rPr>
+        <w:t xml:space="preserve">và làm rõ </w:t>
+      </w:r>
+      <w:r>
+        <w:rPr>
+          <w:rFonts w:ascii="Times New Roman" w:hAnsi="Times New Roman" w:cs="Times New Roman"/>
+          <w:b/>
+          <w:sz w:val="26"/>
+          <w:szCs w:val="26"/>
+        </w:rPr>
+        <w:t>yêu cầu</w:t>
+      </w:r>
+      <w:r>
+        <w:rPr>
+          <w:rFonts w:ascii="Times New Roman" w:hAnsi="Times New Roman" w:cs="Times New Roman"/>
+          <w:b/>
+          <w:sz w:val="26"/>
+          <w:szCs w:val="26"/>
+        </w:rPr>
+        <w:t xml:space="preserve"> của ứng dụng</w:t>
+      </w:r>
     </w:p>
     <w:tbl>
       <w:tblPr>
@@ -1670,7 +959,6 @@
                 <w:szCs w:val="26"/>
               </w:rPr>
             </w:pPr>
-            <w:proofErr w:type="spellStart"/>
             <w:r>
               <w:rPr>
                 <w:rFonts w:ascii="Times New Roman" w:hAnsi="Times New Roman" w:cs="Times New Roman"/>
@@ -1679,10 +967,18 @@
                 <w:sz w:val="26"/>
                 <w:szCs w:val="26"/>
               </w:rPr>
-              <w:t>Câu</w:t>
+              <w:t>Câu hỏi (Questions)</w:t>
             </w:r>
-            <w:proofErr w:type="spellEnd"/>
-            <w:r>
+          </w:p>
+        </w:tc>
+        <w:tc>
+          <w:tcPr>
+            <w:tcW w:w="1836" w:type="pct"/>
+          </w:tcPr>
+          <w:p>
+            <w:pPr>
+              <w:spacing w:after="120"/>
+              <w:jc w:val="center"/>
               <w:rPr>
                 <w:rFonts w:ascii="Times New Roman" w:hAnsi="Times New Roman" w:cs="Times New Roman"/>
                 <w:b/>
@@ -1690,9 +986,7 @@
                 <w:sz w:val="26"/>
                 <w:szCs w:val="26"/>
               </w:rPr>
-              <w:t xml:space="preserve"> </w:t>
-            </w:r>
-            <w:proofErr w:type="spellStart"/>
+            </w:pPr>
             <w:r>
               <w:rPr>
                 <w:rFonts w:ascii="Times New Roman" w:hAnsi="Times New Roman" w:cs="Times New Roman"/>
@@ -1701,10 +995,18 @@
                 <w:sz w:val="26"/>
                 <w:szCs w:val="26"/>
               </w:rPr>
-              <w:t>hỏi</w:t>
+              <w:t>Trả lời (Answers)</w:t>
             </w:r>
-            <w:proofErr w:type="spellEnd"/>
-            <w:r>
+          </w:p>
+        </w:tc>
+        <w:tc>
+          <w:tcPr>
+            <w:tcW w:w="1330" w:type="pct"/>
+          </w:tcPr>
+          <w:p>
+            <w:pPr>
+              <w:spacing w:after="120"/>
+              <w:jc w:val="center"/>
               <w:rPr>
                 <w:rFonts w:ascii="Times New Roman" w:hAnsi="Times New Roman" w:cs="Times New Roman"/>
                 <w:b/>
@@ -1712,18 +1014,8 @@
                 <w:sz w:val="26"/>
                 <w:szCs w:val="26"/>
               </w:rPr>
-              <w:t xml:space="preserve"> (Questions)</w:t>
-            </w:r>
-          </w:p>
-        </w:tc>
-        <w:tc>
-          <w:tcPr>
-            <w:tcW w:w="1836" w:type="pct"/>
-          </w:tcPr>
-          <w:p>
-            <w:pPr>
-              <w:spacing w:after="120"/>
-              <w:jc w:val="center"/>
+            </w:pPr>
+            <w:r>
               <w:rPr>
                 <w:rFonts w:ascii="Times New Roman" w:hAnsi="Times New Roman" w:cs="Times New Roman"/>
                 <w:b/>
@@ -1731,103 +1023,8 @@
                 <w:sz w:val="26"/>
                 <w:szCs w:val="26"/>
               </w:rPr>
-            </w:pPr>
-            <w:proofErr w:type="spellStart"/>
-            <w:r>
-              <w:rPr>
-                <w:rFonts w:ascii="Times New Roman" w:hAnsi="Times New Roman" w:cs="Times New Roman"/>
-                <w:b/>
-                <w:i/>
-                <w:sz w:val="26"/>
-                <w:szCs w:val="26"/>
-              </w:rPr>
-              <w:t>Trả</w:t>
+              <w:t>Ghi chú</w:t>
             </w:r>
-            <w:proofErr w:type="spellEnd"/>
-            <w:r>
-              <w:rPr>
-                <w:rFonts w:ascii="Times New Roman" w:hAnsi="Times New Roman" w:cs="Times New Roman"/>
-                <w:b/>
-                <w:i/>
-                <w:sz w:val="26"/>
-                <w:szCs w:val="26"/>
-              </w:rPr>
-              <w:t xml:space="preserve"> </w:t>
-            </w:r>
-            <w:proofErr w:type="spellStart"/>
-            <w:r>
-              <w:rPr>
-                <w:rFonts w:ascii="Times New Roman" w:hAnsi="Times New Roman" w:cs="Times New Roman"/>
-                <w:b/>
-                <w:i/>
-                <w:sz w:val="26"/>
-                <w:szCs w:val="26"/>
-              </w:rPr>
-              <w:t>lời</w:t>
-            </w:r>
-            <w:proofErr w:type="spellEnd"/>
-            <w:r>
-              <w:rPr>
-                <w:rFonts w:ascii="Times New Roman" w:hAnsi="Times New Roman" w:cs="Times New Roman"/>
-                <w:b/>
-                <w:i/>
-                <w:sz w:val="26"/>
-                <w:szCs w:val="26"/>
-              </w:rPr>
-              <w:t xml:space="preserve"> (Answers)</w:t>
-            </w:r>
-          </w:p>
-        </w:tc>
-        <w:tc>
-          <w:tcPr>
-            <w:tcW w:w="1330" w:type="pct"/>
-          </w:tcPr>
-          <w:p>
-            <w:pPr>
-              <w:spacing w:after="120"/>
-              <w:jc w:val="center"/>
-              <w:rPr>
-                <w:rFonts w:ascii="Times New Roman" w:hAnsi="Times New Roman" w:cs="Times New Roman"/>
-                <w:b/>
-                <w:i/>
-                <w:sz w:val="26"/>
-                <w:szCs w:val="26"/>
-              </w:rPr>
-            </w:pPr>
-            <w:proofErr w:type="spellStart"/>
-            <w:r>
-              <w:rPr>
-                <w:rFonts w:ascii="Times New Roman" w:hAnsi="Times New Roman" w:cs="Times New Roman"/>
-                <w:b/>
-                <w:i/>
-                <w:sz w:val="26"/>
-                <w:szCs w:val="26"/>
-              </w:rPr>
-              <w:t>Ghi</w:t>
-            </w:r>
-            <w:proofErr w:type="spellEnd"/>
-            <w:r>
-              <w:rPr>
-                <w:rFonts w:ascii="Times New Roman" w:hAnsi="Times New Roman" w:cs="Times New Roman"/>
-                <w:b/>
-                <w:i/>
-                <w:sz w:val="26"/>
-                <w:szCs w:val="26"/>
-              </w:rPr>
-              <w:t xml:space="preserve"> </w:t>
-            </w:r>
-            <w:proofErr w:type="spellStart"/>
-            <w:r>
-              <w:rPr>
-                <w:rFonts w:ascii="Times New Roman" w:hAnsi="Times New Roman" w:cs="Times New Roman"/>
-                <w:b/>
-                <w:i/>
-                <w:sz w:val="26"/>
-                <w:szCs w:val="26"/>
-              </w:rPr>
-              <w:t>chú</w:t>
-            </w:r>
-            <w:proofErr w:type="spellEnd"/>
           </w:p>
         </w:tc>
       </w:tr>
@@ -1880,8 +1077,18 @@
                 <w:rFonts w:ascii="Times New Roman" w:hAnsi="Times New Roman" w:cs="Times New Roman"/>
                 <w:sz w:val="26"/>
                 <w:szCs w:val="26"/>
-              </w:rPr>
-            </w:pPr>
+                <w:lang w:val="vi-VN"/>
+              </w:rPr>
+            </w:pPr>
+            <w:r>
+              <w:rPr>
+                <w:rFonts w:ascii="Times New Roman" w:hAnsi="Times New Roman" w:cs="Times New Roman"/>
+                <w:sz w:val="26"/>
+                <w:szCs w:val="26"/>
+                <w:lang w:val="vi-VN"/>
+              </w:rPr>
+              <w:t>Đặt lịch thì cần những thông tin nào?</w:t>
+            </w:r>
           </w:p>
         </w:tc>
         <w:tc>
@@ -1897,8 +1104,26 @@
                 <w:rFonts w:ascii="Times New Roman" w:hAnsi="Times New Roman" w:cs="Times New Roman"/>
                 <w:sz w:val="26"/>
                 <w:szCs w:val="26"/>
-              </w:rPr>
-            </w:pPr>
+                <w:lang w:val="vi-VN"/>
+              </w:rPr>
+            </w:pPr>
+            <w:r>
+              <w:rPr>
+                <w:rFonts w:ascii="Times New Roman" w:hAnsi="Times New Roman" w:cs="Times New Roman"/>
+                <w:sz w:val="26"/>
+                <w:szCs w:val="26"/>
+              </w:rPr>
+              <w:t>Đặt</w:t>
+            </w:r>
+            <w:r>
+              <w:rPr>
+                <w:rFonts w:ascii="Times New Roman" w:hAnsi="Times New Roman" w:cs="Times New Roman"/>
+                <w:sz w:val="26"/>
+                <w:szCs w:val="26"/>
+                <w:lang w:val="vi-VN"/>
+              </w:rPr>
+              <w:t xml:space="preserve"> qua web : Cần họ tên, số điện thoại, có thể thêm ghi chú (nếu có) để nhân viên tư vấn liên hệ sau đó. Yêu cầu là đặt lịch từ 7g30 sáng tới 23g30 phút mỗi ngày trừ ngày lễ, Tết)</w:t>
+            </w:r>
           </w:p>
         </w:tc>
         <w:tc>
@@ -2574,6 +1799,7 @@
                 <w:sz w:val="26"/>
                 <w:szCs w:val="26"/>
               </w:rPr>
+              <w:lastRenderedPageBreak/>
               <w:t>…</w:t>
             </w:r>
           </w:p>
@@ -2658,35 +1884,14 @@
           <w:szCs w:val="26"/>
         </w:rPr>
       </w:pPr>
-      <w:proofErr w:type="spellStart"/>
-      <w:r>
-        <w:rPr>
-          <w:rFonts w:ascii="Times New Roman" w:hAnsi="Times New Roman" w:cs="Times New Roman"/>
-          <w:b/>
-          <w:sz w:val="26"/>
-          <w:szCs w:val="26"/>
-        </w:rPr>
-        <w:t>Yêu</w:t>
-      </w:r>
-      <w:proofErr w:type="spellEnd"/>
-      <w:r>
-        <w:rPr>
-          <w:rFonts w:ascii="Times New Roman" w:hAnsi="Times New Roman" w:cs="Times New Roman"/>
-          <w:b/>
-          <w:sz w:val="26"/>
-          <w:szCs w:val="26"/>
-        </w:rPr>
-        <w:t xml:space="preserve"> </w:t>
-      </w:r>
-      <w:proofErr w:type="spellStart"/>
-      <w:r>
-        <w:rPr>
-          <w:rFonts w:ascii="Times New Roman" w:hAnsi="Times New Roman" w:cs="Times New Roman"/>
-          <w:b/>
-          <w:sz w:val="26"/>
-          <w:szCs w:val="26"/>
-        </w:rPr>
-        <w:t>cầ</w:t>
+      <w:r>
+        <w:rPr>
+          <w:rFonts w:ascii="Times New Roman" w:hAnsi="Times New Roman" w:cs="Times New Roman"/>
+          <w:b/>
+          <w:sz w:val="26"/>
+          <w:szCs w:val="26"/>
+        </w:rPr>
+        <w:t>Yêu cầ</w:t>
       </w:r>
       <w:r>
         <w:rPr>
@@ -2697,147 +1902,15 @@
         </w:rPr>
         <w:t>u</w:t>
       </w:r>
-      <w:proofErr w:type="spellEnd"/>
-      <w:r>
-        <w:rPr>
-          <w:rFonts w:ascii="Times New Roman" w:hAnsi="Times New Roman" w:cs="Times New Roman"/>
-          <w:b/>
-          <w:sz w:val="26"/>
-          <w:szCs w:val="26"/>
-        </w:rPr>
-        <w:t xml:space="preserve"> </w:t>
-      </w:r>
-      <w:proofErr w:type="spellStart"/>
-      <w:r>
-        <w:rPr>
-          <w:rFonts w:ascii="Times New Roman" w:hAnsi="Times New Roman" w:cs="Times New Roman"/>
-          <w:b/>
-          <w:sz w:val="26"/>
-          <w:szCs w:val="26"/>
-        </w:rPr>
-        <w:t>chức</w:t>
-      </w:r>
-      <w:proofErr w:type="spellEnd"/>
-      <w:r>
-        <w:rPr>
-          <w:rFonts w:ascii="Times New Roman" w:hAnsi="Times New Roman" w:cs="Times New Roman"/>
-          <w:b/>
-          <w:sz w:val="26"/>
-          <w:szCs w:val="26"/>
-        </w:rPr>
-        <w:t xml:space="preserve"> </w:t>
-      </w:r>
-      <w:proofErr w:type="spellStart"/>
-      <w:r>
-        <w:rPr>
-          <w:rFonts w:ascii="Times New Roman" w:hAnsi="Times New Roman" w:cs="Times New Roman"/>
-          <w:b/>
-          <w:sz w:val="26"/>
-          <w:szCs w:val="26"/>
-        </w:rPr>
-        <w:t>năng</w:t>
-      </w:r>
-      <w:proofErr w:type="spellEnd"/>
-      <w:r>
-        <w:rPr>
-          <w:rFonts w:ascii="Times New Roman" w:hAnsi="Times New Roman" w:cs="Times New Roman"/>
-          <w:b/>
-          <w:sz w:val="26"/>
-          <w:szCs w:val="26"/>
-        </w:rPr>
-        <w:t xml:space="preserve">/phi </w:t>
-      </w:r>
-      <w:proofErr w:type="spellStart"/>
-      <w:r>
-        <w:rPr>
-          <w:rFonts w:ascii="Times New Roman" w:hAnsi="Times New Roman" w:cs="Times New Roman"/>
-          <w:b/>
-          <w:sz w:val="26"/>
-          <w:szCs w:val="26"/>
-        </w:rPr>
-        <w:t>chức</w:t>
-      </w:r>
-      <w:proofErr w:type="spellEnd"/>
-      <w:r>
-        <w:rPr>
-          <w:rFonts w:ascii="Times New Roman" w:hAnsi="Times New Roman" w:cs="Times New Roman"/>
-          <w:b/>
-          <w:sz w:val="26"/>
-          <w:szCs w:val="26"/>
-        </w:rPr>
-        <w:t xml:space="preserve"> </w:t>
-      </w:r>
-      <w:proofErr w:type="spellStart"/>
-      <w:r>
-        <w:rPr>
-          <w:rFonts w:ascii="Times New Roman" w:hAnsi="Times New Roman" w:cs="Times New Roman"/>
-          <w:b/>
-          <w:sz w:val="26"/>
-          <w:szCs w:val="26"/>
-        </w:rPr>
-        <w:t>năng</w:t>
-      </w:r>
-      <w:proofErr w:type="spellEnd"/>
-      <w:r>
-        <w:rPr>
-          <w:rFonts w:ascii="Times New Roman" w:hAnsi="Times New Roman" w:cs="Times New Roman"/>
-          <w:b/>
-          <w:sz w:val="26"/>
-          <w:szCs w:val="26"/>
-        </w:rPr>
-        <w:t xml:space="preserve"> </w:t>
-      </w:r>
-      <w:proofErr w:type="spellStart"/>
-      <w:r>
-        <w:rPr>
-          <w:rFonts w:ascii="Times New Roman" w:hAnsi="Times New Roman" w:cs="Times New Roman"/>
-          <w:b/>
-          <w:sz w:val="26"/>
-          <w:szCs w:val="26"/>
-        </w:rPr>
-        <w:t>của</w:t>
-      </w:r>
-      <w:proofErr w:type="spellEnd"/>
-      <w:r>
-        <w:rPr>
-          <w:rFonts w:ascii="Times New Roman" w:hAnsi="Times New Roman" w:cs="Times New Roman"/>
-          <w:b/>
-          <w:sz w:val="26"/>
-          <w:szCs w:val="26"/>
-        </w:rPr>
-        <w:t xml:space="preserve"> </w:t>
-      </w:r>
-      <w:proofErr w:type="spellStart"/>
-      <w:r>
-        <w:rPr>
-          <w:rFonts w:ascii="Times New Roman" w:hAnsi="Times New Roman" w:cs="Times New Roman"/>
-          <w:b/>
-          <w:sz w:val="26"/>
-          <w:szCs w:val="26"/>
-        </w:rPr>
-        <w:t>ứng</w:t>
-      </w:r>
-      <w:proofErr w:type="spellEnd"/>
-      <w:r>
-        <w:rPr>
-          <w:rFonts w:ascii="Times New Roman" w:hAnsi="Times New Roman" w:cs="Times New Roman"/>
-          <w:b/>
-          <w:sz w:val="26"/>
-          <w:szCs w:val="26"/>
-        </w:rPr>
-        <w:t xml:space="preserve"> </w:t>
-      </w:r>
-      <w:proofErr w:type="spellStart"/>
-      <w:r>
-        <w:rPr>
-          <w:rFonts w:ascii="Times New Roman" w:hAnsi="Times New Roman" w:cs="Times New Roman"/>
-          <w:b/>
-          <w:sz w:val="26"/>
-          <w:szCs w:val="26"/>
-        </w:rPr>
-        <w:t>dụng</w:t>
-      </w:r>
-      <w:proofErr w:type="spellEnd"/>
+      <w:r>
+        <w:rPr>
+          <w:rFonts w:ascii="Times New Roman" w:hAnsi="Times New Roman" w:cs="Times New Roman"/>
+          <w:b/>
+          <w:sz w:val="26"/>
+          <w:szCs w:val="26"/>
+        </w:rPr>
+        <w:t xml:space="preserve"> chức năng/phi chức năng của ứng dụng</w:t>
+      </w:r>
     </w:p>
     <w:p>
       <w:pPr>
@@ -2868,176 +1941,14 @@
           <w:szCs w:val="26"/>
         </w:rPr>
       </w:pPr>
-      <w:proofErr w:type="spellStart"/>
-      <w:r>
-        <w:rPr>
-          <w:rFonts w:ascii="Times New Roman" w:hAnsi="Times New Roman" w:cs="Times New Roman"/>
-          <w:b/>
-          <w:sz w:val="26"/>
-          <w:szCs w:val="26"/>
-        </w:rPr>
-        <w:lastRenderedPageBreak/>
-        <w:t>Sơ</w:t>
-      </w:r>
-      <w:proofErr w:type="spellEnd"/>
-      <w:r>
-        <w:rPr>
-          <w:rFonts w:ascii="Times New Roman" w:hAnsi="Times New Roman" w:cs="Times New Roman"/>
-          <w:b/>
-          <w:sz w:val="26"/>
-          <w:szCs w:val="26"/>
-        </w:rPr>
-        <w:t xml:space="preserve"> </w:t>
-      </w:r>
-      <w:proofErr w:type="spellStart"/>
-      <w:r>
-        <w:rPr>
-          <w:rFonts w:ascii="Times New Roman" w:hAnsi="Times New Roman" w:cs="Times New Roman"/>
-          <w:b/>
-          <w:sz w:val="26"/>
-          <w:szCs w:val="26"/>
-        </w:rPr>
-        <w:t>đồ</w:t>
-      </w:r>
-      <w:proofErr w:type="spellEnd"/>
-      <w:r>
-        <w:rPr>
-          <w:rFonts w:ascii="Times New Roman" w:hAnsi="Times New Roman" w:cs="Times New Roman"/>
-          <w:b/>
-          <w:sz w:val="26"/>
-          <w:szCs w:val="26"/>
-        </w:rPr>
-        <w:t xml:space="preserve"> </w:t>
-      </w:r>
-      <w:proofErr w:type="spellStart"/>
-      <w:r>
-        <w:rPr>
-          <w:rFonts w:ascii="Times New Roman" w:hAnsi="Times New Roman" w:cs="Times New Roman"/>
-          <w:b/>
-          <w:sz w:val="26"/>
-          <w:szCs w:val="26"/>
-        </w:rPr>
-        <w:t>phân</w:t>
-      </w:r>
-      <w:proofErr w:type="spellEnd"/>
-      <w:r>
-        <w:rPr>
-          <w:rFonts w:ascii="Times New Roman" w:hAnsi="Times New Roman" w:cs="Times New Roman"/>
-          <w:b/>
-          <w:sz w:val="26"/>
-          <w:szCs w:val="26"/>
-        </w:rPr>
-        <w:t xml:space="preserve"> </w:t>
-      </w:r>
-      <w:proofErr w:type="spellStart"/>
-      <w:r>
-        <w:rPr>
-          <w:rFonts w:ascii="Times New Roman" w:hAnsi="Times New Roman" w:cs="Times New Roman"/>
-          <w:b/>
-          <w:sz w:val="26"/>
-          <w:szCs w:val="26"/>
-        </w:rPr>
-        <w:t>cấp</w:t>
-      </w:r>
-      <w:proofErr w:type="spellEnd"/>
-      <w:r>
-        <w:rPr>
-          <w:rFonts w:ascii="Times New Roman" w:hAnsi="Times New Roman" w:cs="Times New Roman"/>
-          <w:b/>
-          <w:sz w:val="26"/>
-          <w:szCs w:val="26"/>
-        </w:rPr>
-        <w:t xml:space="preserve"> </w:t>
-      </w:r>
-      <w:proofErr w:type="spellStart"/>
-      <w:r>
-        <w:rPr>
-          <w:rFonts w:ascii="Times New Roman" w:hAnsi="Times New Roman" w:cs="Times New Roman"/>
-          <w:b/>
-          <w:sz w:val="26"/>
-          <w:szCs w:val="26"/>
-        </w:rPr>
-        <w:t>chức</w:t>
-      </w:r>
-      <w:proofErr w:type="spellEnd"/>
-      <w:r>
-        <w:rPr>
-          <w:rFonts w:ascii="Times New Roman" w:hAnsi="Times New Roman" w:cs="Times New Roman"/>
-          <w:b/>
-          <w:sz w:val="26"/>
-          <w:szCs w:val="26"/>
-        </w:rPr>
-        <w:t xml:space="preserve"> </w:t>
-      </w:r>
-      <w:proofErr w:type="spellStart"/>
-      <w:r>
-        <w:rPr>
-          <w:rFonts w:ascii="Times New Roman" w:hAnsi="Times New Roman" w:cs="Times New Roman"/>
-          <w:b/>
-          <w:sz w:val="26"/>
-          <w:szCs w:val="26"/>
-        </w:rPr>
-        <w:t>năng</w:t>
-      </w:r>
-      <w:proofErr w:type="spellEnd"/>
-      <w:r>
-        <w:rPr>
-          <w:rFonts w:ascii="Times New Roman" w:hAnsi="Times New Roman" w:cs="Times New Roman"/>
-          <w:b/>
-          <w:sz w:val="26"/>
-          <w:szCs w:val="26"/>
-        </w:rPr>
-        <w:t xml:space="preserve"> </w:t>
-      </w:r>
-      <w:proofErr w:type="spellStart"/>
-      <w:r>
-        <w:rPr>
-          <w:rFonts w:ascii="Times New Roman" w:hAnsi="Times New Roman" w:cs="Times New Roman"/>
-          <w:b/>
-          <w:sz w:val="26"/>
-          <w:szCs w:val="26"/>
-        </w:rPr>
-        <w:t>của</w:t>
-      </w:r>
-      <w:proofErr w:type="spellEnd"/>
-      <w:r>
-        <w:rPr>
-          <w:rFonts w:ascii="Times New Roman" w:hAnsi="Times New Roman" w:cs="Times New Roman"/>
-          <w:b/>
-          <w:sz w:val="26"/>
-          <w:szCs w:val="26"/>
-        </w:rPr>
-        <w:t xml:space="preserve"> </w:t>
-      </w:r>
-      <w:proofErr w:type="spellStart"/>
-      <w:r>
-        <w:rPr>
-          <w:rFonts w:ascii="Times New Roman" w:hAnsi="Times New Roman" w:cs="Times New Roman"/>
-          <w:b/>
-          <w:sz w:val="26"/>
-          <w:szCs w:val="26"/>
-        </w:rPr>
-        <w:t>ứng</w:t>
-      </w:r>
-      <w:proofErr w:type="spellEnd"/>
-      <w:r>
-        <w:rPr>
-          <w:rFonts w:ascii="Times New Roman" w:hAnsi="Times New Roman" w:cs="Times New Roman"/>
-          <w:b/>
-          <w:sz w:val="26"/>
-          <w:szCs w:val="26"/>
-        </w:rPr>
-        <w:t xml:space="preserve"> </w:t>
-      </w:r>
-      <w:proofErr w:type="spellStart"/>
-      <w:r>
-        <w:rPr>
-          <w:rFonts w:ascii="Times New Roman" w:hAnsi="Times New Roman" w:cs="Times New Roman"/>
-          <w:b/>
-          <w:sz w:val="26"/>
-          <w:szCs w:val="26"/>
-        </w:rPr>
-        <w:t>dụn</w:t>
+      <w:r>
+        <w:rPr>
+          <w:rFonts w:ascii="Times New Roman" w:hAnsi="Times New Roman" w:cs="Times New Roman"/>
+          <w:b/>
+          <w:sz w:val="26"/>
+          <w:szCs w:val="26"/>
+        </w:rPr>
+        <w:t>Sơ đồ phân cấp chức năng của ứng dụn</w:t>
       </w:r>
       <w:r>
         <w:rPr>
@@ -3048,7 +1959,6 @@
         </w:rPr>
         <w:t>g</w:t>
       </w:r>
-      <w:proofErr w:type="spellEnd"/>
     </w:p>
     <w:p>
       <w:pPr>
@@ -3086,183 +1996,7 @@
           <w:b/>
           <w:sz w:val="26"/>
         </w:rPr>
-        <w:t xml:space="preserve">Các </w:t>
-      </w:r>
-      <w:proofErr w:type="spellStart"/>
-      <w:r>
-        <w:rPr>
-          <w:b/>
-          <w:sz w:val="26"/>
-        </w:rPr>
-        <w:t>chức</w:t>
-      </w:r>
-      <w:proofErr w:type="spellEnd"/>
-      <w:r>
-        <w:rPr>
-          <w:b/>
-          <w:sz w:val="26"/>
-        </w:rPr>
-        <w:t xml:space="preserve"> </w:t>
-      </w:r>
-      <w:proofErr w:type="spellStart"/>
-      <w:r>
-        <w:rPr>
-          <w:b/>
-          <w:sz w:val="26"/>
-        </w:rPr>
-        <w:t>năng</w:t>
-      </w:r>
-      <w:proofErr w:type="spellEnd"/>
-      <w:r>
-        <w:rPr>
-          <w:b/>
-          <w:sz w:val="26"/>
-        </w:rPr>
-        <w:t xml:space="preserve"> </w:t>
-      </w:r>
-      <w:proofErr w:type="spellStart"/>
-      <w:r>
-        <w:rPr>
-          <w:b/>
-          <w:sz w:val="26"/>
-        </w:rPr>
-        <w:t>chính</w:t>
-      </w:r>
-      <w:proofErr w:type="spellEnd"/>
-      <w:r>
-        <w:rPr>
-          <w:b/>
-          <w:sz w:val="26"/>
-        </w:rPr>
-        <w:t xml:space="preserve"> </w:t>
-      </w:r>
-      <w:proofErr w:type="spellStart"/>
-      <w:r>
-        <w:rPr>
-          <w:b/>
-          <w:sz w:val="26"/>
-        </w:rPr>
-        <w:t>cho</w:t>
-      </w:r>
-      <w:proofErr w:type="spellEnd"/>
-      <w:r>
-        <w:rPr>
-          <w:b/>
-          <w:sz w:val="26"/>
-        </w:rPr>
-        <w:t xml:space="preserve"> </w:t>
-      </w:r>
-      <w:proofErr w:type="spellStart"/>
-      <w:r>
-        <w:rPr>
-          <w:b/>
-          <w:sz w:val="26"/>
-        </w:rPr>
-        <w:t>ứng</w:t>
-      </w:r>
-      <w:proofErr w:type="spellEnd"/>
-      <w:r>
-        <w:rPr>
-          <w:b/>
-          <w:sz w:val="26"/>
-        </w:rPr>
-        <w:t xml:space="preserve"> </w:t>
-      </w:r>
-      <w:proofErr w:type="spellStart"/>
-      <w:r>
-        <w:rPr>
-          <w:b/>
-          <w:sz w:val="26"/>
-        </w:rPr>
-        <w:t>dụng</w:t>
-      </w:r>
-      <w:proofErr w:type="spellEnd"/>
-      <w:r>
-        <w:rPr>
-          <w:b/>
-          <w:sz w:val="26"/>
-        </w:rPr>
-        <w:t xml:space="preserve"> (</w:t>
-      </w:r>
-      <w:proofErr w:type="spellStart"/>
-      <w:r>
-        <w:rPr>
-          <w:b/>
-          <w:sz w:val="26"/>
-        </w:rPr>
-        <w:t>Mục</w:t>
-      </w:r>
-      <w:proofErr w:type="spellEnd"/>
-      <w:r>
-        <w:rPr>
-          <w:b/>
-          <w:sz w:val="26"/>
-        </w:rPr>
-        <w:t xml:space="preserve"> </w:t>
-      </w:r>
-      <w:proofErr w:type="spellStart"/>
-      <w:r>
-        <w:rPr>
-          <w:b/>
-          <w:sz w:val="26"/>
-        </w:rPr>
-        <w:t>tiêu</w:t>
-      </w:r>
-      <w:proofErr w:type="spellEnd"/>
-      <w:r>
-        <w:rPr>
-          <w:b/>
-          <w:sz w:val="26"/>
-        </w:rPr>
-        <w:t xml:space="preserve"> </w:t>
-      </w:r>
-      <w:proofErr w:type="spellStart"/>
-      <w:r>
-        <w:rPr>
-          <w:b/>
-          <w:sz w:val="26"/>
-        </w:rPr>
-        <w:t>của</w:t>
-      </w:r>
-      <w:proofErr w:type="spellEnd"/>
-      <w:r>
-        <w:rPr>
-          <w:b/>
-          <w:sz w:val="26"/>
-        </w:rPr>
-        <w:t xml:space="preserve"> </w:t>
-      </w:r>
-      <w:proofErr w:type="spellStart"/>
-      <w:r>
-        <w:rPr>
-          <w:b/>
-          <w:sz w:val="26"/>
-        </w:rPr>
-        <w:t>ứng</w:t>
-      </w:r>
-      <w:proofErr w:type="spellEnd"/>
-      <w:r>
-        <w:rPr>
-          <w:b/>
-          <w:sz w:val="26"/>
-        </w:rPr>
-        <w:t xml:space="preserve"> </w:t>
-      </w:r>
-      <w:proofErr w:type="spellStart"/>
-      <w:r>
-        <w:rPr>
-          <w:b/>
-          <w:sz w:val="26"/>
-        </w:rPr>
-        <w:t>dụng</w:t>
-      </w:r>
-      <w:proofErr w:type="spellEnd"/>
-      <w:r>
-        <w:rPr>
-          <w:b/>
-          <w:sz w:val="26"/>
-        </w:rPr>
-        <w:t>)</w:t>
+        <w:t>Các chức năng chính cho ứng dụng (Mục tiêu của ứng dụng)</w:t>
       </w:r>
     </w:p>
     <w:p>
@@ -3291,48 +2025,8 @@
           <w:sz w:val="26"/>
           <w:szCs w:val="26"/>
         </w:rPr>
-        <w:t xml:space="preserve">Link </w:t>
-      </w:r>
-      <w:proofErr w:type="spellStart"/>
-      <w:r>
-        <w:rPr>
-          <w:rFonts w:ascii="Times New Roman" w:hAnsi="Times New Roman" w:cs="Times New Roman"/>
-          <w:b/>
-          <w:i/>
-          <w:iCs/>
-          <w:color w:val="FF0000"/>
-          <w:sz w:val="26"/>
-          <w:szCs w:val="26"/>
-        </w:rPr>
-        <w:t>nhật</w:t>
-      </w:r>
-      <w:proofErr w:type="spellEnd"/>
-      <w:r>
-        <w:rPr>
-          <w:rFonts w:ascii="Times New Roman" w:hAnsi="Times New Roman" w:cs="Times New Roman"/>
-          <w:b/>
-          <w:i/>
-          <w:iCs/>
-          <w:color w:val="FF0000"/>
-          <w:sz w:val="26"/>
-          <w:szCs w:val="26"/>
-        </w:rPr>
-        <w:t xml:space="preserve"> </w:t>
-      </w:r>
-      <w:proofErr w:type="spellStart"/>
-      <w:r>
-        <w:rPr>
-          <w:rFonts w:ascii="Times New Roman" w:hAnsi="Times New Roman" w:cs="Times New Roman"/>
-          <w:b/>
-          <w:i/>
-          <w:iCs/>
-          <w:color w:val="FF0000"/>
-          <w:sz w:val="26"/>
-          <w:szCs w:val="26"/>
-        </w:rPr>
-        <w:t>ký</w:t>
-      </w:r>
-      <w:proofErr w:type="spellEnd"/>
+        <w:t>Link nhật ký</w:t>
+      </w:r>
     </w:p>
     <w:p>
       <w:pPr>
@@ -4784,6 +3478,7 @@
   <w:style w:type="character" w:default="1" w:styleId="DefaultParagraphFont">
     <w:name w:val="Default Paragraph Font"/>
     <w:uiPriority w:val="1"/>
+    <w:semiHidden/>
     <w:unhideWhenUsed/>
   </w:style>
   <w:style w:type="table" w:default="1" w:styleId="TableNormal">

</xml_diff>

<commit_message>
first question & ans
</commit_message>
<xml_diff>
--- a/doc/05-NguyenKhacDuy.docx
+++ b/doc/05-NguyenKhacDuy.docx
@@ -1122,7 +1122,7 @@
                 <w:szCs w:val="26"/>
                 <w:lang w:val="vi-VN"/>
               </w:rPr>
-              <w:t xml:space="preserve"> qua web : Cần họ tên, số điện thoại, có thể thêm ghi chú (nếu có) để nhân viên tư vấn liên hệ sau đó. Yêu cầu là đặt lịch từ 7g30 sáng tới 23g30 phút mỗi ngày trừ ngày lễ, Tết)</w:t>
+              <w:t xml:space="preserve"> qua web : Cần họ tên, số điện thoại, có thể thêm ghi chú (nếu có) để nhân viên tư vấn liên hệ sau đó. </w:t>
             </w:r>
           </w:p>
         </w:tc>
@@ -1140,6 +1140,15 @@
                 <w:szCs w:val="26"/>
               </w:rPr>
             </w:pPr>
+            <w:r>
+              <w:rPr>
+                <w:rFonts w:ascii="Times New Roman" w:hAnsi="Times New Roman" w:cs="Times New Roman"/>
+                <w:sz w:val="26"/>
+                <w:szCs w:val="26"/>
+                <w:lang w:val="vi-VN"/>
+              </w:rPr>
+              <w:t>Yêu cầu là đặt lịch từ 7g30 sáng tới 23g30 phút mỗi ngày trừ ngày lễ, Tết</w:t>
+            </w:r>
           </w:p>
         </w:tc>
       </w:tr>
@@ -1799,7 +1808,6 @@
                 <w:sz w:val="26"/>
                 <w:szCs w:val="26"/>
               </w:rPr>
-              <w:lastRenderedPageBreak/>
               <w:t>…</w:t>
             </w:r>
           </w:p>
@@ -1891,6 +1899,7 @@
           <w:sz w:val="26"/>
           <w:szCs w:val="26"/>
         </w:rPr>
+        <w:lastRenderedPageBreak/>
         <w:t>Yêu cầ</w:t>
       </w:r>
       <w:r>

</xml_diff>

<commit_message>
first ques & ans
</commit_message>
<xml_diff>
--- a/doc/05-NguyenKhacDuy.docx
+++ b/doc/05-NguyenKhacDuy.docx
@@ -1148,6 +1148,14 @@
                 <w:lang w:val="vi-VN"/>
               </w:rPr>
               <w:t>Yêu cầu là đặt lịch từ 7g30 sáng tới 23g30 phút mỗi ngày trừ ngày lễ, Tết</w:t>
+            </w:r>
+            <w:r>
+              <w:rPr>
+                <w:rFonts w:ascii="Times New Roman" w:hAnsi="Times New Roman" w:cs="Times New Roman"/>
+                <w:sz w:val="26"/>
+                <w:szCs w:val="26"/>
+              </w:rPr>
+              <w:t>.</w:t>
             </w:r>
           </w:p>
         </w:tc>

</xml_diff>

<commit_message>
update them lich hen y ta
</commit_message>
<xml_diff>
--- a/doc/05-NguyenKhacDuy.docx
+++ b/doc/05-NguyenKhacDuy.docx
@@ -121,16 +121,7 @@
           <w:sz w:val="26"/>
           <w:szCs w:val="26"/>
         </w:rPr>
-        <w:t xml:space="preserve">Thành viên </w:t>
-      </w:r>
-      <w:proofErr w:type="gramStart"/>
-      <w:r>
-        <w:rPr>
-          <w:rFonts w:ascii="Times New Roman" w:hAnsi="Times New Roman" w:cs="Times New Roman"/>
-          <w:sz w:val="26"/>
-          <w:szCs w:val="26"/>
-        </w:rPr>
-        <w:t>nhóm</w:t>
+        <w:t>Thành viên nhóm</w:t>
       </w:r>
       <w:r>
         <w:rPr>
@@ -140,7 +131,6 @@
         </w:rPr>
         <w:t xml:space="preserve"> :</w:t>
       </w:r>
-      <w:proofErr w:type="gramEnd"/>
     </w:p>
     <w:p>
       <w:pPr>
@@ -942,16 +932,33 @@
           <w:sz w:val="26"/>
           <w:szCs w:val="26"/>
         </w:rPr>
-        <w:t>Tiếp theo, phòng khám thực hiện quản lý lịch cho bác sĩ</w:t>
-      </w:r>
-      <w:r>
-        <w:rPr>
-          <w:rFonts w:ascii="Times New Roman" w:hAnsi="Times New Roman" w:cs="Times New Roman"/>
-          <w:bCs/>
-          <w:sz w:val="26"/>
-          <w:szCs w:val="26"/>
-        </w:rPr>
-        <w:t xml:space="preserve"> dựa trên lịch làm việc, chuyên môn và số lượng bệnh nhân đã đăng ký. Nhân viên cần theo dõi các khung giờ đã có lịch, khung giờ còn trống cũng như số lượng bệnh nhân của từng bác sĩ. Khi phát sinh lịch mới, thay đổi thời gian hoặc bác sĩ có lịch nghỉ, nhân viên cần cập nhật lại lịch để tránh tình trạng trùng lịch hoặc sắp xếp bệnh nhân không phù hợp.</w:t>
+        <w:t>Tiếp theo, phòng khám thực hiện quản lý lịch hẹn</w:t>
+      </w:r>
+      <w:r>
+        <w:rPr>
+          <w:rFonts w:ascii="Times New Roman" w:hAnsi="Times New Roman" w:cs="Times New Roman"/>
+          <w:bCs/>
+          <w:sz w:val="26"/>
+          <w:szCs w:val="26"/>
+        </w:rPr>
+        <w:t xml:space="preserve"> dựa trên lịch làm việc của </w:t>
+      </w:r>
+      <w:r>
+        <w:rPr>
+          <w:rFonts w:ascii="Times New Roman" w:hAnsi="Times New Roman" w:cs="Times New Roman"/>
+          <w:sz w:val="26"/>
+          <w:szCs w:val="26"/>
+        </w:rPr>
+        <w:t>bác sĩ và y tá</w:t>
+      </w:r>
+      <w:r>
+        <w:rPr>
+          <w:rFonts w:ascii="Times New Roman" w:hAnsi="Times New Roman" w:cs="Times New Roman"/>
+          <w:bCs/>
+          <w:sz w:val="26"/>
+          <w:szCs w:val="26"/>
+        </w:rPr>
+        <w:t>, thời gian làm việc, phòng khám và số lượng bệnh nhân đã đăng ký. Nhân viên cần theo dõi các khung giờ đã có lịch, khung giờ còn trống cũng như lịch làm việc của từng bác sĩ và y tá. Khi phát sinh lịch hẹn mới, thay đổi thời gian, bác sĩ, y tá hoặc có nhân viên nghỉ, nhân viên cần cập nhật lại lịch hẹn để tránh tình trạng trùng lịch, thiếu nhân sự hoặc sắp xếp bệnh nhân không phù hợp.</w:t>
       </w:r>
     </w:p>
     <w:p>
@@ -1036,7 +1043,6 @@
           <w:sz w:val="26"/>
           <w:szCs w:val="26"/>
         </w:rPr>
-        <w:lastRenderedPageBreak/>
         <w:t>Trong trường hợp bệnh nhân không thể đến khám, lịch có thể được hủy</w:t>
       </w:r>
       <w:r>
@@ -1186,7 +1192,38 @@
           <w:sz w:val="26"/>
           <w:szCs w:val="26"/>
         </w:rPr>
-        <w:t>đặt lịch → quản lý lịch bác sĩ → xác nhận/hủy lịch → check-in → tiếp nhận bệnh nhân</w:t>
+        <w:t xml:space="preserve">đặt lịch → quản lý lịch bác </w:t>
+      </w:r>
+      <w:r>
+        <w:rPr>
+          <w:rFonts w:ascii="Times New Roman" w:hAnsi="Times New Roman" w:cs="Times New Roman"/>
+          <w:b/>
+          <w:bCs/>
+          <w:sz w:val="26"/>
+          <w:szCs w:val="26"/>
+        </w:rPr>
+        <w:t>sĩ</w:t>
+      </w:r>
+      <w:r>
+        <w:rPr>
+          <w:rFonts w:ascii="Times New Roman" w:hAnsi="Times New Roman" w:cs="Times New Roman"/>
+          <w:b/>
+          <w:bCs/>
+          <w:sz w:val="26"/>
+          <w:szCs w:val="26"/>
+          <w:lang w:val="vi-VN"/>
+        </w:rPr>
+        <w:t>, y tá</w:t>
+      </w:r>
+      <w:r>
+        <w:rPr>
+          <w:rFonts w:ascii="Times New Roman" w:hAnsi="Times New Roman" w:cs="Times New Roman"/>
+          <w:b/>
+          <w:bCs/>
+          <w:sz w:val="26"/>
+          <w:szCs w:val="26"/>
+        </w:rPr>
+        <w:t xml:space="preserve"> → xác nhận/hủy lịch → check-in → tiếp nhận bệnh nhân</w:t>
       </w:r>
       <w:r>
         <w:rPr>
@@ -1296,18 +1333,7 @@
           <w:sz w:val="26"/>
           <w:szCs w:val="26"/>
         </w:rPr>
-        <w:t xml:space="preserve">Bước </w:t>
-      </w:r>
-      <w:proofErr w:type="gramStart"/>
-      <w:r>
-        <w:rPr>
-          <w:rFonts w:ascii="Times New Roman" w:hAnsi="Times New Roman" w:cs="Times New Roman"/>
-          <w:b/>
-          <w:bCs/>
-          <w:sz w:val="26"/>
-          <w:szCs w:val="26"/>
-        </w:rPr>
-        <w:t>1</w:t>
+        <w:t>Bước 1</w:t>
       </w:r>
       <w:r>
         <w:rPr>
@@ -1328,438 +1354,338 @@
           <w:szCs w:val="26"/>
           <w:lang w:val="vi-VN"/>
         </w:rPr>
+        <w:t xml:space="preserve">: </w:t>
+      </w:r>
+      <w:r>
+        <w:rPr>
+          <w:rFonts w:ascii="Times New Roman" w:hAnsi="Times New Roman" w:cs="Times New Roman"/>
+          <w:bCs/>
+          <w:sz w:val="26"/>
+          <w:szCs w:val="26"/>
+        </w:rPr>
+        <w:t>nhân viên tiếp nhận thông tin bệnh nhân như họ tên, số điện thoại và nhu cầu khám.</w:t>
+      </w:r>
+      <w:r>
+        <w:rPr>
+          <w:rFonts w:ascii="Times New Roman" w:hAnsi="Times New Roman" w:cs="Times New Roman"/>
+          <w:b/>
+          <w:sz w:val="26"/>
+          <w:szCs w:val="26"/>
+        </w:rPr>
+        <w:t xml:space="preserve"> </w:t>
+      </w:r>
+    </w:p>
+    <w:p>
+      <w:pPr>
+        <w:pStyle w:val="ListParagraph"/>
+        <w:ind w:left="1080"/>
+        <w:rPr>
+          <w:rFonts w:ascii="Times New Roman" w:hAnsi="Times New Roman" w:cs="Times New Roman"/>
+          <w:b/>
+          <w:sz w:val="26"/>
+          <w:szCs w:val="26"/>
+          <w:lang w:val="vi-VN"/>
+        </w:rPr>
+      </w:pPr>
+    </w:p>
+    <w:p>
+      <w:pPr>
+        <w:pStyle w:val="ListParagraph"/>
+        <w:ind w:left="1080"/>
+        <w:rPr>
+          <w:rFonts w:ascii="Times New Roman" w:hAnsi="Times New Roman" w:cs="Times New Roman"/>
+          <w:b/>
+          <w:sz w:val="26"/>
+          <w:szCs w:val="26"/>
+          <w:lang w:val="vi-VN"/>
+        </w:rPr>
+      </w:pPr>
+      <w:r>
+        <w:rPr>
+          <w:rFonts w:ascii="Times New Roman" w:hAnsi="Times New Roman" w:cs="Times New Roman"/>
+          <w:b/>
+          <w:bCs/>
+          <w:sz w:val="26"/>
+          <w:szCs w:val="26"/>
+        </w:rPr>
+        <w:t>Bước 2</w:t>
+      </w:r>
+      <w:r>
+        <w:rPr>
+          <w:rFonts w:ascii="Times New Roman" w:hAnsi="Times New Roman" w:cs="Times New Roman"/>
+          <w:b/>
+          <w:sz w:val="26"/>
+          <w:szCs w:val="26"/>
+          <w:lang w:val="vi-VN"/>
+        </w:rPr>
+        <w:t xml:space="preserve"> : </w:t>
+      </w:r>
+      <w:r>
+        <w:rPr>
+          <w:rFonts w:ascii="Times New Roman" w:hAnsi="Times New Roman" w:cs="Times New Roman"/>
+          <w:bCs/>
+          <w:sz w:val="26"/>
+          <w:szCs w:val="26"/>
+        </w:rPr>
+        <w:t>nhân viên kiểm tra lịch làm việc của bác sĩ và các khung giờ còn trống.</w:t>
+      </w:r>
+      <w:r>
+        <w:rPr>
+          <w:rFonts w:ascii="Times New Roman" w:hAnsi="Times New Roman" w:cs="Times New Roman"/>
+          <w:b/>
+          <w:sz w:val="26"/>
+          <w:szCs w:val="26"/>
+        </w:rPr>
+        <w:t xml:space="preserve"> </w:t>
+      </w:r>
+    </w:p>
+    <w:p>
+      <w:pPr>
+        <w:pStyle w:val="ListParagraph"/>
+        <w:ind w:left="1080"/>
+        <w:rPr>
+          <w:rFonts w:ascii="Times New Roman" w:hAnsi="Times New Roman" w:cs="Times New Roman"/>
+          <w:b/>
+          <w:bCs/>
+          <w:sz w:val="26"/>
+          <w:szCs w:val="26"/>
+          <w:lang w:val="vi-VN"/>
+        </w:rPr>
+      </w:pPr>
+    </w:p>
+    <w:p>
+      <w:pPr>
+        <w:pStyle w:val="ListParagraph"/>
+        <w:ind w:left="1080"/>
+        <w:rPr>
+          <w:rFonts w:ascii="Times New Roman" w:hAnsi="Times New Roman" w:cs="Times New Roman"/>
+          <w:b/>
+          <w:sz w:val="26"/>
+          <w:szCs w:val="26"/>
+          <w:lang w:val="vi-VN"/>
+        </w:rPr>
+      </w:pPr>
+      <w:r>
+        <w:rPr>
+          <w:rFonts w:ascii="Times New Roman" w:hAnsi="Times New Roman" w:cs="Times New Roman"/>
+          <w:b/>
+          <w:bCs/>
+          <w:sz w:val="26"/>
+          <w:szCs w:val="26"/>
+        </w:rPr>
+        <w:t>Bước 3</w:t>
+      </w:r>
+      <w:r>
+        <w:rPr>
+          <w:rFonts w:ascii="Times New Roman" w:hAnsi="Times New Roman" w:cs="Times New Roman"/>
+          <w:b/>
+          <w:sz w:val="26"/>
+          <w:szCs w:val="26"/>
+          <w:lang w:val="vi-VN"/>
+        </w:rPr>
+        <w:t xml:space="preserve"> : </w:t>
+      </w:r>
+      <w:r>
+        <w:rPr>
+          <w:rFonts w:ascii="Times New Roman" w:hAnsi="Times New Roman" w:cs="Times New Roman"/>
+          <w:bCs/>
+          <w:sz w:val="26"/>
+          <w:szCs w:val="26"/>
+        </w:rPr>
+        <w:t>nhân viên trao đổi với bệnh nhân để lựa chọn bác sĩ, ngày và giờ khám phù hợp.</w:t>
+      </w:r>
+      <w:r>
+        <w:rPr>
+          <w:rFonts w:ascii="Times New Roman" w:hAnsi="Times New Roman" w:cs="Times New Roman"/>
+          <w:b/>
+          <w:sz w:val="26"/>
+          <w:szCs w:val="26"/>
+        </w:rPr>
+        <w:t xml:space="preserve"> </w:t>
+      </w:r>
+    </w:p>
+    <w:p>
+      <w:pPr>
+        <w:pStyle w:val="ListParagraph"/>
+        <w:ind w:left="1080"/>
+        <w:rPr>
+          <w:rFonts w:ascii="Times New Roman" w:hAnsi="Times New Roman" w:cs="Times New Roman"/>
+          <w:b/>
+          <w:sz w:val="26"/>
+          <w:szCs w:val="26"/>
+          <w:lang w:val="vi-VN"/>
+        </w:rPr>
+      </w:pPr>
+    </w:p>
+    <w:p>
+      <w:pPr>
+        <w:pStyle w:val="ListParagraph"/>
+        <w:ind w:left="1080"/>
+        <w:rPr>
+          <w:rFonts w:ascii="Times New Roman" w:hAnsi="Times New Roman" w:cs="Times New Roman"/>
+          <w:b/>
+          <w:sz w:val="26"/>
+          <w:szCs w:val="26"/>
+          <w:lang w:val="vi-VN"/>
+        </w:rPr>
+      </w:pPr>
+      <w:r>
+        <w:rPr>
+          <w:rFonts w:ascii="Times New Roman" w:hAnsi="Times New Roman" w:cs="Times New Roman"/>
+          <w:b/>
+          <w:bCs/>
+          <w:sz w:val="26"/>
+          <w:szCs w:val="26"/>
+        </w:rPr>
+        <w:t>Bước 4</w:t>
+      </w:r>
+      <w:r>
+        <w:rPr>
+          <w:rFonts w:ascii="Times New Roman" w:hAnsi="Times New Roman" w:cs="Times New Roman"/>
+          <w:b/>
+          <w:sz w:val="26"/>
+          <w:szCs w:val="26"/>
+          <w:lang w:val="vi-VN"/>
+        </w:rPr>
+        <w:t xml:space="preserve"> : </w:t>
+      </w:r>
+      <w:r>
+        <w:rPr>
+          <w:rFonts w:ascii="Times New Roman" w:hAnsi="Times New Roman" w:cs="Times New Roman"/>
+          <w:bCs/>
+          <w:sz w:val="26"/>
+          <w:szCs w:val="26"/>
+        </w:rPr>
+        <w:t>nhân viên tạo lịch hẹn và lưu thông tin vào hệ thống hoặc sổ quản lý.</w:t>
+      </w:r>
+      <w:r>
+        <w:rPr>
+          <w:rFonts w:ascii="Times New Roman" w:hAnsi="Times New Roman" w:cs="Times New Roman"/>
+          <w:b/>
+          <w:sz w:val="26"/>
+          <w:szCs w:val="26"/>
+        </w:rPr>
+        <w:t xml:space="preserve"> </w:t>
+      </w:r>
+    </w:p>
+    <w:p>
+      <w:pPr>
+        <w:pStyle w:val="ListParagraph"/>
+        <w:ind w:left="1080"/>
+        <w:rPr>
+          <w:rFonts w:ascii="Times New Roman" w:hAnsi="Times New Roman" w:cs="Times New Roman"/>
+          <w:b/>
+          <w:sz w:val="26"/>
+          <w:szCs w:val="26"/>
+          <w:lang w:val="vi-VN"/>
+        </w:rPr>
+      </w:pPr>
+    </w:p>
+    <w:p>
+      <w:pPr>
+        <w:pStyle w:val="ListParagraph"/>
+        <w:ind w:left="1080"/>
+        <w:rPr>
+          <w:rFonts w:ascii="Times New Roman" w:hAnsi="Times New Roman" w:cs="Times New Roman"/>
+          <w:bCs/>
+          <w:sz w:val="26"/>
+          <w:szCs w:val="26"/>
+          <w:lang w:val="vi-VN"/>
+        </w:rPr>
+      </w:pPr>
+      <w:r>
+        <w:rPr>
+          <w:rFonts w:ascii="Times New Roman" w:hAnsi="Times New Roman" w:cs="Times New Roman"/>
+          <w:b/>
+          <w:bCs/>
+          <w:sz w:val="26"/>
+          <w:szCs w:val="26"/>
+        </w:rPr>
+        <w:t>Bước 5</w:t>
+      </w:r>
+      <w:r>
+        <w:rPr>
+          <w:rFonts w:ascii="Times New Roman" w:hAnsi="Times New Roman" w:cs="Times New Roman"/>
+          <w:b/>
+          <w:sz w:val="26"/>
+          <w:szCs w:val="26"/>
+          <w:lang w:val="vi-VN"/>
+        </w:rPr>
+        <w:t xml:space="preserve"> :</w:t>
+      </w:r>
+      <w:r>
+        <w:rPr>
+          <w:rFonts w:ascii="Times New Roman" w:hAnsi="Times New Roman" w:cs="Times New Roman"/>
+          <w:b/>
+          <w:sz w:val="26"/>
+          <w:szCs w:val="26"/>
+        </w:rPr>
+        <w:t xml:space="preserve"> </w:t>
+      </w:r>
+      <w:r>
+        <w:rPr>
+          <w:rFonts w:ascii="Times New Roman" w:hAnsi="Times New Roman" w:cs="Times New Roman"/>
+          <w:bCs/>
+          <w:sz w:val="26"/>
+          <w:szCs w:val="26"/>
+        </w:rPr>
+        <w:t>nhân viên thông báo lại thời gian và thông tin lịch hẹn cho bệnh nhân.</w:t>
+      </w:r>
+    </w:p>
+    <w:p>
+      <w:pPr>
+        <w:pStyle w:val="ListParagraph"/>
+        <w:ind w:left="1080"/>
+        <w:rPr>
+          <w:rFonts w:ascii="Times New Roman" w:hAnsi="Times New Roman" w:cs="Times New Roman"/>
+          <w:bCs/>
+          <w:sz w:val="26"/>
+          <w:szCs w:val="26"/>
+          <w:lang w:val="vi-VN"/>
+        </w:rPr>
+      </w:pPr>
+    </w:p>
+    <w:p>
+      <w:pPr>
+        <w:pStyle w:val="ListParagraph"/>
+        <w:ind w:left="1080"/>
+        <w:rPr>
+          <w:rFonts w:ascii="Times New Roman" w:hAnsi="Times New Roman" w:cs="Times New Roman"/>
+          <w:bCs/>
+          <w:sz w:val="26"/>
+          <w:szCs w:val="26"/>
+          <w:lang w:val="vi-VN"/>
+        </w:rPr>
+      </w:pPr>
+      <w:r>
+        <w:rPr>
+          <w:rFonts w:ascii="Times New Roman" w:hAnsi="Times New Roman" w:cs="Times New Roman"/>
+          <w:b/>
+          <w:sz w:val="26"/>
+          <w:szCs w:val="26"/>
+        </w:rPr>
+        <w:t>Kết thúc quy trình</w:t>
+      </w:r>
+      <w:r>
+        <w:rPr>
+          <w:rFonts w:ascii="Times New Roman" w:hAnsi="Times New Roman" w:cs="Times New Roman"/>
+          <w:bCs/>
+          <w:sz w:val="26"/>
+          <w:szCs w:val="26"/>
+          <w:lang w:val="vi-VN"/>
+        </w:rPr>
+        <w:t xml:space="preserve"> </w:t>
+      </w:r>
+      <w:r>
+        <w:rPr>
+          <w:rFonts w:ascii="Times New Roman" w:hAnsi="Times New Roman" w:cs="Times New Roman"/>
+          <w:b/>
+          <w:sz w:val="26"/>
+          <w:szCs w:val="26"/>
+          <w:lang w:val="vi-VN"/>
+        </w:rPr>
         <w:t>:</w:t>
       </w:r>
-      <w:proofErr w:type="gramEnd"/>
-      <w:r>
-        <w:rPr>
-          <w:rFonts w:ascii="Times New Roman" w:hAnsi="Times New Roman" w:cs="Times New Roman"/>
-          <w:b/>
-          <w:sz w:val="26"/>
-          <w:szCs w:val="26"/>
-          <w:lang w:val="vi-VN"/>
-        </w:rPr>
-        <w:t xml:space="preserve"> </w:t>
-      </w:r>
-      <w:r>
-        <w:rPr>
-          <w:rFonts w:ascii="Times New Roman" w:hAnsi="Times New Roman" w:cs="Times New Roman"/>
-          <w:bCs/>
-          <w:sz w:val="26"/>
-          <w:szCs w:val="26"/>
-        </w:rPr>
-        <w:t>nhân viên tiếp nhận thông tin bệnh nhân như họ tên, số điện thoại và nhu cầu khám.</w:t>
-      </w:r>
-      <w:r>
-        <w:rPr>
-          <w:rFonts w:ascii="Times New Roman" w:hAnsi="Times New Roman" w:cs="Times New Roman"/>
-          <w:b/>
-          <w:sz w:val="26"/>
-          <w:szCs w:val="26"/>
-        </w:rPr>
-        <w:t xml:space="preserve"> </w:t>
-      </w:r>
-    </w:p>
-    <w:p>
-      <w:pPr>
-        <w:pStyle w:val="ListParagraph"/>
-        <w:ind w:left="1080"/>
-        <w:rPr>
-          <w:rFonts w:ascii="Times New Roman" w:hAnsi="Times New Roman" w:cs="Times New Roman"/>
-          <w:b/>
-          <w:sz w:val="26"/>
-          <w:szCs w:val="26"/>
-          <w:lang w:val="vi-VN"/>
-        </w:rPr>
-      </w:pPr>
-    </w:p>
-    <w:p>
-      <w:pPr>
-        <w:pStyle w:val="ListParagraph"/>
-        <w:ind w:left="1080"/>
-        <w:rPr>
-          <w:rFonts w:ascii="Times New Roman" w:hAnsi="Times New Roman" w:cs="Times New Roman"/>
-          <w:b/>
-          <w:sz w:val="26"/>
-          <w:szCs w:val="26"/>
-          <w:lang w:val="vi-VN"/>
-        </w:rPr>
-      </w:pPr>
-      <w:r>
-        <w:rPr>
-          <w:rFonts w:ascii="Times New Roman" w:hAnsi="Times New Roman" w:cs="Times New Roman"/>
-          <w:b/>
-          <w:bCs/>
-          <w:sz w:val="26"/>
-          <w:szCs w:val="26"/>
-        </w:rPr>
-        <w:t xml:space="preserve">Bước </w:t>
-      </w:r>
-      <w:proofErr w:type="gramStart"/>
-      <w:r>
-        <w:rPr>
-          <w:rFonts w:ascii="Times New Roman" w:hAnsi="Times New Roman" w:cs="Times New Roman"/>
-          <w:b/>
-          <w:bCs/>
-          <w:sz w:val="26"/>
-          <w:szCs w:val="26"/>
-        </w:rPr>
-        <w:t>2</w:t>
-      </w:r>
-      <w:r>
-        <w:rPr>
-          <w:rFonts w:ascii="Times New Roman" w:hAnsi="Times New Roman" w:cs="Times New Roman"/>
-          <w:b/>
-          <w:sz w:val="26"/>
-          <w:szCs w:val="26"/>
-          <w:lang w:val="vi-VN"/>
-        </w:rPr>
-        <w:t xml:space="preserve"> :</w:t>
-      </w:r>
-      <w:proofErr w:type="gramEnd"/>
-      <w:r>
-        <w:rPr>
-          <w:rFonts w:ascii="Times New Roman" w:hAnsi="Times New Roman" w:cs="Times New Roman"/>
-          <w:b/>
-          <w:sz w:val="26"/>
-          <w:szCs w:val="26"/>
-          <w:lang w:val="vi-VN"/>
-        </w:rPr>
-        <w:t xml:space="preserve"> </w:t>
-      </w:r>
-      <w:r>
-        <w:rPr>
-          <w:rFonts w:ascii="Times New Roman" w:hAnsi="Times New Roman" w:cs="Times New Roman"/>
-          <w:bCs/>
-          <w:sz w:val="26"/>
-          <w:szCs w:val="26"/>
-        </w:rPr>
-        <w:t>nhân viên kiểm tra lịch làm việc của bác sĩ và các khung giờ còn trống.</w:t>
-      </w:r>
-      <w:r>
-        <w:rPr>
-          <w:rFonts w:ascii="Times New Roman" w:hAnsi="Times New Roman" w:cs="Times New Roman"/>
-          <w:b/>
-          <w:sz w:val="26"/>
-          <w:szCs w:val="26"/>
-        </w:rPr>
-        <w:t xml:space="preserve"> </w:t>
-      </w:r>
-    </w:p>
-    <w:p>
-      <w:pPr>
-        <w:pStyle w:val="ListParagraph"/>
-        <w:ind w:left="1080"/>
-        <w:rPr>
-          <w:rFonts w:ascii="Times New Roman" w:hAnsi="Times New Roman" w:cs="Times New Roman"/>
-          <w:b/>
-          <w:bCs/>
-          <w:sz w:val="26"/>
-          <w:szCs w:val="26"/>
-          <w:lang w:val="vi-VN"/>
-        </w:rPr>
-      </w:pPr>
-    </w:p>
-    <w:p>
-      <w:pPr>
-        <w:pStyle w:val="ListParagraph"/>
-        <w:ind w:left="1080"/>
-        <w:rPr>
-          <w:rFonts w:ascii="Times New Roman" w:hAnsi="Times New Roman" w:cs="Times New Roman"/>
-          <w:b/>
-          <w:sz w:val="26"/>
-          <w:szCs w:val="26"/>
-          <w:lang w:val="vi-VN"/>
-        </w:rPr>
-      </w:pPr>
-      <w:r>
-        <w:rPr>
-          <w:rFonts w:ascii="Times New Roman" w:hAnsi="Times New Roman" w:cs="Times New Roman"/>
-          <w:b/>
-          <w:bCs/>
-          <w:sz w:val="26"/>
-          <w:szCs w:val="26"/>
-        </w:rPr>
-        <w:t xml:space="preserve">Bước </w:t>
-      </w:r>
-      <w:proofErr w:type="gramStart"/>
-      <w:r>
-        <w:rPr>
-          <w:rFonts w:ascii="Times New Roman" w:hAnsi="Times New Roman" w:cs="Times New Roman"/>
-          <w:b/>
-          <w:bCs/>
-          <w:sz w:val="26"/>
-          <w:szCs w:val="26"/>
-        </w:rPr>
-        <w:t>3</w:t>
-      </w:r>
-      <w:r>
-        <w:rPr>
-          <w:rFonts w:ascii="Times New Roman" w:hAnsi="Times New Roman" w:cs="Times New Roman"/>
-          <w:b/>
-          <w:sz w:val="26"/>
-          <w:szCs w:val="26"/>
-          <w:lang w:val="vi-VN"/>
-        </w:rPr>
-        <w:t xml:space="preserve"> :</w:t>
-      </w:r>
-      <w:proofErr w:type="gramEnd"/>
-      <w:r>
-        <w:rPr>
-          <w:rFonts w:ascii="Times New Roman" w:hAnsi="Times New Roman" w:cs="Times New Roman"/>
-          <w:b/>
-          <w:sz w:val="26"/>
-          <w:szCs w:val="26"/>
-          <w:lang w:val="vi-VN"/>
-        </w:rPr>
-        <w:t xml:space="preserve"> </w:t>
-      </w:r>
-      <w:r>
-        <w:rPr>
-          <w:rFonts w:ascii="Times New Roman" w:hAnsi="Times New Roman" w:cs="Times New Roman"/>
-          <w:bCs/>
-          <w:sz w:val="26"/>
-          <w:szCs w:val="26"/>
-        </w:rPr>
-        <w:t>nhân viên trao đổi với bệnh nhân để lựa chọn bác sĩ, ngày và giờ khám phù hợp.</w:t>
-      </w:r>
-      <w:r>
-        <w:rPr>
-          <w:rFonts w:ascii="Times New Roman" w:hAnsi="Times New Roman" w:cs="Times New Roman"/>
-          <w:b/>
-          <w:sz w:val="26"/>
-          <w:szCs w:val="26"/>
-        </w:rPr>
-        <w:t xml:space="preserve"> </w:t>
-      </w:r>
-    </w:p>
-    <w:p>
-      <w:pPr>
-        <w:pStyle w:val="ListParagraph"/>
-        <w:ind w:left="1080"/>
-        <w:rPr>
-          <w:rFonts w:ascii="Times New Roman" w:hAnsi="Times New Roman" w:cs="Times New Roman"/>
-          <w:b/>
-          <w:sz w:val="26"/>
-          <w:szCs w:val="26"/>
-          <w:lang w:val="vi-VN"/>
-        </w:rPr>
-      </w:pPr>
-    </w:p>
-    <w:p>
-      <w:pPr>
-        <w:pStyle w:val="ListParagraph"/>
-        <w:ind w:left="1080"/>
-        <w:rPr>
-          <w:rFonts w:ascii="Times New Roman" w:hAnsi="Times New Roman" w:cs="Times New Roman"/>
-          <w:b/>
-          <w:sz w:val="26"/>
-          <w:szCs w:val="26"/>
-          <w:lang w:val="vi-VN"/>
-        </w:rPr>
-      </w:pPr>
-      <w:r>
-        <w:rPr>
-          <w:rFonts w:ascii="Times New Roman" w:hAnsi="Times New Roman" w:cs="Times New Roman"/>
-          <w:b/>
-          <w:bCs/>
-          <w:sz w:val="26"/>
-          <w:szCs w:val="26"/>
-        </w:rPr>
-        <w:t xml:space="preserve">Bước </w:t>
-      </w:r>
-      <w:proofErr w:type="gramStart"/>
-      <w:r>
-        <w:rPr>
-          <w:rFonts w:ascii="Times New Roman" w:hAnsi="Times New Roman" w:cs="Times New Roman"/>
-          <w:b/>
-          <w:bCs/>
-          <w:sz w:val="26"/>
-          <w:szCs w:val="26"/>
-        </w:rPr>
-        <w:t>4</w:t>
-      </w:r>
-      <w:r>
-        <w:rPr>
-          <w:rFonts w:ascii="Times New Roman" w:hAnsi="Times New Roman" w:cs="Times New Roman"/>
-          <w:b/>
-          <w:sz w:val="26"/>
-          <w:szCs w:val="26"/>
-          <w:lang w:val="vi-VN"/>
-        </w:rPr>
-        <w:t xml:space="preserve"> :</w:t>
-      </w:r>
-      <w:proofErr w:type="gramEnd"/>
-      <w:r>
-        <w:rPr>
-          <w:rFonts w:ascii="Times New Roman" w:hAnsi="Times New Roman" w:cs="Times New Roman"/>
-          <w:b/>
-          <w:sz w:val="26"/>
-          <w:szCs w:val="26"/>
-          <w:lang w:val="vi-VN"/>
-        </w:rPr>
-        <w:t xml:space="preserve"> </w:t>
-      </w:r>
-      <w:r>
-        <w:rPr>
-          <w:rFonts w:ascii="Times New Roman" w:hAnsi="Times New Roman" w:cs="Times New Roman"/>
-          <w:bCs/>
-          <w:sz w:val="26"/>
-          <w:szCs w:val="26"/>
-        </w:rPr>
-        <w:t>nhân viên tạo lịch hẹn và lưu thông tin vào hệ thống hoặc sổ quản lý.</w:t>
-      </w:r>
-      <w:r>
-        <w:rPr>
-          <w:rFonts w:ascii="Times New Roman" w:hAnsi="Times New Roman" w:cs="Times New Roman"/>
-          <w:b/>
-          <w:sz w:val="26"/>
-          <w:szCs w:val="26"/>
-        </w:rPr>
-        <w:t xml:space="preserve"> </w:t>
-      </w:r>
-    </w:p>
-    <w:p>
-      <w:pPr>
-        <w:pStyle w:val="ListParagraph"/>
-        <w:ind w:left="1080"/>
-        <w:rPr>
-          <w:rFonts w:ascii="Times New Roman" w:hAnsi="Times New Roman" w:cs="Times New Roman"/>
-          <w:b/>
-          <w:sz w:val="26"/>
-          <w:szCs w:val="26"/>
-          <w:lang w:val="vi-VN"/>
-        </w:rPr>
-      </w:pPr>
-    </w:p>
-    <w:p>
-      <w:pPr>
-        <w:pStyle w:val="ListParagraph"/>
-        <w:ind w:left="1080"/>
-        <w:rPr>
-          <w:rFonts w:ascii="Times New Roman" w:hAnsi="Times New Roman" w:cs="Times New Roman"/>
-          <w:bCs/>
-          <w:sz w:val="26"/>
-          <w:szCs w:val="26"/>
-          <w:lang w:val="vi-VN"/>
-        </w:rPr>
-      </w:pPr>
-      <w:r>
-        <w:rPr>
-          <w:rFonts w:ascii="Times New Roman" w:hAnsi="Times New Roman" w:cs="Times New Roman"/>
-          <w:b/>
-          <w:bCs/>
-          <w:sz w:val="26"/>
-          <w:szCs w:val="26"/>
-        </w:rPr>
-        <w:t xml:space="preserve">Bước </w:t>
-      </w:r>
-      <w:proofErr w:type="gramStart"/>
-      <w:r>
-        <w:rPr>
-          <w:rFonts w:ascii="Times New Roman" w:hAnsi="Times New Roman" w:cs="Times New Roman"/>
-          <w:b/>
-          <w:bCs/>
-          <w:sz w:val="26"/>
-          <w:szCs w:val="26"/>
-        </w:rPr>
-        <w:t>5</w:t>
-      </w:r>
-      <w:r>
-        <w:rPr>
-          <w:rFonts w:ascii="Times New Roman" w:hAnsi="Times New Roman" w:cs="Times New Roman"/>
-          <w:b/>
-          <w:sz w:val="26"/>
-          <w:szCs w:val="26"/>
-          <w:lang w:val="vi-VN"/>
-        </w:rPr>
-        <w:t xml:space="preserve"> :</w:t>
-      </w:r>
-      <w:proofErr w:type="gramEnd"/>
-      <w:r>
-        <w:rPr>
-          <w:rFonts w:ascii="Times New Roman" w:hAnsi="Times New Roman" w:cs="Times New Roman"/>
-          <w:b/>
-          <w:sz w:val="26"/>
-          <w:szCs w:val="26"/>
-        </w:rPr>
-        <w:t xml:space="preserve"> </w:t>
-      </w:r>
-      <w:r>
-        <w:rPr>
-          <w:rFonts w:ascii="Times New Roman" w:hAnsi="Times New Roman" w:cs="Times New Roman"/>
-          <w:bCs/>
-          <w:sz w:val="26"/>
-          <w:szCs w:val="26"/>
-        </w:rPr>
-        <w:t>nhân viên thông báo lại thời gian và thông tin lịch hẹn cho bệnh nhân.</w:t>
-      </w:r>
-    </w:p>
-    <w:p>
-      <w:pPr>
-        <w:pStyle w:val="ListParagraph"/>
-        <w:ind w:left="1080"/>
-        <w:rPr>
-          <w:rFonts w:ascii="Times New Roman" w:hAnsi="Times New Roman" w:cs="Times New Roman"/>
-          <w:bCs/>
-          <w:sz w:val="26"/>
-          <w:szCs w:val="26"/>
-          <w:lang w:val="vi-VN"/>
-        </w:rPr>
-      </w:pPr>
-    </w:p>
-    <w:p>
-      <w:pPr>
-        <w:pStyle w:val="ListParagraph"/>
-        <w:ind w:left="1080"/>
-        <w:rPr>
-          <w:rFonts w:ascii="Times New Roman" w:hAnsi="Times New Roman" w:cs="Times New Roman"/>
-          <w:bCs/>
-          <w:sz w:val="26"/>
-          <w:szCs w:val="26"/>
-          <w:lang w:val="vi-VN"/>
-        </w:rPr>
-      </w:pPr>
-      <w:r>
-        <w:rPr>
-          <w:rFonts w:ascii="Times New Roman" w:hAnsi="Times New Roman" w:cs="Times New Roman"/>
-          <w:b/>
-          <w:sz w:val="26"/>
-          <w:szCs w:val="26"/>
-        </w:rPr>
-        <w:t xml:space="preserve">Kết thúc quy </w:t>
-      </w:r>
-      <w:proofErr w:type="gramStart"/>
-      <w:r>
-        <w:rPr>
-          <w:rFonts w:ascii="Times New Roman" w:hAnsi="Times New Roman" w:cs="Times New Roman"/>
-          <w:b/>
-          <w:sz w:val="26"/>
-          <w:szCs w:val="26"/>
-        </w:rPr>
-        <w:t>trình</w:t>
-      </w:r>
-      <w:r>
-        <w:rPr>
-          <w:rFonts w:ascii="Times New Roman" w:hAnsi="Times New Roman" w:cs="Times New Roman"/>
-          <w:bCs/>
-          <w:sz w:val="26"/>
-          <w:szCs w:val="26"/>
-          <w:lang w:val="vi-VN"/>
-        </w:rPr>
-        <w:t xml:space="preserve"> </w:t>
-      </w:r>
-      <w:r>
-        <w:rPr>
-          <w:rFonts w:ascii="Times New Roman" w:hAnsi="Times New Roman" w:cs="Times New Roman"/>
-          <w:b/>
-          <w:sz w:val="26"/>
-          <w:szCs w:val="26"/>
-          <w:lang w:val="vi-VN"/>
-        </w:rPr>
-        <w:t>:</w:t>
-      </w:r>
-      <w:proofErr w:type="gramEnd"/>
       <w:r>
         <w:rPr>
           <w:rFonts w:ascii="Times New Roman" w:hAnsi="Times New Roman" w:cs="Times New Roman"/>
@@ -1805,55 +1731,43 @@
           <w:sz w:val="26"/>
           <w:szCs w:val="26"/>
         </w:rPr>
-        <w:t>Quy trình quản lý lịch cho bác sĩ</w:t>
-      </w:r>
-    </w:p>
-    <w:p>
-      <w:pPr>
-        <w:pStyle w:val="ListParagraph"/>
-        <w:ind w:left="1080"/>
-        <w:rPr>
-          <w:rFonts w:ascii="Times New Roman" w:hAnsi="Times New Roman" w:cs="Times New Roman"/>
-          <w:b/>
-          <w:sz w:val="26"/>
-          <w:szCs w:val="26"/>
-          <w:lang w:val="vi-VN"/>
-        </w:rPr>
-      </w:pPr>
-    </w:p>
-    <w:p>
-      <w:pPr>
-        <w:pStyle w:val="ListParagraph"/>
-        <w:ind w:left="1080"/>
-        <w:rPr>
-          <w:rFonts w:ascii="Times New Roman" w:hAnsi="Times New Roman" w:cs="Times New Roman"/>
-          <w:b/>
-          <w:sz w:val="26"/>
-          <w:szCs w:val="26"/>
-          <w:lang w:val="vi-VN"/>
-        </w:rPr>
-      </w:pPr>
-      <w:r>
-        <w:rPr>
-          <w:rFonts w:ascii="Times New Roman" w:hAnsi="Times New Roman" w:cs="Times New Roman"/>
-          <w:b/>
-          <w:bCs/>
-          <w:sz w:val="26"/>
-          <w:szCs w:val="26"/>
-        </w:rPr>
         <w:lastRenderedPageBreak/>
-        <w:t xml:space="preserve">Bước </w:t>
-      </w:r>
-      <w:proofErr w:type="gramStart"/>
-      <w:r>
-        <w:rPr>
-          <w:rFonts w:ascii="Times New Roman" w:hAnsi="Times New Roman" w:cs="Times New Roman"/>
-          <w:b/>
-          <w:bCs/>
-          <w:sz w:val="26"/>
-          <w:szCs w:val="26"/>
-        </w:rPr>
-        <w:t>1</w:t>
+        <w:t>Quy trình quản lý lịch hẹn</w:t>
+      </w:r>
+    </w:p>
+    <w:p>
+      <w:pPr>
+        <w:pStyle w:val="ListParagraph"/>
+        <w:ind w:left="1080"/>
+        <w:rPr>
+          <w:rFonts w:ascii="Times New Roman" w:hAnsi="Times New Roman" w:cs="Times New Roman"/>
+          <w:b/>
+          <w:sz w:val="26"/>
+          <w:szCs w:val="26"/>
+          <w:lang w:val="vi-VN"/>
+        </w:rPr>
+      </w:pPr>
+    </w:p>
+    <w:p>
+      <w:pPr>
+        <w:pStyle w:val="ListParagraph"/>
+        <w:ind w:left="1080"/>
+        <w:rPr>
+          <w:rFonts w:ascii="Times New Roman" w:hAnsi="Times New Roman" w:cs="Times New Roman"/>
+          <w:sz w:val="26"/>
+          <w:szCs w:val="26"/>
+          <w:lang w:val="vi-VN"/>
+        </w:rPr>
+      </w:pPr>
+      <w:r>
+        <w:rPr>
+          <w:rFonts w:ascii="Times New Roman" w:hAnsi="Times New Roman" w:cs="Times New Roman"/>
+          <w:b/>
+          <w:bCs/>
+          <w:sz w:val="26"/>
+          <w:szCs w:val="26"/>
+        </w:rPr>
+        <w:t>Bước 1</w:t>
       </w:r>
       <w:r>
         <w:rPr>
@@ -1865,7 +1779,6 @@
         </w:rPr>
         <w:t xml:space="preserve"> :</w:t>
       </w:r>
-      <w:proofErr w:type="gramEnd"/>
       <w:r>
         <w:rPr>
           <w:rFonts w:ascii="Times New Roman" w:hAnsi="Times New Roman" w:cs="Times New Roman"/>
@@ -1882,7 +1795,61 @@
           <w:sz w:val="26"/>
           <w:szCs w:val="26"/>
         </w:rPr>
-        <w:t>nhân viên cập nhật lịch làm việc, thời gian làm việc và phòng khám của từng bác sĩ.</w:t>
+        <w:t xml:space="preserve">Nhân viên cập nhật lịch làm việc, thời gian làm việc và phòng khám của </w:t>
+      </w:r>
+      <w:r>
+        <w:rPr>
+          <w:rFonts w:ascii="Times New Roman" w:hAnsi="Times New Roman" w:cs="Times New Roman"/>
+          <w:sz w:val="26"/>
+          <w:szCs w:val="26"/>
+        </w:rPr>
+        <w:t>bác sĩ, y tá.</w:t>
+      </w:r>
+    </w:p>
+    <w:p>
+      <w:pPr>
+        <w:pStyle w:val="ListParagraph"/>
+        <w:ind w:left="1080"/>
+        <w:rPr>
+          <w:rFonts w:ascii="Times New Roman" w:hAnsi="Times New Roman" w:cs="Times New Roman"/>
+          <w:b/>
+          <w:sz w:val="26"/>
+          <w:szCs w:val="26"/>
+          <w:lang w:val="vi-VN"/>
+        </w:rPr>
+      </w:pPr>
+    </w:p>
+    <w:p>
+      <w:pPr>
+        <w:pStyle w:val="ListParagraph"/>
+        <w:ind w:left="1080"/>
+        <w:rPr>
+          <w:rFonts w:ascii="Times New Roman" w:hAnsi="Times New Roman" w:cs="Times New Roman"/>
+          <w:b/>
+          <w:sz w:val="26"/>
+          <w:szCs w:val="26"/>
+          <w:lang w:val="vi-VN"/>
+        </w:rPr>
+      </w:pPr>
+      <w:r>
+        <w:rPr>
+          <w:rFonts w:ascii="Times New Roman" w:hAnsi="Times New Roman" w:cs="Times New Roman"/>
+          <w:b/>
+          <w:bCs/>
+          <w:sz w:val="26"/>
+          <w:szCs w:val="26"/>
+        </w:rPr>
+        <w:t>Bước 2</w:t>
+      </w:r>
+      <w:r>
+        <w:rPr>
+          <w:rFonts w:ascii="Times New Roman" w:hAnsi="Times New Roman" w:cs="Times New Roman"/>
+          <w:b/>
+          <w:sz w:val="26"/>
+          <w:szCs w:val="26"/>
+          <w:lang w:val="vi-VN"/>
+        </w:rPr>
+        <w:t xml:space="preserve"> :</w:t>
       </w:r>
       <w:r>
         <w:rPr>
@@ -1893,52 +1860,122 @@
         </w:rPr>
         <w:t xml:space="preserve"> </w:t>
       </w:r>
-    </w:p>
-    <w:p>
-      <w:pPr>
-        <w:pStyle w:val="ListParagraph"/>
-        <w:ind w:left="1080"/>
-        <w:rPr>
-          <w:rFonts w:ascii="Times New Roman" w:hAnsi="Times New Roman" w:cs="Times New Roman"/>
-          <w:b/>
-          <w:sz w:val="26"/>
-          <w:szCs w:val="26"/>
-          <w:lang w:val="vi-VN"/>
-        </w:rPr>
-      </w:pPr>
-    </w:p>
-    <w:p>
-      <w:pPr>
-        <w:pStyle w:val="ListParagraph"/>
-        <w:ind w:left="1080"/>
-        <w:rPr>
-          <w:rFonts w:ascii="Times New Roman" w:hAnsi="Times New Roman" w:cs="Times New Roman"/>
-          <w:b/>
-          <w:sz w:val="26"/>
-          <w:szCs w:val="26"/>
-          <w:lang w:val="vi-VN"/>
-        </w:rPr>
-      </w:pPr>
-      <w:r>
-        <w:rPr>
-          <w:rFonts w:ascii="Times New Roman" w:hAnsi="Times New Roman" w:cs="Times New Roman"/>
-          <w:b/>
-          <w:bCs/>
-          <w:sz w:val="26"/>
-          <w:szCs w:val="26"/>
-        </w:rPr>
-        <w:t xml:space="preserve">Bước </w:t>
-      </w:r>
-      <w:proofErr w:type="gramStart"/>
-      <w:r>
-        <w:rPr>
-          <w:rFonts w:ascii="Times New Roman" w:hAnsi="Times New Roman" w:cs="Times New Roman"/>
-          <w:b/>
-          <w:bCs/>
-          <w:sz w:val="26"/>
-          <w:szCs w:val="26"/>
-        </w:rPr>
-        <w:t>2</w:t>
+      <w:r>
+        <w:rPr>
+          <w:rFonts w:ascii="Times New Roman" w:hAnsi="Times New Roman" w:cs="Times New Roman"/>
+          <w:bCs/>
+          <w:sz w:val="26"/>
+          <w:szCs w:val="26"/>
+        </w:rPr>
+        <w:t xml:space="preserve">Nhân viên kiểm tra các lịch hẹn đã được đặt theo từng ngày, từng khung giờ và theo </w:t>
+      </w:r>
+      <w:r>
+        <w:rPr>
+          <w:rFonts w:ascii="Times New Roman" w:hAnsi="Times New Roman" w:cs="Times New Roman"/>
+          <w:sz w:val="26"/>
+          <w:szCs w:val="26"/>
+        </w:rPr>
+        <w:t>bác sĩ hoặc y tá phụ trách.</w:t>
+      </w:r>
+    </w:p>
+    <w:p>
+      <w:pPr>
+        <w:pStyle w:val="ListParagraph"/>
+        <w:ind w:left="1080"/>
+        <w:rPr>
+          <w:rFonts w:ascii="Times New Roman" w:hAnsi="Times New Roman" w:cs="Times New Roman"/>
+          <w:b/>
+          <w:sz w:val="26"/>
+          <w:szCs w:val="26"/>
+          <w:lang w:val="vi-VN"/>
+        </w:rPr>
+      </w:pPr>
+    </w:p>
+    <w:p>
+      <w:pPr>
+        <w:pStyle w:val="ListParagraph"/>
+        <w:ind w:left="1080"/>
+        <w:rPr>
+          <w:rFonts w:ascii="Times New Roman" w:hAnsi="Times New Roman" w:cs="Times New Roman"/>
+          <w:bCs/>
+          <w:sz w:val="26"/>
+          <w:szCs w:val="26"/>
+          <w:lang w:val="vi-VN"/>
+        </w:rPr>
+      </w:pPr>
+      <w:r>
+        <w:rPr>
+          <w:rFonts w:ascii="Times New Roman" w:hAnsi="Times New Roman" w:cs="Times New Roman"/>
+          <w:b/>
+          <w:bCs/>
+          <w:sz w:val="26"/>
+          <w:szCs w:val="26"/>
+        </w:rPr>
+        <w:t>Bước 3</w:t>
+      </w:r>
+      <w:r>
+        <w:rPr>
+          <w:rFonts w:ascii="Times New Roman" w:hAnsi="Times New Roman" w:cs="Times New Roman"/>
+          <w:b/>
+          <w:sz w:val="26"/>
+          <w:szCs w:val="26"/>
+          <w:lang w:val="vi-VN"/>
+        </w:rPr>
+        <w:t xml:space="preserve"> : </w:t>
+      </w:r>
+      <w:r>
+        <w:rPr>
+          <w:rFonts w:ascii="Times New Roman" w:hAnsi="Times New Roman" w:cs="Times New Roman"/>
+          <w:bCs/>
+          <w:sz w:val="26"/>
+          <w:szCs w:val="26"/>
+        </w:rPr>
+        <w:t>Khi có lịch hẹn mới, nhân viên bổ sung thông tin bệnh nhân vào khung giờ còn trống và phân công bác sĩ, y tá phù hợp.</w:t>
+      </w:r>
+    </w:p>
+    <w:p>
+      <w:pPr>
+        <w:pStyle w:val="ListParagraph"/>
+        <w:ind w:left="1080"/>
+        <w:rPr>
+          <w:rFonts w:ascii="Times New Roman" w:hAnsi="Times New Roman" w:cs="Times New Roman"/>
+          <w:bCs/>
+          <w:sz w:val="26"/>
+          <w:szCs w:val="26"/>
+          <w:lang w:val="vi-VN"/>
+        </w:rPr>
+      </w:pPr>
+      <w:r>
+        <w:rPr>
+          <w:rFonts w:ascii="Times New Roman" w:hAnsi="Times New Roman" w:cs="Times New Roman"/>
+          <w:bCs/>
+          <w:sz w:val="26"/>
+          <w:szCs w:val="26"/>
+        </w:rPr>
+        <w:t xml:space="preserve"> </w:t>
+      </w:r>
+    </w:p>
+    <w:p>
+      <w:pPr>
+        <w:pStyle w:val="ListParagraph"/>
+        <w:ind w:left="1080"/>
+        <w:rPr>
+          <w:rFonts w:ascii="Times New Roman" w:hAnsi="Times New Roman" w:cs="Times New Roman"/>
+          <w:b/>
+          <w:sz w:val="26"/>
+          <w:szCs w:val="26"/>
+          <w:lang w:val="vi-VN"/>
+        </w:rPr>
+      </w:pPr>
+      <w:r>
+        <w:rPr>
+          <w:rFonts w:ascii="Times New Roman" w:hAnsi="Times New Roman" w:cs="Times New Roman"/>
+          <w:b/>
+          <w:bCs/>
+          <w:sz w:val="26"/>
+          <w:szCs w:val="26"/>
+        </w:rPr>
+        <w:t>Bước 4</w:t>
       </w:r>
       <w:r>
         <w:rPr>
@@ -1950,7 +1987,6 @@
         </w:rPr>
         <w:t xml:space="preserve"> :</w:t>
       </w:r>
-      <w:proofErr w:type="gramEnd"/>
       <w:r>
         <w:rPr>
           <w:rFonts w:ascii="Times New Roman" w:hAnsi="Times New Roman" w:cs="Times New Roman"/>
@@ -1967,63 +2003,124 @@
           <w:sz w:val="26"/>
           <w:szCs w:val="26"/>
         </w:rPr>
-        <w:t>nhân viên kiểm tra các lịch hẹn đã được đặt trong từng ngày và từng khung giờ.</w:t>
-      </w:r>
-      <w:r>
-        <w:rPr>
-          <w:rFonts w:ascii="Times New Roman" w:hAnsi="Times New Roman" w:cs="Times New Roman"/>
-          <w:b/>
-          <w:sz w:val="26"/>
-          <w:szCs w:val="26"/>
+        <w:t>Nếu bác sĩ, y tá hoặc bệnh nhân có thay đổi, nhân viên thực hiện điều chỉnh thông tin lịch hẹn tương ứng.</w:t>
+      </w:r>
+    </w:p>
+    <w:p>
+      <w:pPr>
+        <w:pStyle w:val="ListParagraph"/>
+        <w:ind w:left="1080"/>
+        <w:rPr>
+          <w:rFonts w:ascii="Times New Roman" w:hAnsi="Times New Roman" w:cs="Times New Roman"/>
+          <w:b/>
+          <w:sz w:val="26"/>
+          <w:szCs w:val="26"/>
+          <w:lang w:val="vi-VN"/>
+        </w:rPr>
+      </w:pPr>
+    </w:p>
+    <w:p>
+      <w:pPr>
+        <w:pStyle w:val="ListParagraph"/>
+        <w:ind w:left="1080"/>
+        <w:rPr>
+          <w:rFonts w:ascii="Times New Roman" w:hAnsi="Times New Roman" w:cs="Times New Roman"/>
+          <w:bCs/>
+          <w:sz w:val="26"/>
+          <w:szCs w:val="26"/>
+          <w:lang w:val="vi-VN"/>
+        </w:rPr>
+      </w:pPr>
+      <w:r>
+        <w:rPr>
+          <w:rFonts w:ascii="Times New Roman" w:hAnsi="Times New Roman" w:cs="Times New Roman"/>
+          <w:b/>
+          <w:bCs/>
+          <w:sz w:val="26"/>
+          <w:szCs w:val="26"/>
+        </w:rPr>
+        <w:t>Bước 5</w:t>
+      </w:r>
+      <w:r>
+        <w:rPr>
+          <w:rFonts w:ascii="Times New Roman" w:hAnsi="Times New Roman" w:cs="Times New Roman"/>
+          <w:b/>
+          <w:sz w:val="26"/>
+          <w:szCs w:val="26"/>
+          <w:lang w:val="vi-VN"/>
+        </w:rPr>
+        <w:t xml:space="preserve"> : </w:t>
+      </w:r>
+      <w:r>
+        <w:rPr>
+          <w:rFonts w:ascii="Times New Roman" w:hAnsi="Times New Roman" w:cs="Times New Roman"/>
+          <w:bCs/>
+          <w:sz w:val="26"/>
+          <w:szCs w:val="26"/>
+        </w:rPr>
+        <w:t xml:space="preserve">Nhân viên kiểm tra lại toàn bộ lịch hẹn để phát hiện tình trạng </w:t>
+      </w:r>
+      <w:r>
+        <w:rPr>
+          <w:rFonts w:ascii="Times New Roman" w:hAnsi="Times New Roman" w:cs="Times New Roman"/>
+          <w:sz w:val="26"/>
+          <w:szCs w:val="26"/>
+        </w:rPr>
+        <w:t>trùng giờ, thiếu nhân sự hoặc vượt quá khả năng tiếp nhận của phòng khám.</w:t>
+      </w:r>
+    </w:p>
+    <w:p>
+      <w:pPr>
+        <w:pStyle w:val="ListParagraph"/>
+        <w:ind w:left="1080"/>
+        <w:rPr>
+          <w:rFonts w:ascii="Times New Roman" w:hAnsi="Times New Roman" w:cs="Times New Roman"/>
+          <w:bCs/>
+          <w:sz w:val="26"/>
+          <w:szCs w:val="26"/>
+          <w:lang w:val="vi-VN"/>
+        </w:rPr>
+      </w:pPr>
+    </w:p>
+    <w:p>
+      <w:pPr>
+        <w:pStyle w:val="ListParagraph"/>
+        <w:ind w:left="1080"/>
+        <w:rPr>
+          <w:rFonts w:ascii="Times New Roman" w:hAnsi="Times New Roman" w:cs="Times New Roman"/>
+          <w:bCs/>
+          <w:sz w:val="26"/>
+          <w:szCs w:val="26"/>
+          <w:lang w:val="vi-VN"/>
+        </w:rPr>
+      </w:pPr>
+      <w:r>
+        <w:rPr>
+          <w:rFonts w:ascii="Times New Roman" w:hAnsi="Times New Roman" w:cs="Times New Roman"/>
+          <w:b/>
+          <w:sz w:val="26"/>
+          <w:szCs w:val="26"/>
+        </w:rPr>
+        <w:t>Kết thúc</w:t>
+      </w:r>
+      <w:r>
+        <w:rPr>
+          <w:rFonts w:ascii="Times New Roman" w:hAnsi="Times New Roman" w:cs="Times New Roman"/>
+          <w:b/>
+          <w:sz w:val="26"/>
+          <w:szCs w:val="26"/>
+          <w:lang w:val="vi-VN"/>
         </w:rPr>
         <w:t xml:space="preserve"> </w:t>
       </w:r>
-    </w:p>
-    <w:p>
-      <w:pPr>
-        <w:pStyle w:val="ListParagraph"/>
-        <w:ind w:left="1080"/>
-        <w:rPr>
-          <w:rFonts w:ascii="Times New Roman" w:hAnsi="Times New Roman" w:cs="Times New Roman"/>
-          <w:b/>
-          <w:sz w:val="26"/>
-          <w:szCs w:val="26"/>
-          <w:lang w:val="vi-VN"/>
-        </w:rPr>
-      </w:pPr>
-    </w:p>
-    <w:p>
-      <w:pPr>
-        <w:pStyle w:val="ListParagraph"/>
-        <w:ind w:left="1080"/>
-        <w:rPr>
-          <w:rFonts w:ascii="Times New Roman" w:hAnsi="Times New Roman" w:cs="Times New Roman"/>
-          <w:bCs/>
-          <w:sz w:val="26"/>
-          <w:szCs w:val="26"/>
-          <w:lang w:val="vi-VN"/>
-        </w:rPr>
-      </w:pPr>
-      <w:r>
-        <w:rPr>
-          <w:rFonts w:ascii="Times New Roman" w:hAnsi="Times New Roman" w:cs="Times New Roman"/>
-          <w:b/>
-          <w:bCs/>
-          <w:sz w:val="26"/>
-          <w:szCs w:val="26"/>
-        </w:rPr>
-        <w:t xml:space="preserve">Bước </w:t>
-      </w:r>
-      <w:proofErr w:type="gramStart"/>
-      <w:r>
-        <w:rPr>
-          <w:rFonts w:ascii="Times New Roman" w:hAnsi="Times New Roman" w:cs="Times New Roman"/>
-          <w:b/>
-          <w:bCs/>
-          <w:sz w:val="26"/>
-          <w:szCs w:val="26"/>
-        </w:rPr>
-        <w:t>3</w:t>
+      <w:r>
+        <w:rPr>
+          <w:rFonts w:ascii="Times New Roman" w:hAnsi="Times New Roman" w:cs="Times New Roman"/>
+          <w:b/>
+          <w:sz w:val="26"/>
+          <w:szCs w:val="26"/>
+        </w:rPr>
+        <w:t>quy trình</w:t>
       </w:r>
       <w:r>
         <w:rPr>
@@ -2035,14 +2132,12 @@
         </w:rPr>
         <w:t xml:space="preserve"> :</w:t>
       </w:r>
-      <w:proofErr w:type="gramEnd"/>
-      <w:r>
-        <w:rPr>
-          <w:rFonts w:ascii="Times New Roman" w:hAnsi="Times New Roman" w:cs="Times New Roman"/>
-          <w:b/>
-          <w:sz w:val="26"/>
-          <w:szCs w:val="26"/>
-          <w:lang w:val="vi-VN"/>
+      <w:r>
+        <w:rPr>
+          <w:rFonts w:ascii="Times New Roman" w:hAnsi="Times New Roman" w:cs="Times New Roman"/>
+          <w:b/>
+          <w:sz w:val="26"/>
+          <w:szCs w:val="26"/>
         </w:rPr>
         <w:t xml:space="preserve"> </w:t>
       </w:r>
@@ -2053,317 +2148,7 @@
           <w:sz w:val="26"/>
           <w:szCs w:val="26"/>
         </w:rPr>
-        <w:t>khi có lịch mới, nhân viên bổ sung bệnh nhân vào khung giờ còn trống.</w:t>
-      </w:r>
-    </w:p>
-    <w:p>
-      <w:pPr>
-        <w:pStyle w:val="ListParagraph"/>
-        <w:ind w:left="1080"/>
-        <w:rPr>
-          <w:rFonts w:ascii="Times New Roman" w:hAnsi="Times New Roman" w:cs="Times New Roman"/>
-          <w:bCs/>
-          <w:sz w:val="26"/>
-          <w:szCs w:val="26"/>
-          <w:lang w:val="vi-VN"/>
-        </w:rPr>
-      </w:pPr>
-      <w:r>
-        <w:rPr>
-          <w:rFonts w:ascii="Times New Roman" w:hAnsi="Times New Roman" w:cs="Times New Roman"/>
-          <w:bCs/>
-          <w:sz w:val="26"/>
-          <w:szCs w:val="26"/>
-        </w:rPr>
-        <w:t xml:space="preserve"> </w:t>
-      </w:r>
-    </w:p>
-    <w:p>
-      <w:pPr>
-        <w:pStyle w:val="ListParagraph"/>
-        <w:ind w:left="1080"/>
-        <w:rPr>
-          <w:rFonts w:ascii="Times New Roman" w:hAnsi="Times New Roman" w:cs="Times New Roman"/>
-          <w:b/>
-          <w:sz w:val="26"/>
-          <w:szCs w:val="26"/>
-          <w:lang w:val="vi-VN"/>
-        </w:rPr>
-      </w:pPr>
-      <w:r>
-        <w:rPr>
-          <w:rFonts w:ascii="Times New Roman" w:hAnsi="Times New Roman" w:cs="Times New Roman"/>
-          <w:b/>
-          <w:bCs/>
-          <w:sz w:val="26"/>
-          <w:szCs w:val="26"/>
-        </w:rPr>
-        <w:t xml:space="preserve">Bước </w:t>
-      </w:r>
-      <w:proofErr w:type="gramStart"/>
-      <w:r>
-        <w:rPr>
-          <w:rFonts w:ascii="Times New Roman" w:hAnsi="Times New Roman" w:cs="Times New Roman"/>
-          <w:b/>
-          <w:bCs/>
-          <w:sz w:val="26"/>
-          <w:szCs w:val="26"/>
-        </w:rPr>
-        <w:t>4</w:t>
-      </w:r>
-      <w:r>
-        <w:rPr>
-          <w:rFonts w:ascii="Times New Roman" w:hAnsi="Times New Roman" w:cs="Times New Roman"/>
-          <w:b/>
-          <w:sz w:val="26"/>
-          <w:szCs w:val="26"/>
-          <w:lang w:val="vi-VN"/>
-        </w:rPr>
-        <w:t xml:space="preserve"> :</w:t>
-      </w:r>
-      <w:proofErr w:type="gramEnd"/>
-      <w:r>
-        <w:rPr>
-          <w:rFonts w:ascii="Times New Roman" w:hAnsi="Times New Roman" w:cs="Times New Roman"/>
-          <w:b/>
-          <w:sz w:val="26"/>
-          <w:szCs w:val="26"/>
-        </w:rPr>
-        <w:t xml:space="preserve"> </w:t>
-      </w:r>
-      <w:r>
-        <w:rPr>
-          <w:rFonts w:ascii="Times New Roman" w:hAnsi="Times New Roman" w:cs="Times New Roman"/>
-          <w:bCs/>
-          <w:sz w:val="26"/>
-          <w:szCs w:val="26"/>
-        </w:rPr>
-        <w:t>N</w:t>
-      </w:r>
-      <w:r>
-        <w:rPr>
-          <w:rFonts w:ascii="Times New Roman" w:hAnsi="Times New Roman" w:cs="Times New Roman"/>
-          <w:bCs/>
-          <w:sz w:val="26"/>
-          <w:szCs w:val="26"/>
-        </w:rPr>
-        <w:t>ếu bác sĩ hoặc bệnh nhân có thay đổi, nhân viên thực hiện điều chỉnh thông tin lịch.</w:t>
-      </w:r>
-      <w:r>
-        <w:rPr>
-          <w:rFonts w:ascii="Times New Roman" w:hAnsi="Times New Roman" w:cs="Times New Roman"/>
-          <w:b/>
-          <w:sz w:val="26"/>
-          <w:szCs w:val="26"/>
-        </w:rPr>
-        <w:t xml:space="preserve"> </w:t>
-      </w:r>
-    </w:p>
-    <w:p>
-      <w:pPr>
-        <w:pStyle w:val="ListParagraph"/>
-        <w:ind w:left="1080"/>
-        <w:rPr>
-          <w:rFonts w:ascii="Times New Roman" w:hAnsi="Times New Roman" w:cs="Times New Roman"/>
-          <w:b/>
-          <w:sz w:val="26"/>
-          <w:szCs w:val="26"/>
-          <w:lang w:val="vi-VN"/>
-        </w:rPr>
-      </w:pPr>
-    </w:p>
-    <w:p>
-      <w:pPr>
-        <w:pStyle w:val="ListParagraph"/>
-        <w:ind w:left="1080"/>
-        <w:rPr>
-          <w:rFonts w:ascii="Times New Roman" w:hAnsi="Times New Roman" w:cs="Times New Roman"/>
-          <w:bCs/>
-          <w:sz w:val="26"/>
-          <w:szCs w:val="26"/>
-          <w:lang w:val="vi-VN"/>
-        </w:rPr>
-      </w:pPr>
-      <w:r>
-        <w:rPr>
-          <w:rFonts w:ascii="Times New Roman" w:hAnsi="Times New Roman" w:cs="Times New Roman"/>
-          <w:b/>
-          <w:bCs/>
-          <w:sz w:val="26"/>
-          <w:szCs w:val="26"/>
-        </w:rPr>
-        <w:t xml:space="preserve">Bước </w:t>
-      </w:r>
-      <w:proofErr w:type="gramStart"/>
-      <w:r>
-        <w:rPr>
-          <w:rFonts w:ascii="Times New Roman" w:hAnsi="Times New Roman" w:cs="Times New Roman"/>
-          <w:b/>
-          <w:bCs/>
-          <w:sz w:val="26"/>
-          <w:szCs w:val="26"/>
-        </w:rPr>
-        <w:t>5</w:t>
-      </w:r>
-      <w:r>
-        <w:rPr>
-          <w:rFonts w:ascii="Times New Roman" w:hAnsi="Times New Roman" w:cs="Times New Roman"/>
-          <w:b/>
-          <w:sz w:val="26"/>
-          <w:szCs w:val="26"/>
-          <w:lang w:val="vi-VN"/>
-        </w:rPr>
-        <w:t xml:space="preserve"> :</w:t>
-      </w:r>
-      <w:proofErr w:type="gramEnd"/>
-      <w:r>
-        <w:rPr>
-          <w:rFonts w:ascii="Times New Roman" w:hAnsi="Times New Roman" w:cs="Times New Roman"/>
-          <w:b/>
-          <w:sz w:val="26"/>
-          <w:szCs w:val="26"/>
-          <w:lang w:val="vi-VN"/>
-        </w:rPr>
-        <w:t xml:space="preserve"> </w:t>
-      </w:r>
-      <w:r>
-        <w:rPr>
-          <w:rFonts w:ascii="Times New Roman" w:hAnsi="Times New Roman" w:cs="Times New Roman"/>
-          <w:bCs/>
-          <w:sz w:val="26"/>
-          <w:szCs w:val="26"/>
-        </w:rPr>
-        <w:t>N</w:t>
-      </w:r>
-      <w:r>
-        <w:rPr>
-          <w:rFonts w:ascii="Times New Roman" w:hAnsi="Times New Roman" w:cs="Times New Roman"/>
-          <w:bCs/>
-          <w:sz w:val="26"/>
-          <w:szCs w:val="26"/>
-        </w:rPr>
-        <w:t>hân viên kiểm tra lại toàn bộ lịch để phát hiện tình trạng trùng giờ hoặc vượt quá khả năng tiếp nhận.</w:t>
-      </w:r>
-    </w:p>
-    <w:p>
-      <w:pPr>
-        <w:pStyle w:val="ListParagraph"/>
-        <w:ind w:left="1080"/>
-        <w:rPr>
-          <w:rFonts w:ascii="Times New Roman" w:hAnsi="Times New Roman" w:cs="Times New Roman"/>
-          <w:bCs/>
-          <w:sz w:val="26"/>
-          <w:szCs w:val="26"/>
-          <w:lang w:val="vi-VN"/>
-        </w:rPr>
-      </w:pPr>
-    </w:p>
-    <w:p>
-      <w:pPr>
-        <w:pStyle w:val="ListParagraph"/>
-        <w:ind w:left="1080"/>
-        <w:rPr>
-          <w:rFonts w:ascii="Times New Roman" w:hAnsi="Times New Roman" w:cs="Times New Roman"/>
-          <w:bCs/>
-          <w:sz w:val="26"/>
-          <w:szCs w:val="26"/>
-          <w:lang w:val="vi-VN"/>
-        </w:rPr>
-      </w:pPr>
-      <w:r>
-        <w:rPr>
-          <w:rFonts w:ascii="Times New Roman" w:hAnsi="Times New Roman" w:cs="Times New Roman"/>
-          <w:b/>
-          <w:sz w:val="26"/>
-          <w:szCs w:val="26"/>
-        </w:rPr>
-        <w:t>Kết thúc</w:t>
-      </w:r>
-      <w:r>
-        <w:rPr>
-          <w:rFonts w:ascii="Times New Roman" w:hAnsi="Times New Roman" w:cs="Times New Roman"/>
-          <w:b/>
-          <w:sz w:val="26"/>
-          <w:szCs w:val="26"/>
-          <w:lang w:val="vi-VN"/>
-        </w:rPr>
-        <w:t xml:space="preserve"> </w:t>
-      </w:r>
-      <w:r>
-        <w:rPr>
-          <w:rFonts w:ascii="Times New Roman" w:hAnsi="Times New Roman" w:cs="Times New Roman"/>
-          <w:b/>
-          <w:sz w:val="26"/>
-          <w:szCs w:val="26"/>
-        </w:rPr>
-        <w:t xml:space="preserve">quy </w:t>
-      </w:r>
-      <w:proofErr w:type="gramStart"/>
-      <w:r>
-        <w:rPr>
-          <w:rFonts w:ascii="Times New Roman" w:hAnsi="Times New Roman" w:cs="Times New Roman"/>
-          <w:b/>
-          <w:sz w:val="26"/>
-          <w:szCs w:val="26"/>
-        </w:rPr>
-        <w:t>trình</w:t>
-      </w:r>
-      <w:r>
-        <w:rPr>
-          <w:rFonts w:ascii="Times New Roman" w:hAnsi="Times New Roman" w:cs="Times New Roman"/>
-          <w:b/>
-          <w:sz w:val="26"/>
-          <w:szCs w:val="26"/>
-          <w:lang w:val="vi-VN"/>
-        </w:rPr>
-        <w:t xml:space="preserve"> :</w:t>
-      </w:r>
-      <w:proofErr w:type="gramEnd"/>
-      <w:r>
-        <w:rPr>
-          <w:rFonts w:ascii="Times New Roman" w:hAnsi="Times New Roman" w:cs="Times New Roman"/>
-          <w:b/>
-          <w:sz w:val="26"/>
-          <w:szCs w:val="26"/>
-        </w:rPr>
-        <w:t xml:space="preserve"> </w:t>
-      </w:r>
-      <w:r>
-        <w:rPr>
-          <w:rFonts w:ascii="Times New Roman" w:hAnsi="Times New Roman" w:cs="Times New Roman"/>
-          <w:bCs/>
-          <w:sz w:val="26"/>
-          <w:szCs w:val="26"/>
-        </w:rPr>
-        <w:t>B</w:t>
-      </w:r>
-      <w:r>
-        <w:rPr>
-          <w:rFonts w:ascii="Times New Roman" w:hAnsi="Times New Roman" w:cs="Times New Roman"/>
-          <w:bCs/>
-          <w:sz w:val="26"/>
-          <w:szCs w:val="26"/>
-        </w:rPr>
-        <w:t xml:space="preserve">ác sĩ có danh sách bệnh nhân và lịch làm việc rõ ràng trong </w:t>
-      </w:r>
-      <w:r>
-        <w:rPr>
-          <w:rFonts w:ascii="Times New Roman" w:hAnsi="Times New Roman" w:cs="Times New Roman"/>
-          <w:bCs/>
-          <w:sz w:val="26"/>
-          <w:szCs w:val="26"/>
-        </w:rPr>
-        <w:t>ngày</w:t>
-      </w:r>
-      <w:r>
-        <w:rPr>
-          <w:rFonts w:ascii="Times New Roman" w:hAnsi="Times New Roman" w:cs="Times New Roman"/>
-          <w:bCs/>
-          <w:sz w:val="26"/>
-          <w:szCs w:val="26"/>
-          <w:lang w:val="vi-VN"/>
-        </w:rPr>
-        <w:t>.</w:t>
+        <w:t>Bác sĩ và y tá có lịch làm việc và danh sách bệnh nhân rõ ràng trong ngày, giúp nhân viên dễ dàng theo dõi, sắp xếp và điều phối lịch hẹn.</w:t>
       </w:r>
     </w:p>
     <w:p>
@@ -2437,18 +2222,7 @@
           <w:sz w:val="26"/>
           <w:szCs w:val="26"/>
         </w:rPr>
-        <w:t xml:space="preserve">Bước </w:t>
-      </w:r>
-      <w:proofErr w:type="gramStart"/>
-      <w:r>
-        <w:rPr>
-          <w:rFonts w:ascii="Times New Roman" w:hAnsi="Times New Roman" w:cs="Times New Roman"/>
-          <w:b/>
-          <w:bCs/>
-          <w:sz w:val="26"/>
-          <w:szCs w:val="26"/>
-        </w:rPr>
-        <w:t>1</w:t>
+        <w:t>Bước 1</w:t>
       </w:r>
       <w:r>
         <w:rPr>
@@ -2460,7 +2234,6 @@
         </w:rPr>
         <w:t xml:space="preserve"> :</w:t>
       </w:r>
-      <w:proofErr w:type="gramEnd"/>
       <w:r>
         <w:rPr>
           <w:rFonts w:ascii="Times New Roman" w:hAnsi="Times New Roman" w:cs="Times New Roman"/>
@@ -2531,18 +2304,7 @@
           <w:sz w:val="26"/>
           <w:szCs w:val="26"/>
         </w:rPr>
-        <w:t xml:space="preserve">Bước </w:t>
-      </w:r>
-      <w:proofErr w:type="gramStart"/>
-      <w:r>
-        <w:rPr>
-          <w:rFonts w:ascii="Times New Roman" w:hAnsi="Times New Roman" w:cs="Times New Roman"/>
-          <w:b/>
-          <w:bCs/>
-          <w:sz w:val="26"/>
-          <w:szCs w:val="26"/>
-        </w:rPr>
-        <w:t>2</w:t>
+        <w:t>Bước 2</w:t>
       </w:r>
       <w:r>
         <w:rPr>
@@ -2554,7 +2316,6 @@
         </w:rPr>
         <w:t xml:space="preserve"> :</w:t>
       </w:r>
-      <w:proofErr w:type="gramEnd"/>
       <w:r>
         <w:rPr>
           <w:rFonts w:ascii="Times New Roman" w:hAnsi="Times New Roman" w:cs="Times New Roman"/>
@@ -2625,18 +2386,7 @@
           <w:sz w:val="26"/>
           <w:szCs w:val="26"/>
         </w:rPr>
-        <w:t xml:space="preserve">Bước </w:t>
-      </w:r>
-      <w:proofErr w:type="gramStart"/>
-      <w:r>
-        <w:rPr>
-          <w:rFonts w:ascii="Times New Roman" w:hAnsi="Times New Roman" w:cs="Times New Roman"/>
-          <w:b/>
-          <w:bCs/>
-          <w:sz w:val="26"/>
-          <w:szCs w:val="26"/>
-        </w:rPr>
-        <w:t>3</w:t>
+        <w:t>Bước 3</w:t>
       </w:r>
       <w:r>
         <w:rPr>
@@ -2648,7 +2398,6 @@
         </w:rPr>
         <w:t xml:space="preserve"> :</w:t>
       </w:r>
-      <w:proofErr w:type="gramEnd"/>
       <w:r>
         <w:rPr>
           <w:rFonts w:ascii="Times New Roman" w:hAnsi="Times New Roman" w:cs="Times New Roman"/>
@@ -2719,18 +2468,7 @@
           <w:sz w:val="26"/>
           <w:szCs w:val="26"/>
         </w:rPr>
-        <w:t xml:space="preserve">Bước </w:t>
-      </w:r>
-      <w:proofErr w:type="gramStart"/>
-      <w:r>
-        <w:rPr>
-          <w:rFonts w:ascii="Times New Roman" w:hAnsi="Times New Roman" w:cs="Times New Roman"/>
-          <w:b/>
-          <w:bCs/>
-          <w:sz w:val="26"/>
-          <w:szCs w:val="26"/>
-        </w:rPr>
-        <w:t>4</w:t>
+        <w:t>Bước 4</w:t>
       </w:r>
       <w:r>
         <w:rPr>
@@ -2742,7 +2480,6 @@
         </w:rPr>
         <w:t xml:space="preserve"> :</w:t>
       </w:r>
-      <w:proofErr w:type="gramEnd"/>
       <w:r>
         <w:rPr>
           <w:rFonts w:ascii="Times New Roman" w:hAnsi="Times New Roman" w:cs="Times New Roman"/>
@@ -2813,18 +2550,7 @@
           <w:sz w:val="26"/>
           <w:szCs w:val="26"/>
         </w:rPr>
-        <w:t xml:space="preserve">Bước </w:t>
-      </w:r>
-      <w:proofErr w:type="gramStart"/>
-      <w:r>
-        <w:rPr>
-          <w:rFonts w:ascii="Times New Roman" w:hAnsi="Times New Roman" w:cs="Times New Roman"/>
-          <w:b/>
-          <w:bCs/>
-          <w:sz w:val="26"/>
-          <w:szCs w:val="26"/>
-        </w:rPr>
-        <w:t>5</w:t>
+        <w:t>Bước 5</w:t>
       </w:r>
       <w:r>
         <w:rPr>
@@ -2836,7 +2562,6 @@
         </w:rPr>
         <w:t xml:space="preserve"> :</w:t>
       </w:r>
-      <w:proofErr w:type="gramEnd"/>
       <w:r>
         <w:rPr>
           <w:rFonts w:ascii="Times New Roman" w:hAnsi="Times New Roman" w:cs="Times New Roman"/>
@@ -2916,38 +2641,17 @@
           <w:sz w:val="26"/>
           <w:szCs w:val="26"/>
         </w:rPr>
-        <w:t xml:space="preserve">quy </w:t>
-      </w:r>
-      <w:proofErr w:type="gramStart"/>
-      <w:r>
-        <w:rPr>
-          <w:rFonts w:ascii="Times New Roman" w:hAnsi="Times New Roman" w:cs="Times New Roman"/>
-          <w:b/>
-          <w:sz w:val="26"/>
-          <w:szCs w:val="26"/>
-        </w:rPr>
-        <w:t>trình</w:t>
-      </w:r>
-      <w:r>
-        <w:rPr>
-          <w:rFonts w:ascii="Times New Roman" w:hAnsi="Times New Roman" w:cs="Times New Roman"/>
-          <w:b/>
-          <w:sz w:val="26"/>
-          <w:szCs w:val="26"/>
-          <w:lang w:val="vi-VN"/>
-        </w:rPr>
-        <w:t xml:space="preserve"> :</w:t>
-      </w:r>
-      <w:proofErr w:type="gramEnd"/>
-      <w:r>
-        <w:rPr>
-          <w:rFonts w:ascii="Times New Roman" w:hAnsi="Times New Roman" w:cs="Times New Roman"/>
-          <w:b/>
-          <w:sz w:val="26"/>
-          <w:szCs w:val="26"/>
-          <w:lang w:val="vi-VN"/>
-        </w:rPr>
-        <w:t xml:space="preserve"> </w:t>
+        <w:t>quy trình</w:t>
+      </w:r>
+      <w:r>
+        <w:rPr>
+          <w:rFonts w:ascii="Times New Roman" w:hAnsi="Times New Roman" w:cs="Times New Roman"/>
+          <w:b/>
+          <w:sz w:val="26"/>
+          <w:szCs w:val="26"/>
+          <w:lang w:val="vi-VN"/>
+        </w:rPr>
+        <w:t xml:space="preserve"> : </w:t>
       </w:r>
       <w:r>
         <w:rPr>
@@ -3040,18 +2744,7 @@
           <w:sz w:val="26"/>
           <w:szCs w:val="26"/>
         </w:rPr>
-        <w:t xml:space="preserve">Bước </w:t>
-      </w:r>
-      <w:proofErr w:type="gramStart"/>
-      <w:r>
-        <w:rPr>
-          <w:rFonts w:ascii="Times New Roman" w:hAnsi="Times New Roman" w:cs="Times New Roman"/>
-          <w:b/>
-          <w:bCs/>
-          <w:sz w:val="26"/>
-          <w:szCs w:val="26"/>
-        </w:rPr>
-        <w:t>1</w:t>
+        <w:t>Bước 1</w:t>
       </w:r>
       <w:r>
         <w:rPr>
@@ -3063,7 +2756,6 @@
         </w:rPr>
         <w:t xml:space="preserve"> :</w:t>
       </w:r>
-      <w:proofErr w:type="gramEnd"/>
       <w:r>
         <w:rPr>
           <w:rFonts w:ascii="Times New Roman" w:hAnsi="Times New Roman" w:cs="Times New Roman"/>
@@ -3134,18 +2826,7 @@
           <w:sz w:val="26"/>
           <w:szCs w:val="26"/>
         </w:rPr>
-        <w:t xml:space="preserve">Bước </w:t>
-      </w:r>
-      <w:proofErr w:type="gramStart"/>
-      <w:r>
-        <w:rPr>
-          <w:rFonts w:ascii="Times New Roman" w:hAnsi="Times New Roman" w:cs="Times New Roman"/>
-          <w:b/>
-          <w:bCs/>
-          <w:sz w:val="26"/>
-          <w:szCs w:val="26"/>
-        </w:rPr>
-        <w:t>2</w:t>
+        <w:t>Bước 2</w:t>
       </w:r>
       <w:r>
         <w:rPr>
@@ -3157,7 +2838,6 @@
         </w:rPr>
         <w:t xml:space="preserve"> :</w:t>
       </w:r>
-      <w:proofErr w:type="gramEnd"/>
       <w:r>
         <w:rPr>
           <w:rFonts w:ascii="Times New Roman" w:hAnsi="Times New Roman" w:cs="Times New Roman"/>
@@ -3219,18 +2899,7 @@
           <w:sz w:val="26"/>
           <w:szCs w:val="26"/>
         </w:rPr>
-        <w:t xml:space="preserve">Bước </w:t>
-      </w:r>
-      <w:proofErr w:type="gramStart"/>
-      <w:r>
-        <w:rPr>
-          <w:rFonts w:ascii="Times New Roman" w:hAnsi="Times New Roman" w:cs="Times New Roman"/>
-          <w:b/>
-          <w:bCs/>
-          <w:sz w:val="26"/>
-          <w:szCs w:val="26"/>
-        </w:rPr>
-        <w:t>3</w:t>
+        <w:t>Bước 3</w:t>
       </w:r>
       <w:r>
         <w:rPr>
@@ -3242,7 +2911,6 @@
         </w:rPr>
         <w:t xml:space="preserve"> :</w:t>
       </w:r>
-      <w:proofErr w:type="gramEnd"/>
       <w:r>
         <w:rPr>
           <w:rFonts w:ascii="Times New Roman" w:hAnsi="Times New Roman" w:cs="Times New Roman"/>
@@ -3313,18 +2981,7 @@
           <w:sz w:val="26"/>
           <w:szCs w:val="26"/>
         </w:rPr>
-        <w:t xml:space="preserve">Bước </w:t>
-      </w:r>
-      <w:proofErr w:type="gramStart"/>
-      <w:r>
-        <w:rPr>
-          <w:rFonts w:ascii="Times New Roman" w:hAnsi="Times New Roman" w:cs="Times New Roman"/>
-          <w:b/>
-          <w:bCs/>
-          <w:sz w:val="26"/>
-          <w:szCs w:val="26"/>
-        </w:rPr>
-        <w:t>4</w:t>
+        <w:t>Bước 4</w:t>
       </w:r>
       <w:r>
         <w:rPr>
@@ -3336,7 +2993,6 @@
         </w:rPr>
         <w:t xml:space="preserve"> :</w:t>
       </w:r>
-      <w:proofErr w:type="gramEnd"/>
       <w:r>
         <w:rPr>
           <w:rFonts w:ascii="Times New Roman" w:hAnsi="Times New Roman" w:cs="Times New Roman"/>
@@ -3398,18 +3054,78 @@
           <w:sz w:val="26"/>
           <w:szCs w:val="26"/>
         </w:rPr>
-        <w:t xml:space="preserve">Bước </w:t>
-      </w:r>
-      <w:proofErr w:type="gramStart"/>
-      <w:r>
-        <w:rPr>
-          <w:rFonts w:ascii="Times New Roman" w:hAnsi="Times New Roman" w:cs="Times New Roman"/>
-          <w:b/>
-          <w:bCs/>
-          <w:sz w:val="26"/>
-          <w:szCs w:val="26"/>
-        </w:rPr>
-        <w:t>5</w:t>
+        <w:t>Bước 5</w:t>
+      </w:r>
+      <w:r>
+        <w:rPr>
+          <w:rFonts w:ascii="Times New Roman" w:hAnsi="Times New Roman" w:cs="Times New Roman"/>
+          <w:b/>
+          <w:sz w:val="26"/>
+          <w:szCs w:val="26"/>
+          <w:lang w:val="vi-VN"/>
+        </w:rPr>
+        <w:t xml:space="preserve"> : </w:t>
+      </w:r>
+      <w:r>
+        <w:rPr>
+          <w:rFonts w:ascii="Times New Roman" w:hAnsi="Times New Roman" w:cs="Times New Roman"/>
+          <w:b/>
+          <w:sz w:val="26"/>
+          <w:szCs w:val="26"/>
+        </w:rPr>
+        <w:t xml:space="preserve"> </w:t>
+      </w:r>
+      <w:r>
+        <w:rPr>
+          <w:rFonts w:ascii="Times New Roman" w:hAnsi="Times New Roman" w:cs="Times New Roman"/>
+          <w:bCs/>
+          <w:sz w:val="26"/>
+          <w:szCs w:val="26"/>
+        </w:rPr>
+        <w:t>N</w:t>
+      </w:r>
+      <w:r>
+        <w:rPr>
+          <w:rFonts w:ascii="Times New Roman" w:hAnsi="Times New Roman" w:cs="Times New Roman"/>
+          <w:bCs/>
+          <w:sz w:val="26"/>
+          <w:szCs w:val="26"/>
+        </w:rPr>
+        <w:t>hân viên thông báo kết quả hủy lịch cho bệnh nhân.</w:t>
+      </w:r>
+    </w:p>
+    <w:p>
+      <w:pPr>
+        <w:pStyle w:val="ListParagraph"/>
+        <w:ind w:left="1080"/>
+        <w:rPr>
+          <w:rFonts w:ascii="Times New Roman" w:hAnsi="Times New Roman" w:cs="Times New Roman"/>
+          <w:b/>
+          <w:sz w:val="26"/>
+          <w:szCs w:val="26"/>
+          <w:lang w:val="vi-VN"/>
+        </w:rPr>
+      </w:pPr>
+    </w:p>
+    <w:p>
+      <w:pPr>
+        <w:pStyle w:val="ListParagraph"/>
+        <w:ind w:left="1080"/>
+        <w:rPr>
+          <w:rFonts w:ascii="Times New Roman" w:hAnsi="Times New Roman" w:cs="Times New Roman"/>
+          <w:bCs/>
+          <w:sz w:val="26"/>
+          <w:szCs w:val="26"/>
+        </w:rPr>
+      </w:pPr>
+      <w:r>
+        <w:rPr>
+          <w:rFonts w:ascii="Times New Roman" w:hAnsi="Times New Roman" w:cs="Times New Roman"/>
+          <w:b/>
+          <w:sz w:val="26"/>
+          <w:szCs w:val="26"/>
+        </w:rPr>
+        <w:t>Kết thúc</w:t>
       </w:r>
       <w:r>
         <w:rPr>
@@ -3421,99 +3137,6 @@
         </w:rPr>
         <w:t xml:space="preserve"> :</w:t>
       </w:r>
-      <w:proofErr w:type="gramEnd"/>
-      <w:r>
-        <w:rPr>
-          <w:rFonts w:ascii="Times New Roman" w:hAnsi="Times New Roman" w:cs="Times New Roman"/>
-          <w:b/>
-          <w:sz w:val="26"/>
-          <w:szCs w:val="26"/>
-          <w:lang w:val="vi-VN"/>
-        </w:rPr>
-        <w:t xml:space="preserve"> </w:t>
-      </w:r>
-      <w:r>
-        <w:rPr>
-          <w:rFonts w:ascii="Times New Roman" w:hAnsi="Times New Roman" w:cs="Times New Roman"/>
-          <w:b/>
-          <w:sz w:val="26"/>
-          <w:szCs w:val="26"/>
-        </w:rPr>
-        <w:t xml:space="preserve"> </w:t>
-      </w:r>
-      <w:r>
-        <w:rPr>
-          <w:rFonts w:ascii="Times New Roman" w:hAnsi="Times New Roman" w:cs="Times New Roman"/>
-          <w:bCs/>
-          <w:sz w:val="26"/>
-          <w:szCs w:val="26"/>
-        </w:rPr>
-        <w:t>N</w:t>
-      </w:r>
-      <w:r>
-        <w:rPr>
-          <w:rFonts w:ascii="Times New Roman" w:hAnsi="Times New Roman" w:cs="Times New Roman"/>
-          <w:bCs/>
-          <w:sz w:val="26"/>
-          <w:szCs w:val="26"/>
-        </w:rPr>
-        <w:t>hân viên thông báo kết quả hủy lịch cho bệnh nhân.</w:t>
-      </w:r>
-    </w:p>
-    <w:p>
-      <w:pPr>
-        <w:pStyle w:val="ListParagraph"/>
-        <w:ind w:left="1080"/>
-        <w:rPr>
-          <w:rFonts w:ascii="Times New Roman" w:hAnsi="Times New Roman" w:cs="Times New Roman"/>
-          <w:b/>
-          <w:sz w:val="26"/>
-          <w:szCs w:val="26"/>
-          <w:lang w:val="vi-VN"/>
-        </w:rPr>
-      </w:pPr>
-    </w:p>
-    <w:p>
-      <w:pPr>
-        <w:pStyle w:val="ListParagraph"/>
-        <w:ind w:left="1080"/>
-        <w:rPr>
-          <w:rFonts w:ascii="Times New Roman" w:hAnsi="Times New Roman" w:cs="Times New Roman"/>
-          <w:bCs/>
-          <w:sz w:val="26"/>
-          <w:szCs w:val="26"/>
-        </w:rPr>
-      </w:pPr>
-      <w:r>
-        <w:rPr>
-          <w:rFonts w:ascii="Times New Roman" w:hAnsi="Times New Roman" w:cs="Times New Roman"/>
-          <w:b/>
-          <w:sz w:val="26"/>
-          <w:szCs w:val="26"/>
-        </w:rPr>
-        <w:t xml:space="preserve">Kết </w:t>
-      </w:r>
-      <w:proofErr w:type="gramStart"/>
-      <w:r>
-        <w:rPr>
-          <w:rFonts w:ascii="Times New Roman" w:hAnsi="Times New Roman" w:cs="Times New Roman"/>
-          <w:b/>
-          <w:sz w:val="26"/>
-          <w:szCs w:val="26"/>
-        </w:rPr>
-        <w:t>thúc</w:t>
-      </w:r>
-      <w:r>
-        <w:rPr>
-          <w:rFonts w:ascii="Times New Roman" w:hAnsi="Times New Roman" w:cs="Times New Roman"/>
-          <w:b/>
-          <w:sz w:val="26"/>
-          <w:szCs w:val="26"/>
-          <w:lang w:val="vi-VN"/>
-        </w:rPr>
-        <w:t xml:space="preserve"> :</w:t>
-      </w:r>
-      <w:proofErr w:type="gramEnd"/>
       <w:r>
         <w:rPr>
           <w:rFonts w:ascii="Times New Roman" w:hAnsi="Times New Roman" w:cs="Times New Roman"/>
@@ -3635,18 +3258,7 @@
           <w:sz w:val="26"/>
           <w:szCs w:val="26"/>
         </w:rPr>
-        <w:t xml:space="preserve">Bước </w:t>
-      </w:r>
-      <w:proofErr w:type="gramStart"/>
-      <w:r>
-        <w:rPr>
-          <w:rFonts w:ascii="Times New Roman" w:hAnsi="Times New Roman" w:cs="Times New Roman"/>
-          <w:b/>
-          <w:bCs/>
-          <w:sz w:val="26"/>
-          <w:szCs w:val="26"/>
-        </w:rPr>
-        <w:t>1</w:t>
+        <w:t>Bước 1</w:t>
       </w:r>
       <w:r>
         <w:rPr>
@@ -3658,7 +3270,6 @@
         </w:rPr>
         <w:t xml:space="preserve"> :</w:t>
       </w:r>
-      <w:proofErr w:type="gramEnd"/>
       <w:r>
         <w:rPr>
           <w:rFonts w:ascii="Times New Roman" w:hAnsi="Times New Roman" w:cs="Times New Roman"/>
@@ -3729,18 +3340,7 @@
           <w:sz w:val="26"/>
           <w:szCs w:val="26"/>
         </w:rPr>
-        <w:t xml:space="preserve">Bước </w:t>
-      </w:r>
-      <w:proofErr w:type="gramStart"/>
-      <w:r>
-        <w:rPr>
-          <w:rFonts w:ascii="Times New Roman" w:hAnsi="Times New Roman" w:cs="Times New Roman"/>
-          <w:b/>
-          <w:bCs/>
-          <w:sz w:val="26"/>
-          <w:szCs w:val="26"/>
-        </w:rPr>
-        <w:t>2</w:t>
+        <w:t>Bước 2</w:t>
       </w:r>
       <w:r>
         <w:rPr>
@@ -3752,7 +3352,6 @@
         </w:rPr>
         <w:t xml:space="preserve"> :</w:t>
       </w:r>
-      <w:proofErr w:type="gramEnd"/>
       <w:r>
         <w:rPr>
           <w:rFonts w:ascii="Times New Roman" w:hAnsi="Times New Roman" w:cs="Times New Roman"/>
@@ -3814,18 +3413,7 @@
           <w:sz w:val="26"/>
           <w:szCs w:val="26"/>
         </w:rPr>
-        <w:t xml:space="preserve">Bước </w:t>
-      </w:r>
-      <w:proofErr w:type="gramStart"/>
-      <w:r>
-        <w:rPr>
-          <w:rFonts w:ascii="Times New Roman" w:hAnsi="Times New Roman" w:cs="Times New Roman"/>
-          <w:b/>
-          <w:bCs/>
-          <w:sz w:val="26"/>
-          <w:szCs w:val="26"/>
-        </w:rPr>
-        <w:t>3</w:t>
+        <w:t>Bước 3</w:t>
       </w:r>
       <w:r>
         <w:rPr>
@@ -3837,7 +3425,6 @@
         </w:rPr>
         <w:t xml:space="preserve"> :</w:t>
       </w:r>
-      <w:proofErr w:type="gramEnd"/>
       <w:r>
         <w:rPr>
           <w:rFonts w:ascii="Times New Roman" w:hAnsi="Times New Roman" w:cs="Times New Roman"/>
@@ -3908,18 +3495,7 @@
           <w:sz w:val="26"/>
           <w:szCs w:val="26"/>
         </w:rPr>
-        <w:t xml:space="preserve">Bước </w:t>
-      </w:r>
-      <w:proofErr w:type="gramStart"/>
-      <w:r>
-        <w:rPr>
-          <w:rFonts w:ascii="Times New Roman" w:hAnsi="Times New Roman" w:cs="Times New Roman"/>
-          <w:b/>
-          <w:bCs/>
-          <w:sz w:val="26"/>
-          <w:szCs w:val="26"/>
-        </w:rPr>
-        <w:t>4</w:t>
+        <w:t>Bước 4</w:t>
       </w:r>
       <w:r>
         <w:rPr>
@@ -3931,7 +3507,6 @@
         </w:rPr>
         <w:t xml:space="preserve"> :</w:t>
       </w:r>
-      <w:proofErr w:type="gramEnd"/>
       <w:r>
         <w:rPr>
           <w:rFonts w:ascii="Times New Roman" w:hAnsi="Times New Roman" w:cs="Times New Roman"/>
@@ -4002,18 +3577,7 @@
           <w:sz w:val="26"/>
           <w:szCs w:val="26"/>
         </w:rPr>
-        <w:t xml:space="preserve">Bước </w:t>
-      </w:r>
-      <w:proofErr w:type="gramStart"/>
-      <w:r>
-        <w:rPr>
-          <w:rFonts w:ascii="Times New Roman" w:hAnsi="Times New Roman" w:cs="Times New Roman"/>
-          <w:b/>
-          <w:bCs/>
-          <w:sz w:val="26"/>
-          <w:szCs w:val="26"/>
-        </w:rPr>
-        <w:t>5</w:t>
+        <w:t>Bước 5</w:t>
       </w:r>
       <w:r>
         <w:rPr>
@@ -4025,7 +3589,6 @@
         </w:rPr>
         <w:t xml:space="preserve"> :</w:t>
       </w:r>
-      <w:proofErr w:type="gramEnd"/>
       <w:r>
         <w:rPr>
           <w:rFonts w:ascii="Times New Roman" w:hAnsi="Times New Roman" w:cs="Times New Roman"/>
@@ -4086,17 +3649,7 @@
           <w:sz w:val="26"/>
           <w:szCs w:val="26"/>
         </w:rPr>
-        <w:t xml:space="preserve">Kết </w:t>
-      </w:r>
-      <w:proofErr w:type="gramStart"/>
-      <w:r>
-        <w:rPr>
-          <w:rFonts w:ascii="Times New Roman" w:hAnsi="Times New Roman" w:cs="Times New Roman"/>
-          <w:b/>
-          <w:sz w:val="26"/>
-          <w:szCs w:val="26"/>
-        </w:rPr>
-        <w:t>thúc</w:t>
+        <w:t>Kết thúc</w:t>
       </w:r>
       <w:r>
         <w:rPr>
@@ -4108,7 +3661,6 @@
         </w:rPr>
         <w:t xml:space="preserve"> :</w:t>
       </w:r>
-      <w:proofErr w:type="gramEnd"/>
       <w:r>
         <w:rPr>
           <w:rFonts w:ascii="Times New Roman" w:hAnsi="Times New Roman" w:cs="Times New Roman"/>
@@ -4190,18 +3742,71 @@
           <w:sz w:val="26"/>
           <w:szCs w:val="26"/>
         </w:rPr>
-        <w:t xml:space="preserve">Bước </w:t>
-      </w:r>
-      <w:proofErr w:type="gramStart"/>
-      <w:r>
-        <w:rPr>
-          <w:rFonts w:ascii="Times New Roman" w:hAnsi="Times New Roman" w:cs="Times New Roman"/>
-          <w:b/>
-          <w:bCs/>
-          <w:sz w:val="26"/>
-          <w:szCs w:val="26"/>
-        </w:rPr>
-        <w:t>1</w:t>
+        <w:t>Bước 1</w:t>
+      </w:r>
+      <w:r>
+        <w:rPr>
+          <w:rFonts w:ascii="Times New Roman" w:hAnsi="Times New Roman" w:cs="Times New Roman"/>
+          <w:b/>
+          <w:sz w:val="26"/>
+          <w:szCs w:val="26"/>
+          <w:lang w:val="vi-VN"/>
+        </w:rPr>
+        <w:t xml:space="preserve"> : </w:t>
+      </w:r>
+      <w:r>
+        <w:rPr>
+          <w:rFonts w:ascii="Times New Roman" w:hAnsi="Times New Roman" w:cs="Times New Roman"/>
+          <w:bCs/>
+          <w:sz w:val="26"/>
+          <w:szCs w:val="26"/>
+        </w:rPr>
+        <w:t>nhân viên kiểm tra lại thông tin cá nhân và hồ sơ của bệnh nhân.</w:t>
+      </w:r>
+      <w:r>
+        <w:rPr>
+          <w:rFonts w:ascii="Times New Roman" w:hAnsi="Times New Roman" w:cs="Times New Roman"/>
+          <w:b/>
+          <w:sz w:val="26"/>
+          <w:szCs w:val="26"/>
+        </w:rPr>
+        <w:t xml:space="preserve"> </w:t>
+      </w:r>
+    </w:p>
+    <w:p>
+      <w:pPr>
+        <w:pStyle w:val="ListParagraph"/>
+        <w:ind w:left="1080"/>
+        <w:rPr>
+          <w:rFonts w:ascii="Times New Roman" w:hAnsi="Times New Roman" w:cs="Times New Roman"/>
+          <w:b/>
+          <w:sz w:val="26"/>
+          <w:szCs w:val="26"/>
+          <w:lang w:val="vi-VN"/>
+        </w:rPr>
+      </w:pPr>
+    </w:p>
+    <w:p>
+      <w:pPr>
+        <w:pStyle w:val="ListParagraph"/>
+        <w:ind w:left="1080"/>
+        <w:rPr>
+          <w:rFonts w:ascii="Times New Roman" w:hAnsi="Times New Roman" w:cs="Times New Roman"/>
+          <w:b/>
+          <w:sz w:val="26"/>
+          <w:szCs w:val="26"/>
+          <w:lang w:val="vi-VN"/>
+        </w:rPr>
+      </w:pPr>
+      <w:r>
+        <w:rPr>
+          <w:rFonts w:ascii="Times New Roman" w:hAnsi="Times New Roman" w:cs="Times New Roman"/>
+          <w:b/>
+          <w:bCs/>
+          <w:sz w:val="26"/>
+          <w:szCs w:val="26"/>
+        </w:rPr>
+        <w:t>Bước 2</w:t>
       </w:r>
       <w:r>
         <w:rPr>
@@ -4213,14 +3818,12 @@
         </w:rPr>
         <w:t xml:space="preserve"> :</w:t>
       </w:r>
-      <w:proofErr w:type="gramEnd"/>
-      <w:r>
-        <w:rPr>
-          <w:rFonts w:ascii="Times New Roman" w:hAnsi="Times New Roman" w:cs="Times New Roman"/>
-          <w:b/>
-          <w:sz w:val="26"/>
-          <w:szCs w:val="26"/>
-          <w:lang w:val="vi-VN"/>
+      <w:r>
+        <w:rPr>
+          <w:rFonts w:ascii="Times New Roman" w:hAnsi="Times New Roman" w:cs="Times New Roman"/>
+          <w:b/>
+          <w:sz w:val="26"/>
+          <w:szCs w:val="26"/>
         </w:rPr>
         <w:t xml:space="preserve"> </w:t>
       </w:r>
@@ -4231,7 +3834,16 @@
           <w:sz w:val="26"/>
           <w:szCs w:val="26"/>
         </w:rPr>
-        <w:t>nhân viên kiểm tra lại thông tin cá nhân và hồ sơ của bệnh nhân.</w:t>
+        <w:t>N</w:t>
+      </w:r>
+      <w:r>
+        <w:rPr>
+          <w:rFonts w:ascii="Times New Roman" w:hAnsi="Times New Roman" w:cs="Times New Roman"/>
+          <w:bCs/>
+          <w:sz w:val="26"/>
+          <w:szCs w:val="26"/>
+        </w:rPr>
+        <w:t>hân viên xác định bác sĩ, phòng khám và nội dung khám theo lịch hẹn.</w:t>
       </w:r>
       <w:r>
         <w:rPr>
@@ -4262,32 +3874,21 @@
         <w:ind w:left="1080"/>
         <w:rPr>
           <w:rFonts w:ascii="Times New Roman" w:hAnsi="Times New Roman" w:cs="Times New Roman"/>
-          <w:b/>
-          <w:sz w:val="26"/>
-          <w:szCs w:val="26"/>
-          <w:lang w:val="vi-VN"/>
-        </w:rPr>
-      </w:pPr>
-      <w:r>
-        <w:rPr>
-          <w:rFonts w:ascii="Times New Roman" w:hAnsi="Times New Roman" w:cs="Times New Roman"/>
-          <w:b/>
-          <w:bCs/>
-          <w:sz w:val="26"/>
-          <w:szCs w:val="26"/>
-        </w:rPr>
-        <w:t xml:space="preserve">Bước </w:t>
-      </w:r>
-      <w:proofErr w:type="gramStart"/>
-      <w:r>
-        <w:rPr>
-          <w:rFonts w:ascii="Times New Roman" w:hAnsi="Times New Roman" w:cs="Times New Roman"/>
-          <w:b/>
-          <w:bCs/>
-          <w:sz w:val="26"/>
-          <w:szCs w:val="26"/>
-        </w:rPr>
-        <w:t>2</w:t>
+          <w:bCs/>
+          <w:sz w:val="26"/>
+          <w:szCs w:val="26"/>
+          <w:lang w:val="vi-VN"/>
+        </w:rPr>
+      </w:pPr>
+      <w:r>
+        <w:rPr>
+          <w:rFonts w:ascii="Times New Roman" w:hAnsi="Times New Roman" w:cs="Times New Roman"/>
+          <w:b/>
+          <w:bCs/>
+          <w:sz w:val="26"/>
+          <w:szCs w:val="26"/>
+        </w:rPr>
+        <w:t>Bước 3</w:t>
       </w:r>
       <w:r>
         <w:rPr>
@@ -4299,7 +3900,6 @@
         </w:rPr>
         <w:t xml:space="preserve"> :</w:t>
       </w:r>
-      <w:proofErr w:type="gramEnd"/>
       <w:r>
         <w:rPr>
           <w:rFonts w:ascii="Times New Roman" w:hAnsi="Times New Roman" w:cs="Times New Roman"/>
@@ -4325,7 +3925,53 @@
           <w:sz w:val="26"/>
           <w:szCs w:val="26"/>
         </w:rPr>
-        <w:t>hân viên xác định bác sĩ, phòng khám và nội dung khám theo lịch hẹn.</w:t>
+        <w:t xml:space="preserve">hân viên cập nhật trạng thái bệnh nhân sang đang chờ khám hoặc đang được tiếp nhận. </w:t>
+      </w:r>
+    </w:p>
+    <w:p>
+      <w:pPr>
+        <w:pStyle w:val="ListParagraph"/>
+        <w:ind w:left="1080"/>
+        <w:rPr>
+          <w:rFonts w:ascii="Times New Roman" w:hAnsi="Times New Roman" w:cs="Times New Roman"/>
+          <w:bCs/>
+          <w:sz w:val="26"/>
+          <w:szCs w:val="26"/>
+          <w:lang w:val="vi-VN"/>
+        </w:rPr>
+      </w:pPr>
+    </w:p>
+    <w:p>
+      <w:pPr>
+        <w:pStyle w:val="ListParagraph"/>
+        <w:ind w:left="1080"/>
+        <w:rPr>
+          <w:rFonts w:ascii="Times New Roman" w:hAnsi="Times New Roman" w:cs="Times New Roman"/>
+          <w:b/>
+          <w:sz w:val="26"/>
+          <w:szCs w:val="26"/>
+          <w:lang w:val="vi-VN"/>
+        </w:rPr>
+      </w:pPr>
+      <w:r>
+        <w:rPr>
+          <w:rFonts w:ascii="Times New Roman" w:hAnsi="Times New Roman" w:cs="Times New Roman"/>
+          <w:b/>
+          <w:bCs/>
+          <w:sz w:val="26"/>
+          <w:szCs w:val="26"/>
+        </w:rPr>
+        <w:t>Bước 4</w:t>
+      </w:r>
+      <w:r>
+        <w:rPr>
+          <w:rFonts w:ascii="Times New Roman" w:hAnsi="Times New Roman" w:cs="Times New Roman"/>
+          <w:b/>
+          <w:sz w:val="26"/>
+          <w:szCs w:val="26"/>
+          <w:lang w:val="vi-VN"/>
+        </w:rPr>
+        <w:t xml:space="preserve"> :</w:t>
       </w:r>
       <w:r>
         <w:rPr>
@@ -4336,52 +3982,69 @@
         </w:rPr>
         <w:t xml:space="preserve"> </w:t>
       </w:r>
-    </w:p>
-    <w:p>
-      <w:pPr>
-        <w:pStyle w:val="ListParagraph"/>
-        <w:ind w:left="1080"/>
-        <w:rPr>
-          <w:rFonts w:ascii="Times New Roman" w:hAnsi="Times New Roman" w:cs="Times New Roman"/>
-          <w:b/>
-          <w:sz w:val="26"/>
-          <w:szCs w:val="26"/>
-          <w:lang w:val="vi-VN"/>
-        </w:rPr>
-      </w:pPr>
-    </w:p>
-    <w:p>
-      <w:pPr>
-        <w:pStyle w:val="ListParagraph"/>
-        <w:ind w:left="1080"/>
-        <w:rPr>
-          <w:rFonts w:ascii="Times New Roman" w:hAnsi="Times New Roman" w:cs="Times New Roman"/>
-          <w:bCs/>
-          <w:sz w:val="26"/>
-          <w:szCs w:val="26"/>
-          <w:lang w:val="vi-VN"/>
-        </w:rPr>
-      </w:pPr>
-      <w:r>
-        <w:rPr>
-          <w:rFonts w:ascii="Times New Roman" w:hAnsi="Times New Roman" w:cs="Times New Roman"/>
-          <w:b/>
-          <w:bCs/>
-          <w:sz w:val="26"/>
-          <w:szCs w:val="26"/>
-        </w:rPr>
-        <w:t xml:space="preserve">Bước </w:t>
-      </w:r>
-      <w:proofErr w:type="gramStart"/>
-      <w:r>
-        <w:rPr>
-          <w:rFonts w:ascii="Times New Roman" w:hAnsi="Times New Roman" w:cs="Times New Roman"/>
-          <w:b/>
-          <w:bCs/>
-          <w:sz w:val="26"/>
-          <w:szCs w:val="26"/>
-        </w:rPr>
-        <w:t>3</w:t>
+      <w:r>
+        <w:rPr>
+          <w:rFonts w:ascii="Times New Roman" w:hAnsi="Times New Roman" w:cs="Times New Roman"/>
+          <w:bCs/>
+          <w:sz w:val="26"/>
+          <w:szCs w:val="26"/>
+        </w:rPr>
+        <w:t>N</w:t>
+      </w:r>
+      <w:r>
+        <w:rPr>
+          <w:rFonts w:ascii="Times New Roman" w:hAnsi="Times New Roman" w:cs="Times New Roman"/>
+          <w:bCs/>
+          <w:sz w:val="26"/>
+          <w:szCs w:val="26"/>
+        </w:rPr>
+        <w:t>hân viên hướng dẫn bệnh nhân đến đúng khu vực và thông báo cho bác sĩ về bệnh nhân tiếp theo.</w:t>
+      </w:r>
+      <w:r>
+        <w:rPr>
+          <w:rFonts w:ascii="Times New Roman" w:hAnsi="Times New Roman" w:cs="Times New Roman"/>
+          <w:b/>
+          <w:sz w:val="26"/>
+          <w:szCs w:val="26"/>
+        </w:rPr>
+        <w:t xml:space="preserve"> </w:t>
+      </w:r>
+    </w:p>
+    <w:p>
+      <w:pPr>
+        <w:pStyle w:val="ListParagraph"/>
+        <w:ind w:left="1080"/>
+        <w:rPr>
+          <w:rFonts w:ascii="Times New Roman" w:hAnsi="Times New Roman" w:cs="Times New Roman"/>
+          <w:b/>
+          <w:sz w:val="26"/>
+          <w:szCs w:val="26"/>
+          <w:lang w:val="vi-VN"/>
+        </w:rPr>
+      </w:pPr>
+    </w:p>
+    <w:p>
+      <w:pPr>
+        <w:pStyle w:val="ListParagraph"/>
+        <w:ind w:left="1080"/>
+        <w:rPr>
+          <w:rFonts w:ascii="Times New Roman" w:hAnsi="Times New Roman" w:cs="Times New Roman"/>
+          <w:bCs/>
+          <w:sz w:val="26"/>
+          <w:szCs w:val="26"/>
+          <w:lang w:val="vi-VN"/>
+        </w:rPr>
+      </w:pPr>
+      <w:r>
+        <w:rPr>
+          <w:rFonts w:ascii="Times New Roman" w:hAnsi="Times New Roman" w:cs="Times New Roman"/>
+          <w:b/>
+          <w:bCs/>
+          <w:sz w:val="26"/>
+          <w:szCs w:val="26"/>
+        </w:rPr>
+        <w:lastRenderedPageBreak/>
+        <w:t>Bước 5</w:t>
       </w:r>
       <w:r>
         <w:rPr>
@@ -4393,7 +4056,6 @@
         </w:rPr>
         <w:t xml:space="preserve"> :</w:t>
       </w:r>
-      <w:proofErr w:type="gramEnd"/>
       <w:r>
         <w:rPr>
           <w:rFonts w:ascii="Times New Roman" w:hAnsi="Times New Roman" w:cs="Times New Roman"/>
@@ -4410,63 +4072,42 @@
           <w:sz w:val="26"/>
           <w:szCs w:val="26"/>
         </w:rPr>
-        <w:t>N</w:t>
-      </w:r>
-      <w:r>
-        <w:rPr>
-          <w:rFonts w:ascii="Times New Roman" w:hAnsi="Times New Roman" w:cs="Times New Roman"/>
-          <w:bCs/>
-          <w:sz w:val="26"/>
-          <w:szCs w:val="26"/>
-        </w:rPr>
-        <w:t xml:space="preserve">hân viên cập nhật trạng thái bệnh nhân sang đang chờ khám hoặc đang được tiếp nhận. </w:t>
-      </w:r>
-    </w:p>
-    <w:p>
-      <w:pPr>
-        <w:pStyle w:val="ListParagraph"/>
-        <w:ind w:left="1080"/>
-        <w:rPr>
-          <w:rFonts w:ascii="Times New Roman" w:hAnsi="Times New Roman" w:cs="Times New Roman"/>
-          <w:bCs/>
-          <w:sz w:val="26"/>
-          <w:szCs w:val="26"/>
-          <w:lang w:val="vi-VN"/>
-        </w:rPr>
-      </w:pPr>
-    </w:p>
-    <w:p>
-      <w:pPr>
-        <w:pStyle w:val="ListParagraph"/>
-        <w:ind w:left="1080"/>
-        <w:rPr>
-          <w:rFonts w:ascii="Times New Roman" w:hAnsi="Times New Roman" w:cs="Times New Roman"/>
-          <w:b/>
-          <w:sz w:val="26"/>
-          <w:szCs w:val="26"/>
-          <w:lang w:val="vi-VN"/>
-        </w:rPr>
-      </w:pPr>
-      <w:r>
-        <w:rPr>
-          <w:rFonts w:ascii="Times New Roman" w:hAnsi="Times New Roman" w:cs="Times New Roman"/>
-          <w:b/>
-          <w:bCs/>
-          <w:sz w:val="26"/>
-          <w:szCs w:val="26"/>
-        </w:rPr>
-        <w:t xml:space="preserve">Bước </w:t>
-      </w:r>
-      <w:proofErr w:type="gramStart"/>
-      <w:r>
-        <w:rPr>
-          <w:rFonts w:ascii="Times New Roman" w:hAnsi="Times New Roman" w:cs="Times New Roman"/>
-          <w:b/>
-          <w:bCs/>
-          <w:sz w:val="26"/>
-          <w:szCs w:val="26"/>
-        </w:rPr>
-        <w:t>4</w:t>
+        <w:t>bác sĩ hoặc nhân viên xác nhận bệnh nhân đã được tiếp nhận để bắt đầu quá trình khám.</w:t>
+      </w:r>
+    </w:p>
+    <w:p>
+      <w:pPr>
+        <w:pStyle w:val="ListParagraph"/>
+        <w:ind w:left="1080"/>
+        <w:rPr>
+          <w:rFonts w:ascii="Times New Roman" w:hAnsi="Times New Roman" w:cs="Times New Roman"/>
+          <w:b/>
+          <w:sz w:val="26"/>
+          <w:szCs w:val="26"/>
+          <w:lang w:val="vi-VN"/>
+        </w:rPr>
+      </w:pPr>
+    </w:p>
+    <w:p>
+      <w:pPr>
+        <w:pStyle w:val="ListParagraph"/>
+        <w:ind w:left="1080"/>
+        <w:rPr>
+          <w:rFonts w:ascii="Times New Roman" w:hAnsi="Times New Roman" w:cs="Times New Roman"/>
+          <w:bCs/>
+          <w:sz w:val="26"/>
+          <w:szCs w:val="26"/>
+          <w:lang w:val="vi-VN"/>
+        </w:rPr>
+      </w:pPr>
+      <w:r>
+        <w:rPr>
+          <w:rFonts w:ascii="Times New Roman" w:hAnsi="Times New Roman" w:cs="Times New Roman"/>
+          <w:b/>
+          <w:sz w:val="26"/>
+          <w:szCs w:val="26"/>
+        </w:rPr>
+        <w:t>Kết thúc</w:t>
       </w:r>
       <w:r>
         <w:rPr>
@@ -4478,175 +4119,6 @@
         </w:rPr>
         <w:t xml:space="preserve"> :</w:t>
       </w:r>
-      <w:proofErr w:type="gramEnd"/>
-      <w:r>
-        <w:rPr>
-          <w:rFonts w:ascii="Times New Roman" w:hAnsi="Times New Roman" w:cs="Times New Roman"/>
-          <w:b/>
-          <w:sz w:val="26"/>
-          <w:szCs w:val="26"/>
-        </w:rPr>
-        <w:t xml:space="preserve"> </w:t>
-      </w:r>
-      <w:r>
-        <w:rPr>
-          <w:rFonts w:ascii="Times New Roman" w:hAnsi="Times New Roman" w:cs="Times New Roman"/>
-          <w:bCs/>
-          <w:sz w:val="26"/>
-          <w:szCs w:val="26"/>
-        </w:rPr>
-        <w:t>N</w:t>
-      </w:r>
-      <w:r>
-        <w:rPr>
-          <w:rFonts w:ascii="Times New Roman" w:hAnsi="Times New Roman" w:cs="Times New Roman"/>
-          <w:bCs/>
-          <w:sz w:val="26"/>
-          <w:szCs w:val="26"/>
-        </w:rPr>
-        <w:t>hân viên hướng dẫn bệnh nhân đến đúng khu vực và thông báo cho bác sĩ về bệnh nhân tiếp theo.</w:t>
-      </w:r>
-      <w:r>
-        <w:rPr>
-          <w:rFonts w:ascii="Times New Roman" w:hAnsi="Times New Roman" w:cs="Times New Roman"/>
-          <w:b/>
-          <w:sz w:val="26"/>
-          <w:szCs w:val="26"/>
-        </w:rPr>
-        <w:t xml:space="preserve"> </w:t>
-      </w:r>
-    </w:p>
-    <w:p>
-      <w:pPr>
-        <w:pStyle w:val="ListParagraph"/>
-        <w:ind w:left="1080"/>
-        <w:rPr>
-          <w:rFonts w:ascii="Times New Roman" w:hAnsi="Times New Roman" w:cs="Times New Roman"/>
-          <w:b/>
-          <w:sz w:val="26"/>
-          <w:szCs w:val="26"/>
-          <w:lang w:val="vi-VN"/>
-        </w:rPr>
-      </w:pPr>
-    </w:p>
-    <w:p>
-      <w:pPr>
-        <w:pStyle w:val="ListParagraph"/>
-        <w:ind w:left="1080"/>
-        <w:rPr>
-          <w:rFonts w:ascii="Times New Roman" w:hAnsi="Times New Roman" w:cs="Times New Roman"/>
-          <w:bCs/>
-          <w:sz w:val="26"/>
-          <w:szCs w:val="26"/>
-          <w:lang w:val="vi-VN"/>
-        </w:rPr>
-      </w:pPr>
-      <w:r>
-        <w:rPr>
-          <w:rFonts w:ascii="Times New Roman" w:hAnsi="Times New Roman" w:cs="Times New Roman"/>
-          <w:b/>
-          <w:bCs/>
-          <w:sz w:val="26"/>
-          <w:szCs w:val="26"/>
-        </w:rPr>
-        <w:t xml:space="preserve">Bước </w:t>
-      </w:r>
-      <w:proofErr w:type="gramStart"/>
-      <w:r>
-        <w:rPr>
-          <w:rFonts w:ascii="Times New Roman" w:hAnsi="Times New Roman" w:cs="Times New Roman"/>
-          <w:b/>
-          <w:bCs/>
-          <w:sz w:val="26"/>
-          <w:szCs w:val="26"/>
-        </w:rPr>
-        <w:t>5</w:t>
-      </w:r>
-      <w:r>
-        <w:rPr>
-          <w:rFonts w:ascii="Times New Roman" w:hAnsi="Times New Roman" w:cs="Times New Roman"/>
-          <w:b/>
-          <w:sz w:val="26"/>
-          <w:szCs w:val="26"/>
-          <w:lang w:val="vi-VN"/>
-        </w:rPr>
-        <w:t xml:space="preserve"> :</w:t>
-      </w:r>
-      <w:proofErr w:type="gramEnd"/>
-      <w:r>
-        <w:rPr>
-          <w:rFonts w:ascii="Times New Roman" w:hAnsi="Times New Roman" w:cs="Times New Roman"/>
-          <w:b/>
-          <w:sz w:val="26"/>
-          <w:szCs w:val="26"/>
-        </w:rPr>
-        <w:t xml:space="preserve"> </w:t>
-      </w:r>
-      <w:r>
-        <w:rPr>
-          <w:rFonts w:ascii="Times New Roman" w:hAnsi="Times New Roman" w:cs="Times New Roman"/>
-          <w:bCs/>
-          <w:sz w:val="26"/>
-          <w:szCs w:val="26"/>
-        </w:rPr>
-        <w:t>bác sĩ hoặc nhân viên xác nhận bệnh nhân đã được tiếp nhận để bắt đầu quá trình khám.</w:t>
-      </w:r>
-    </w:p>
-    <w:p>
-      <w:pPr>
-        <w:pStyle w:val="ListParagraph"/>
-        <w:ind w:left="1080"/>
-        <w:rPr>
-          <w:rFonts w:ascii="Times New Roman" w:hAnsi="Times New Roman" w:cs="Times New Roman"/>
-          <w:b/>
-          <w:sz w:val="26"/>
-          <w:szCs w:val="26"/>
-          <w:lang w:val="vi-VN"/>
-        </w:rPr>
-      </w:pPr>
-    </w:p>
-    <w:p>
-      <w:pPr>
-        <w:pStyle w:val="ListParagraph"/>
-        <w:ind w:left="1080"/>
-        <w:rPr>
-          <w:rFonts w:ascii="Times New Roman" w:hAnsi="Times New Roman" w:cs="Times New Roman"/>
-          <w:bCs/>
-          <w:sz w:val="26"/>
-          <w:szCs w:val="26"/>
-          <w:lang w:val="vi-VN"/>
-        </w:rPr>
-      </w:pPr>
-      <w:r>
-        <w:rPr>
-          <w:rFonts w:ascii="Times New Roman" w:hAnsi="Times New Roman" w:cs="Times New Roman"/>
-          <w:b/>
-          <w:sz w:val="26"/>
-          <w:szCs w:val="26"/>
-        </w:rPr>
-        <w:t xml:space="preserve">Kết </w:t>
-      </w:r>
-      <w:proofErr w:type="gramStart"/>
-      <w:r>
-        <w:rPr>
-          <w:rFonts w:ascii="Times New Roman" w:hAnsi="Times New Roman" w:cs="Times New Roman"/>
-          <w:b/>
-          <w:sz w:val="26"/>
-          <w:szCs w:val="26"/>
-        </w:rPr>
-        <w:t>thúc</w:t>
-      </w:r>
-      <w:r>
-        <w:rPr>
-          <w:rFonts w:ascii="Times New Roman" w:hAnsi="Times New Roman" w:cs="Times New Roman"/>
-          <w:b/>
-          <w:sz w:val="26"/>
-          <w:szCs w:val="26"/>
-          <w:lang w:val="vi-VN"/>
-        </w:rPr>
-        <w:t xml:space="preserve"> :</w:t>
-      </w:r>
-      <w:proofErr w:type="gramEnd"/>
       <w:r>
         <w:rPr>
           <w:rFonts w:ascii="Times New Roman" w:hAnsi="Times New Roman" w:cs="Times New Roman"/>
@@ -4760,7 +4232,6 @@
         </w:rPr>
         <w:t xml:space="preserve"> </w:t>
       </w:r>
-      <w:proofErr w:type="gramStart"/>
       <w:r>
         <w:rPr>
           <w:rFonts w:ascii="Times New Roman" w:hAnsi="Times New Roman" w:cs="Times New Roman"/>
@@ -4796,17 +4267,7 @@
           <w:sz w:val="26"/>
           <w:szCs w:val="26"/>
         </w:rPr>
-        <w:t>ề</w:t>
-      </w:r>
-      <w:proofErr w:type="gramEnd"/>
-      <w:r>
-        <w:rPr>
-          <w:rFonts w:ascii="Times New Roman" w:hAnsi="Times New Roman" w:cs="Times New Roman"/>
-          <w:b/>
-          <w:sz w:val="26"/>
-          <w:szCs w:val="26"/>
-        </w:rPr>
-        <w:t xml:space="preserve"> đặt lịch khám:</w:t>
+        <w:t>ề đặt lịch khám:</w:t>
       </w:r>
     </w:p>
     <w:p>
@@ -4881,7 +4342,6 @@
         </w:rPr>
         <w:t xml:space="preserve"> </w:t>
       </w:r>
-      <w:proofErr w:type="gramStart"/>
       <w:r>
         <w:rPr>
           <w:rFonts w:ascii="Times New Roman" w:hAnsi="Times New Roman" w:cs="Times New Roman"/>
@@ -4901,7 +4361,6 @@
         </w:rPr>
         <w:t xml:space="preserve"> :</w:t>
       </w:r>
-      <w:proofErr w:type="gramEnd"/>
       <w:r>
         <w:rPr>
           <w:rFonts w:ascii="Times New Roman" w:hAnsi="Times New Roman" w:cs="Times New Roman"/>
@@ -4927,17 +4386,7 @@
           <w:sz w:val="26"/>
           <w:szCs w:val="26"/>
         </w:rPr>
-        <w:t xml:space="preserve">ề thay đổi và hủy </w:t>
-      </w:r>
-      <w:proofErr w:type="gramStart"/>
-      <w:r>
-        <w:rPr>
-          <w:rFonts w:ascii="Times New Roman" w:hAnsi="Times New Roman" w:cs="Times New Roman"/>
-          <w:b/>
-          <w:sz w:val="26"/>
-          <w:szCs w:val="26"/>
-        </w:rPr>
-        <w:t>lịch</w:t>
+        <w:t>ề thay đổi và hủy lịch</w:t>
       </w:r>
       <w:r>
         <w:rPr>
@@ -4949,7 +4398,6 @@
         </w:rPr>
         <w:t xml:space="preserve"> :</w:t>
       </w:r>
-      <w:proofErr w:type="gramEnd"/>
     </w:p>
     <w:p>
       <w:pPr>
@@ -5013,7 +4461,6 @@
         </w:rPr>
         <w:t xml:space="preserve">Quy định </w:t>
       </w:r>
-      <w:proofErr w:type="gramStart"/>
       <w:r>
         <w:rPr>
           <w:rFonts w:ascii="Times New Roman" w:hAnsi="Times New Roman" w:cs="Times New Roman"/>
@@ -5031,18 +4478,7 @@
           <w:szCs w:val="26"/>
           <w:lang w:val="vi-VN"/>
         </w:rPr>
-        <w:t xml:space="preserve"> :</w:t>
-      </w:r>
-      <w:proofErr w:type="gramEnd"/>
-      <w:r>
-        <w:rPr>
-          <w:rFonts w:ascii="Times New Roman" w:hAnsi="Times New Roman" w:cs="Times New Roman"/>
-          <w:b/>
-          <w:sz w:val="26"/>
-          <w:szCs w:val="26"/>
-          <w:lang w:val="vi-VN"/>
-        </w:rPr>
-        <w:t xml:space="preserve"> </w:t>
+        <w:t xml:space="preserve"> : </w:t>
       </w:r>
       <w:r>
         <w:rPr>
@@ -5145,7 +4581,6 @@
         </w:rPr>
         <w:t xml:space="preserve">Quy định </w:t>
       </w:r>
-      <w:proofErr w:type="gramStart"/>
       <w:r>
         <w:rPr>
           <w:rFonts w:ascii="Times New Roman" w:hAnsi="Times New Roman" w:cs="Times New Roman"/>
@@ -5165,19 +4600,7 @@
           <w:szCs w:val="26"/>
           <w:lang w:val="vi-VN"/>
         </w:rPr>
-        <w:t xml:space="preserve"> :</w:t>
-      </w:r>
-      <w:proofErr w:type="gramEnd"/>
-      <w:r>
-        <w:rPr>
-          <w:rFonts w:ascii="Times New Roman" w:hAnsi="Times New Roman" w:cs="Times New Roman"/>
-          <w:b/>
-          <w:bCs/>
-          <w:sz w:val="26"/>
-          <w:szCs w:val="26"/>
-          <w:lang w:val="vi-VN"/>
-        </w:rPr>
-        <w:t xml:space="preserve"> V</w:t>
+        <w:t xml:space="preserve"> : V</w:t>
       </w:r>
       <w:r>
         <w:rPr>
@@ -5253,7 +4676,6 @@
         </w:rPr>
         <w:t xml:space="preserve">Quy định </w:t>
       </w:r>
-      <w:proofErr w:type="gramStart"/>
       <w:r>
         <w:rPr>
           <w:rFonts w:ascii="Times New Roman" w:hAnsi="Times New Roman" w:cs="Times New Roman"/>
@@ -5273,19 +4695,7 @@
           <w:szCs w:val="26"/>
           <w:lang w:val="vi-VN"/>
         </w:rPr>
-        <w:t xml:space="preserve"> :</w:t>
-      </w:r>
-      <w:proofErr w:type="gramEnd"/>
-      <w:r>
-        <w:rPr>
-          <w:rFonts w:ascii="Times New Roman" w:hAnsi="Times New Roman" w:cs="Times New Roman"/>
-          <w:b/>
-          <w:bCs/>
-          <w:sz w:val="26"/>
-          <w:szCs w:val="26"/>
-          <w:lang w:val="vi-VN"/>
-        </w:rPr>
-        <w:t xml:space="preserve"> </w:t>
+        <w:t xml:space="preserve"> : </w:t>
       </w:r>
       <w:r>
         <w:rPr>
@@ -5941,6 +5351,7 @@
                 <w:sz w:val="26"/>
                 <w:szCs w:val="26"/>
               </w:rPr>
+              <w:lastRenderedPageBreak/>
               <w:t>5.</w:t>
             </w:r>
           </w:p>
@@ -6028,7 +5439,6 @@
                 <w:sz w:val="26"/>
                 <w:szCs w:val="26"/>
               </w:rPr>
-              <w:lastRenderedPageBreak/>
               <w:t>6.</w:t>
             </w:r>
           </w:p>
@@ -8215,7 +7625,6 @@
   <w:style w:type="character" w:default="1" w:styleId="DefaultParagraphFont">
     <w:name w:val="Default Paragraph Font"/>
     <w:uiPriority w:val="1"/>
-    <w:semiHidden/>
     <w:unhideWhenUsed/>
   </w:style>
   <w:style w:type="table" w:default="1" w:styleId="TableNormal">

</xml_diff>

<commit_message>
update cau tra loi
</commit_message>
<xml_diff>
--- a/doc/05-NguyenKhacDuy.docx
+++ b/doc/05-NguyenKhacDuy.docx
@@ -5362,6 +5362,7 @@
         <w:rPr>
           <w:rFonts w:ascii="Times New Roman" w:hAnsi="Times New Roman" w:cs="Times New Roman"/>
           <w:b/>
+          <w:noProof/>
           <w:sz w:val="26"/>
           <w:szCs w:val="26"/>
         </w:rPr>
@@ -5670,6 +5671,25 @@
                 <w:rFonts w:ascii="Times New Roman" w:hAnsi="Times New Roman" w:cs="Times New Roman"/>
                 <w:sz w:val="26"/>
                 <w:szCs w:val="26"/>
+              </w:rPr>
+            </w:pPr>
+            <w:r>
+              <w:rPr>
+                <w:rFonts w:ascii="Times New Roman" w:hAnsi="Times New Roman" w:cs="Times New Roman"/>
+                <w:sz w:val="26"/>
+                <w:szCs w:val="26"/>
+              </w:rPr>
+              <w:t>Nhân viên cần kiểm tra thông tin bệnh nhân (họ tên, số điện thoại, nhu cầu khám), bác sĩ phù hợp, ngày và giờ khám còn trống, phòng khám và khả năng tiếp nhận. Đồng thời cần đảm bảo không trùng lịch với bác sĩ hoặc bệnh nhân trước khi tạo lịch hẹn.</w:t>
+            </w:r>
+          </w:p>
+          <w:p>
+            <w:pPr>
+              <w:spacing w:after="120"/>
+              <w:jc w:val="both"/>
+              <w:rPr>
+                <w:rFonts w:ascii="Times New Roman" w:hAnsi="Times New Roman" w:cs="Times New Roman"/>
+                <w:sz w:val="26"/>
+                <w:szCs w:val="26"/>
                 <w:lang w:val="vi-VN"/>
               </w:rPr>
             </w:pPr>
@@ -5760,6 +5780,14 @@
                 <w:szCs w:val="26"/>
               </w:rPr>
             </w:pPr>
+            <w:r>
+              <w:rPr>
+                <w:rFonts w:ascii="Times New Roman" w:hAnsi="Times New Roman" w:cs="Times New Roman"/>
+                <w:sz w:val="26"/>
+                <w:szCs w:val="26"/>
+              </w:rPr>
+              <w:t>Nhân viên cần cập nhật lịch làm việc và thời gian nghỉ của bác sĩ, y tá, sau đó kiểm tra các lịch hẹn theo từng ngày và khung giờ. Khi thêm hoặc thay đổi lịch, hệ thống cần kiểm tra trùng giờ, số lượng nhân viên và khả năng tiếp nhận. Nếu phát hiện xung đột, nhân viên điều chỉnh lịch hoặc phân công nhân sự khác phù hợp.</w:t>
+            </w:r>
           </w:p>
         </w:tc>
         <w:tc>
@@ -5963,6 +5991,7 @@
                 <w:sz w:val="26"/>
                 <w:szCs w:val="26"/>
               </w:rPr>
+              <w:lastRenderedPageBreak/>
               <w:t>5.</w:t>
             </w:r>
           </w:p>
@@ -6449,7 +6478,6 @@
           <w:sz w:val="26"/>
           <w:szCs w:val="26"/>
         </w:rPr>
-        <w:lastRenderedPageBreak/>
         <w:t>Yêu cầ</w:t>
       </w:r>
       <w:r>

</xml_diff>

<commit_message>
update yeu cau chuc nang, phi chuc nang
</commit_message>
<xml_diff>
--- a/doc/05-NguyenKhacDuy.docx
+++ b/doc/05-NguyenKhacDuy.docx
@@ -5671,6 +5671,7 @@
                 <w:rFonts w:ascii="Times New Roman" w:hAnsi="Times New Roman" w:cs="Times New Roman"/>
                 <w:sz w:val="26"/>
                 <w:szCs w:val="26"/>
+                <w:lang w:val="vi-VN"/>
               </w:rPr>
             </w:pPr>
             <w:r>
@@ -5679,7 +5680,7 @@
                 <w:sz w:val="26"/>
                 <w:szCs w:val="26"/>
               </w:rPr>
-              <w:t>Nhân viên cần kiểm tra thông tin bệnh nhân (họ tên, số điện thoại, nhu cầu khám), bác sĩ phù hợp, ngày và giờ khám còn trống, phòng khám và khả năng tiếp nhận. Đồng thời cần đảm bảo không trùng lịch với bác sĩ hoặc bệnh nhân trước khi tạo lịch hẹn.</w:t>
+              <w:t>Nhân viên cần kiểm tra thông tin bệnh nhân (họ tên, số điện thoại, nhu cầu khám), bác sĩ phù hợp, ngày và giờ khám còn trống, phòng khám và khả năng tiếp nhận</w:t>
             </w:r>
           </w:p>
           <w:p>
@@ -5691,6 +5692,205 @@
                 <w:sz w:val="26"/>
                 <w:szCs w:val="26"/>
                 <w:lang w:val="vi-VN"/>
+              </w:rPr>
+            </w:pPr>
+          </w:p>
+        </w:tc>
+        <w:tc>
+          <w:tcPr>
+            <w:tcW w:w="1330" w:type="pct"/>
+          </w:tcPr>
+          <w:p>
+            <w:pPr>
+              <w:spacing w:after="120"/>
+              <w:jc w:val="both"/>
+              <w:rPr>
+                <w:rFonts w:ascii="Times New Roman" w:hAnsi="Times New Roman" w:cs="Times New Roman"/>
+                <w:sz w:val="26"/>
+                <w:szCs w:val="26"/>
+              </w:rPr>
+            </w:pPr>
+            <w:r>
+              <w:rPr>
+                <w:rFonts w:ascii="Times New Roman" w:hAnsi="Times New Roman" w:cs="Times New Roman"/>
+                <w:sz w:val="26"/>
+                <w:szCs w:val="26"/>
+              </w:rPr>
+              <w:t>C</w:t>
+            </w:r>
+            <w:r>
+              <w:rPr>
+                <w:rFonts w:ascii="Times New Roman" w:hAnsi="Times New Roman" w:cs="Times New Roman"/>
+                <w:sz w:val="26"/>
+                <w:szCs w:val="26"/>
+              </w:rPr>
+              <w:t>ần đảm bảo không trùng lịch với bác sĩ hoặc bệnh nhân trước khi tạo lịch hẹn.</w:t>
+            </w:r>
+          </w:p>
+        </w:tc>
+      </w:tr>
+      <w:tr>
+        <w:trPr>
+          <w:trHeight w:val="339"/>
+        </w:trPr>
+        <w:tc>
+          <w:tcPr>
+            <w:tcW w:w="314" w:type="pct"/>
+            <w:vAlign w:val="center"/>
+          </w:tcPr>
+          <w:p>
+            <w:pPr>
+              <w:spacing w:after="120"/>
+              <w:rPr>
+                <w:rFonts w:ascii="Times New Roman" w:hAnsi="Times New Roman" w:cs="Times New Roman"/>
+                <w:sz w:val="26"/>
+                <w:szCs w:val="26"/>
+              </w:rPr>
+            </w:pPr>
+            <w:r>
+              <w:rPr>
+                <w:rFonts w:ascii="Times New Roman" w:hAnsi="Times New Roman" w:cs="Times New Roman"/>
+                <w:sz w:val="26"/>
+                <w:szCs w:val="26"/>
+              </w:rPr>
+              <w:t>2.</w:t>
+            </w:r>
+          </w:p>
+        </w:tc>
+        <w:tc>
+          <w:tcPr>
+            <w:tcW w:w="1520" w:type="pct"/>
+            <w:vAlign w:val="center"/>
+          </w:tcPr>
+          <w:p>
+            <w:pPr>
+              <w:spacing w:after="120"/>
+              <w:jc w:val="both"/>
+              <w:rPr>
+                <w:rFonts w:ascii="Times New Roman" w:hAnsi="Times New Roman" w:cs="Times New Roman"/>
+                <w:sz w:val="26"/>
+                <w:szCs w:val="26"/>
+              </w:rPr>
+            </w:pPr>
+            <w:r>
+              <w:rPr>
+                <w:rFonts w:ascii="Times New Roman" w:hAnsi="Times New Roman" w:cs="Times New Roman"/>
+                <w:sz w:val="26"/>
+                <w:szCs w:val="26"/>
+              </w:rPr>
+              <w:t>Làm thế nào để nhân viên quản lý lịch làm việc của bác sĩ, y tá và tránh tình trạng trùng lịch hoặc thiếu nhân sự?</w:t>
+            </w:r>
+          </w:p>
+        </w:tc>
+        <w:tc>
+          <w:tcPr>
+            <w:tcW w:w="1836" w:type="pct"/>
+            <w:vAlign w:val="center"/>
+          </w:tcPr>
+          <w:p>
+            <w:pPr>
+              <w:spacing w:after="120"/>
+              <w:jc w:val="both"/>
+              <w:rPr>
+                <w:rFonts w:ascii="Times New Roman" w:hAnsi="Times New Roman" w:cs="Times New Roman"/>
+                <w:sz w:val="26"/>
+                <w:szCs w:val="26"/>
+              </w:rPr>
+            </w:pPr>
+            <w:r>
+              <w:rPr>
+                <w:rFonts w:ascii="Times New Roman" w:hAnsi="Times New Roman" w:cs="Times New Roman"/>
+                <w:sz w:val="26"/>
+                <w:szCs w:val="26"/>
+              </w:rPr>
+              <w:t xml:space="preserve">Nhân viên cần cập nhật lịch làm việc và thời gian nghỉ của bác sĩ, y tá, sau đó kiểm tra các lịch hẹn theo từng ngày và khung giờ. Khi thêm hoặc thay đổi lịch, hệ thống cần kiểm tra trùng giờ, số lượng nhân viên và khả năng tiếp nhận. </w:t>
+            </w:r>
+          </w:p>
+        </w:tc>
+        <w:tc>
+          <w:tcPr>
+            <w:tcW w:w="1330" w:type="pct"/>
+          </w:tcPr>
+          <w:p>
+            <w:pPr>
+              <w:spacing w:after="120"/>
+              <w:jc w:val="both"/>
+              <w:rPr>
+                <w:rFonts w:ascii="Times New Roman" w:hAnsi="Times New Roman" w:cs="Times New Roman"/>
+                <w:sz w:val="26"/>
+                <w:szCs w:val="26"/>
+              </w:rPr>
+            </w:pPr>
+            <w:r>
+              <w:rPr>
+                <w:rFonts w:ascii="Times New Roman" w:hAnsi="Times New Roman" w:cs="Times New Roman"/>
+                <w:sz w:val="26"/>
+                <w:szCs w:val="26"/>
+              </w:rPr>
+              <w:t>Nếu phát hiện xung đột, nhân viên điều chỉnh lịch hoặc phân công nhân sự khác phù hợp.</w:t>
+            </w:r>
+          </w:p>
+        </w:tc>
+      </w:tr>
+      <w:tr>
+        <w:trPr>
+          <w:trHeight w:val="339"/>
+        </w:trPr>
+        <w:tc>
+          <w:tcPr>
+            <w:tcW w:w="314" w:type="pct"/>
+            <w:vAlign w:val="center"/>
+          </w:tcPr>
+          <w:p>
+            <w:pPr>
+              <w:spacing w:after="120"/>
+              <w:rPr>
+                <w:rFonts w:ascii="Times New Roman" w:hAnsi="Times New Roman" w:cs="Times New Roman"/>
+                <w:sz w:val="26"/>
+                <w:szCs w:val="26"/>
+              </w:rPr>
+            </w:pPr>
+            <w:r>
+              <w:rPr>
+                <w:rFonts w:ascii="Times New Roman" w:hAnsi="Times New Roman" w:cs="Times New Roman"/>
+                <w:sz w:val="26"/>
+                <w:szCs w:val="26"/>
+              </w:rPr>
+              <w:t>3.</w:t>
+            </w:r>
+          </w:p>
+        </w:tc>
+        <w:tc>
+          <w:tcPr>
+            <w:tcW w:w="1520" w:type="pct"/>
+            <w:vAlign w:val="center"/>
+          </w:tcPr>
+          <w:p>
+            <w:pPr>
+              <w:spacing w:after="120"/>
+              <w:jc w:val="both"/>
+              <w:rPr>
+                <w:rFonts w:ascii="Times New Roman" w:hAnsi="Times New Roman" w:cs="Times New Roman"/>
+                <w:sz w:val="26"/>
+                <w:szCs w:val="26"/>
+                <w:lang w:val="vi-VN"/>
+              </w:rPr>
+            </w:pPr>
+          </w:p>
+        </w:tc>
+        <w:tc>
+          <w:tcPr>
+            <w:tcW w:w="1836" w:type="pct"/>
+            <w:vAlign w:val="center"/>
+          </w:tcPr>
+          <w:p>
+            <w:pPr>
+              <w:spacing w:after="120"/>
+              <w:jc w:val="both"/>
+              <w:rPr>
+                <w:rFonts w:ascii="Times New Roman" w:hAnsi="Times New Roman" w:cs="Times New Roman"/>
+                <w:sz w:val="26"/>
+                <w:szCs w:val="26"/>
               </w:rPr>
             </w:pPr>
           </w:p>
@@ -5736,7 +5936,7 @@
                 <w:sz w:val="26"/>
                 <w:szCs w:val="26"/>
               </w:rPr>
-              <w:t>2.</w:t>
+              <w:t>4.</w:t>
             </w:r>
           </w:p>
         </w:tc>
@@ -5753,16 +5953,9 @@
                 <w:rFonts w:ascii="Times New Roman" w:hAnsi="Times New Roman" w:cs="Times New Roman"/>
                 <w:sz w:val="26"/>
                 <w:szCs w:val="26"/>
+                <w:lang w:val="vi-VN"/>
               </w:rPr>
             </w:pPr>
-            <w:r>
-              <w:rPr>
-                <w:rFonts w:ascii="Times New Roman" w:hAnsi="Times New Roman" w:cs="Times New Roman"/>
-                <w:sz w:val="26"/>
-                <w:szCs w:val="26"/>
-              </w:rPr>
-              <w:t>Làm thế nào để nhân viên quản lý lịch làm việc của bác sĩ, y tá và tránh tình trạng trùng lịch hoặc thiếu nhân sự?</w:t>
-            </w:r>
           </w:p>
         </w:tc>
         <w:tc>
@@ -5780,14 +5973,6 @@
                 <w:szCs w:val="26"/>
               </w:rPr>
             </w:pPr>
-            <w:r>
-              <w:rPr>
-                <w:rFonts w:ascii="Times New Roman" w:hAnsi="Times New Roman" w:cs="Times New Roman"/>
-                <w:sz w:val="26"/>
-                <w:szCs w:val="26"/>
-              </w:rPr>
-              <w:t>Nhân viên cần cập nhật lịch làm việc và thời gian nghỉ của bác sĩ, y tá, sau đó kiểm tra các lịch hẹn theo từng ngày và khung giờ. Khi thêm hoặc thay đổi lịch, hệ thống cần kiểm tra trùng giờ, số lượng nhân viên và khả năng tiếp nhận. Nếu phát hiện xung đột, nhân viên điều chỉnh lịch hoặc phân công nhân sự khác phù hợp.</w:t>
-            </w:r>
           </w:p>
         </w:tc>
         <w:tc>
@@ -5831,7 +6016,7 @@
                 <w:sz w:val="26"/>
                 <w:szCs w:val="26"/>
               </w:rPr>
-              <w:t>3.</w:t>
+              <w:t>5.</w:t>
             </w:r>
           </w:p>
         </w:tc>
@@ -5848,7 +6033,6 @@
                 <w:rFonts w:ascii="Times New Roman" w:hAnsi="Times New Roman" w:cs="Times New Roman"/>
                 <w:sz w:val="26"/>
                 <w:szCs w:val="26"/>
-                <w:lang w:val="vi-VN"/>
               </w:rPr>
             </w:pPr>
           </w:p>
@@ -5911,7 +6095,7 @@
                 <w:sz w:val="26"/>
                 <w:szCs w:val="26"/>
               </w:rPr>
-              <w:t>4.</w:t>
+              <w:t>6.</w:t>
             </w:r>
           </w:p>
         </w:tc>
@@ -5928,7 +6112,6 @@
                 <w:rFonts w:ascii="Times New Roman" w:hAnsi="Times New Roman" w:cs="Times New Roman"/>
                 <w:sz w:val="26"/>
                 <w:szCs w:val="26"/>
-                <w:lang w:val="vi-VN"/>
               </w:rPr>
             </w:pPr>
           </w:p>
@@ -5991,8 +6174,7 @@
                 <w:sz w:val="26"/>
                 <w:szCs w:val="26"/>
               </w:rPr>
-              <w:lastRenderedPageBreak/>
-              <w:t>5.</w:t>
+              <w:t>7.</w:t>
             </w:r>
           </w:p>
         </w:tc>
@@ -6071,7 +6253,7 @@
                 <w:sz w:val="26"/>
                 <w:szCs w:val="26"/>
               </w:rPr>
-              <w:t>6.</w:t>
+              <w:t>8.</w:t>
             </w:r>
           </w:p>
         </w:tc>
@@ -6150,7 +6332,8 @@
                 <w:sz w:val="26"/>
                 <w:szCs w:val="26"/>
               </w:rPr>
-              <w:t>7.</w:t>
+              <w:lastRenderedPageBreak/>
+              <w:t>…</w:t>
             </w:r>
           </w:p>
         </w:tc>
@@ -6229,85 +6412,6 @@
                 <w:sz w:val="26"/>
                 <w:szCs w:val="26"/>
               </w:rPr>
-              <w:t>8.</w:t>
-            </w:r>
-          </w:p>
-        </w:tc>
-        <w:tc>
-          <w:tcPr>
-            <w:tcW w:w="1520" w:type="pct"/>
-            <w:vAlign w:val="center"/>
-          </w:tcPr>
-          <w:p>
-            <w:pPr>
-              <w:spacing w:after="120"/>
-              <w:jc w:val="both"/>
-              <w:rPr>
-                <w:rFonts w:ascii="Times New Roman" w:hAnsi="Times New Roman" w:cs="Times New Roman"/>
-                <w:sz w:val="26"/>
-                <w:szCs w:val="26"/>
-              </w:rPr>
-            </w:pPr>
-          </w:p>
-        </w:tc>
-        <w:tc>
-          <w:tcPr>
-            <w:tcW w:w="1836" w:type="pct"/>
-            <w:vAlign w:val="center"/>
-          </w:tcPr>
-          <w:p>
-            <w:pPr>
-              <w:spacing w:after="120"/>
-              <w:jc w:val="both"/>
-              <w:rPr>
-                <w:rFonts w:ascii="Times New Roman" w:hAnsi="Times New Roman" w:cs="Times New Roman"/>
-                <w:sz w:val="26"/>
-                <w:szCs w:val="26"/>
-              </w:rPr>
-            </w:pPr>
-          </w:p>
-        </w:tc>
-        <w:tc>
-          <w:tcPr>
-            <w:tcW w:w="1330" w:type="pct"/>
-          </w:tcPr>
-          <w:p>
-            <w:pPr>
-              <w:spacing w:after="120"/>
-              <w:jc w:val="both"/>
-              <w:rPr>
-                <w:rFonts w:ascii="Times New Roman" w:hAnsi="Times New Roman" w:cs="Times New Roman"/>
-                <w:sz w:val="26"/>
-                <w:szCs w:val="26"/>
-              </w:rPr>
-            </w:pPr>
-          </w:p>
-        </w:tc>
-      </w:tr>
-      <w:tr>
-        <w:trPr>
-          <w:trHeight w:val="339"/>
-        </w:trPr>
-        <w:tc>
-          <w:tcPr>
-            <w:tcW w:w="314" w:type="pct"/>
-            <w:vAlign w:val="center"/>
-          </w:tcPr>
-          <w:p>
-            <w:pPr>
-              <w:spacing w:after="120"/>
-              <w:rPr>
-                <w:rFonts w:ascii="Times New Roman" w:hAnsi="Times New Roman" w:cs="Times New Roman"/>
-                <w:sz w:val="26"/>
-                <w:szCs w:val="26"/>
-              </w:rPr>
-            </w:pPr>
-            <w:r>
-              <w:rPr>
-                <w:rFonts w:ascii="Times New Roman" w:hAnsi="Times New Roman" w:cs="Times New Roman"/>
-                <w:sz w:val="26"/>
-                <w:szCs w:val="26"/>
-              </w:rPr>
               <w:t>…</w:t>
             </w:r>
           </w:p>
@@ -6363,85 +6467,6 @@
           </w:p>
         </w:tc>
       </w:tr>
-      <w:tr>
-        <w:trPr>
-          <w:trHeight w:val="339"/>
-        </w:trPr>
-        <w:tc>
-          <w:tcPr>
-            <w:tcW w:w="314" w:type="pct"/>
-            <w:vAlign w:val="center"/>
-          </w:tcPr>
-          <w:p>
-            <w:pPr>
-              <w:spacing w:after="120"/>
-              <w:rPr>
-                <w:rFonts w:ascii="Times New Roman" w:hAnsi="Times New Roman" w:cs="Times New Roman"/>
-                <w:sz w:val="26"/>
-                <w:szCs w:val="26"/>
-              </w:rPr>
-            </w:pPr>
-            <w:r>
-              <w:rPr>
-                <w:rFonts w:ascii="Times New Roman" w:hAnsi="Times New Roman" w:cs="Times New Roman"/>
-                <w:sz w:val="26"/>
-                <w:szCs w:val="26"/>
-              </w:rPr>
-              <w:t>…</w:t>
-            </w:r>
-          </w:p>
-        </w:tc>
-        <w:tc>
-          <w:tcPr>
-            <w:tcW w:w="1520" w:type="pct"/>
-            <w:vAlign w:val="center"/>
-          </w:tcPr>
-          <w:p>
-            <w:pPr>
-              <w:spacing w:after="120"/>
-              <w:jc w:val="both"/>
-              <w:rPr>
-                <w:rFonts w:ascii="Times New Roman" w:hAnsi="Times New Roman" w:cs="Times New Roman"/>
-                <w:sz w:val="26"/>
-                <w:szCs w:val="26"/>
-              </w:rPr>
-            </w:pPr>
-          </w:p>
-        </w:tc>
-        <w:tc>
-          <w:tcPr>
-            <w:tcW w:w="1836" w:type="pct"/>
-            <w:vAlign w:val="center"/>
-          </w:tcPr>
-          <w:p>
-            <w:pPr>
-              <w:spacing w:after="120"/>
-              <w:jc w:val="both"/>
-              <w:rPr>
-                <w:rFonts w:ascii="Times New Roman" w:hAnsi="Times New Roman" w:cs="Times New Roman"/>
-                <w:sz w:val="26"/>
-                <w:szCs w:val="26"/>
-              </w:rPr>
-            </w:pPr>
-          </w:p>
-        </w:tc>
-        <w:tc>
-          <w:tcPr>
-            <w:tcW w:w="1330" w:type="pct"/>
-          </w:tcPr>
-          <w:p>
-            <w:pPr>
-              <w:spacing w:after="120"/>
-              <w:jc w:val="both"/>
-              <w:rPr>
-                <w:rFonts w:ascii="Times New Roman" w:hAnsi="Times New Roman" w:cs="Times New Roman"/>
-                <w:sz w:val="26"/>
-                <w:szCs w:val="26"/>
-              </w:rPr>
-            </w:pPr>
-          </w:p>
-        </w:tc>
-      </w:tr>
     </w:tbl>
     <w:p>
       <w:pPr>
@@ -6508,6 +6533,1435 @@
           <w:b/>
           <w:sz w:val="26"/>
           <w:szCs w:val="26"/>
+          <w:lang w:val="vi-VN"/>
+        </w:rPr>
+      </w:pPr>
+      <w:r>
+        <w:rPr>
+          <w:rFonts w:ascii="Times New Roman" w:hAnsi="Times New Roman" w:cs="Times New Roman"/>
+          <w:b/>
+          <w:sz w:val="26"/>
+          <w:szCs w:val="26"/>
+          <w:lang w:val="vi-VN"/>
+        </w:rPr>
+        <w:t xml:space="preserve">Chức năng </w:t>
+      </w:r>
+      <w:r>
+        <w:rPr>
+          <w:rFonts w:ascii="Times New Roman" w:hAnsi="Times New Roman" w:cs="Times New Roman"/>
+          <w:b/>
+          <w:sz w:val="26"/>
+          <w:szCs w:val="26"/>
+          <w:lang w:val="vi-VN"/>
+        </w:rPr>
+        <w:t>lịch hẹn</w:t>
+      </w:r>
+      <w:r>
+        <w:rPr>
+          <w:rFonts w:ascii="Times New Roman" w:hAnsi="Times New Roman" w:cs="Times New Roman"/>
+          <w:b/>
+          <w:sz w:val="26"/>
+          <w:szCs w:val="26"/>
+          <w:lang w:val="vi-VN"/>
+        </w:rPr>
+        <w:t xml:space="preserve">, tiếp nhận bệnh nhân : </w:t>
+      </w:r>
+    </w:p>
+    <w:p>
+      <w:pPr>
+        <w:spacing w:after="120" w:line="240" w:lineRule="auto"/>
+        <w:jc w:val="both"/>
+        <w:rPr>
+          <w:rFonts w:ascii="Times New Roman" w:hAnsi="Times New Roman" w:cs="Times New Roman"/>
+          <w:b/>
+          <w:sz w:val="26"/>
+          <w:szCs w:val="26"/>
+          <w:lang w:val="vi-VN"/>
+        </w:rPr>
+      </w:pPr>
+      <w:proofErr w:type="gramStart"/>
+      <w:r>
+        <w:rPr>
+          <w:rFonts w:ascii="Times New Roman" w:hAnsi="Times New Roman" w:cs="Times New Roman"/>
+          <w:b/>
+          <w:sz w:val="26"/>
+          <w:szCs w:val="26"/>
+        </w:rPr>
+        <w:t>Actor</w:t>
+      </w:r>
+      <w:r>
+        <w:rPr>
+          <w:rFonts w:ascii="Times New Roman" w:hAnsi="Times New Roman" w:cs="Times New Roman"/>
+          <w:b/>
+          <w:sz w:val="26"/>
+          <w:szCs w:val="26"/>
+          <w:lang w:val="vi-VN"/>
+        </w:rPr>
+        <w:t xml:space="preserve"> :</w:t>
+      </w:r>
+      <w:proofErr w:type="gramEnd"/>
+    </w:p>
+    <w:p>
+      <w:pPr>
+        <w:pStyle w:val="ListParagraph"/>
+        <w:numPr>
+          <w:ilvl w:val="0"/>
+          <w:numId w:val="10"/>
+        </w:numPr>
+        <w:spacing w:after="120" w:line="240" w:lineRule="auto"/>
+        <w:jc w:val="both"/>
+        <w:rPr>
+          <w:rFonts w:ascii="Times New Roman" w:hAnsi="Times New Roman" w:cs="Times New Roman"/>
+          <w:bCs/>
+          <w:sz w:val="26"/>
+          <w:szCs w:val="26"/>
+          <w:lang w:val="vi-VN"/>
+        </w:rPr>
+      </w:pPr>
+      <w:r>
+        <w:rPr>
+          <w:rFonts w:ascii="Times New Roman" w:hAnsi="Times New Roman" w:cs="Times New Roman"/>
+          <w:bCs/>
+          <w:sz w:val="26"/>
+          <w:szCs w:val="26"/>
+        </w:rPr>
+        <w:t xml:space="preserve">Nhân viên tiếp </w:t>
+      </w:r>
+      <w:proofErr w:type="gramStart"/>
+      <w:r>
+        <w:rPr>
+          <w:rFonts w:ascii="Times New Roman" w:hAnsi="Times New Roman" w:cs="Times New Roman"/>
+          <w:bCs/>
+          <w:sz w:val="26"/>
+          <w:szCs w:val="26"/>
+        </w:rPr>
+        <w:t>nhận</w:t>
+      </w:r>
+      <w:r>
+        <w:rPr>
+          <w:rFonts w:ascii="Times New Roman" w:hAnsi="Times New Roman" w:cs="Times New Roman"/>
+          <w:bCs/>
+          <w:sz w:val="26"/>
+          <w:szCs w:val="26"/>
+          <w:lang w:val="vi-VN"/>
+        </w:rPr>
+        <w:t xml:space="preserve"> :</w:t>
+      </w:r>
+      <w:proofErr w:type="gramEnd"/>
+      <w:r>
+        <w:rPr>
+          <w:rFonts w:ascii="Times New Roman" w:hAnsi="Times New Roman" w:cs="Times New Roman"/>
+          <w:bCs/>
+          <w:sz w:val="26"/>
+          <w:szCs w:val="26"/>
+          <w:lang w:val="vi-VN"/>
+        </w:rPr>
+        <w:t xml:space="preserve"> </w:t>
+      </w:r>
+      <w:r>
+        <w:rPr>
+          <w:rFonts w:ascii="Times New Roman" w:hAnsi="Times New Roman" w:cs="Times New Roman"/>
+          <w:bCs/>
+          <w:sz w:val="26"/>
+          <w:szCs w:val="26"/>
+        </w:rPr>
+        <w:t>Đặt lịch, quản lý lịch hẹn, xác nhận/hủy lịch, check-in và tiếp nhận bệnh nhân.</w:t>
+      </w:r>
+    </w:p>
+    <w:p>
+      <w:pPr>
+        <w:pStyle w:val="ListParagraph"/>
+        <w:numPr>
+          <w:ilvl w:val="0"/>
+          <w:numId w:val="10"/>
+        </w:numPr>
+        <w:spacing w:after="120" w:line="240" w:lineRule="auto"/>
+        <w:jc w:val="both"/>
+        <w:rPr>
+          <w:rFonts w:ascii="Times New Roman" w:hAnsi="Times New Roman" w:cs="Times New Roman"/>
+          <w:bCs/>
+          <w:sz w:val="26"/>
+          <w:szCs w:val="26"/>
+          <w:lang w:val="vi-VN"/>
+        </w:rPr>
+      </w:pPr>
+      <w:r>
+        <w:rPr>
+          <w:rFonts w:ascii="Times New Roman" w:hAnsi="Times New Roman" w:cs="Times New Roman"/>
+          <w:bCs/>
+          <w:sz w:val="26"/>
+          <w:szCs w:val="26"/>
+        </w:rPr>
+        <w:t xml:space="preserve">Bác </w:t>
+      </w:r>
+      <w:proofErr w:type="gramStart"/>
+      <w:r>
+        <w:rPr>
+          <w:rFonts w:ascii="Times New Roman" w:hAnsi="Times New Roman" w:cs="Times New Roman"/>
+          <w:bCs/>
+          <w:sz w:val="26"/>
+          <w:szCs w:val="26"/>
+        </w:rPr>
+        <w:t>sĩ</w:t>
+      </w:r>
+      <w:r>
+        <w:rPr>
+          <w:rFonts w:ascii="Times New Roman" w:hAnsi="Times New Roman" w:cs="Times New Roman"/>
+          <w:bCs/>
+          <w:sz w:val="26"/>
+          <w:szCs w:val="26"/>
+          <w:lang w:val="vi-VN"/>
+        </w:rPr>
+        <w:t xml:space="preserve"> :</w:t>
+      </w:r>
+      <w:proofErr w:type="gramEnd"/>
+      <w:r>
+        <w:rPr>
+          <w:rFonts w:ascii="Times New Roman" w:hAnsi="Times New Roman" w:cs="Times New Roman"/>
+          <w:bCs/>
+          <w:sz w:val="26"/>
+          <w:szCs w:val="26"/>
+          <w:lang w:val="vi-VN"/>
+        </w:rPr>
+        <w:t xml:space="preserve"> </w:t>
+      </w:r>
+      <w:r>
+        <w:rPr>
+          <w:rFonts w:ascii="Times New Roman" w:hAnsi="Times New Roman" w:cs="Times New Roman"/>
+          <w:bCs/>
+          <w:sz w:val="26"/>
+          <w:szCs w:val="26"/>
+        </w:rPr>
+        <w:t>Xem lịch làm việc, danh sách bệnh nhân và tiếp nhận bệnh nhân để khám.</w:t>
+      </w:r>
+    </w:p>
+    <w:p>
+      <w:pPr>
+        <w:pStyle w:val="ListParagraph"/>
+        <w:numPr>
+          <w:ilvl w:val="0"/>
+          <w:numId w:val="10"/>
+        </w:numPr>
+        <w:spacing w:after="120" w:line="240" w:lineRule="auto"/>
+        <w:jc w:val="both"/>
+        <w:rPr>
+          <w:rFonts w:ascii="Times New Roman" w:hAnsi="Times New Roman" w:cs="Times New Roman"/>
+          <w:bCs/>
+          <w:sz w:val="26"/>
+          <w:szCs w:val="26"/>
+          <w:lang w:val="vi-VN"/>
+        </w:rPr>
+      </w:pPr>
+      <w:r>
+        <w:rPr>
+          <w:rFonts w:ascii="Times New Roman" w:hAnsi="Times New Roman" w:cs="Times New Roman"/>
+          <w:bCs/>
+          <w:sz w:val="26"/>
+          <w:szCs w:val="26"/>
+        </w:rPr>
+        <w:t xml:space="preserve">Y </w:t>
+      </w:r>
+      <w:proofErr w:type="gramStart"/>
+      <w:r>
+        <w:rPr>
+          <w:rFonts w:ascii="Times New Roman" w:hAnsi="Times New Roman" w:cs="Times New Roman"/>
+          <w:bCs/>
+          <w:sz w:val="26"/>
+          <w:szCs w:val="26"/>
+        </w:rPr>
+        <w:t>tá</w:t>
+      </w:r>
+      <w:r>
+        <w:rPr>
+          <w:rFonts w:ascii="Times New Roman" w:hAnsi="Times New Roman" w:cs="Times New Roman"/>
+          <w:bCs/>
+          <w:sz w:val="26"/>
+          <w:szCs w:val="26"/>
+          <w:lang w:val="vi-VN"/>
+        </w:rPr>
+        <w:t xml:space="preserve"> :</w:t>
+      </w:r>
+      <w:proofErr w:type="gramEnd"/>
+      <w:r>
+        <w:rPr>
+          <w:rFonts w:ascii="Times New Roman" w:hAnsi="Times New Roman" w:cs="Times New Roman"/>
+          <w:bCs/>
+          <w:sz w:val="26"/>
+          <w:szCs w:val="26"/>
+          <w:lang w:val="vi-VN"/>
+        </w:rPr>
+        <w:t xml:space="preserve"> </w:t>
+      </w:r>
+      <w:r>
+        <w:rPr>
+          <w:rFonts w:ascii="Times New Roman" w:hAnsi="Times New Roman" w:cs="Times New Roman"/>
+          <w:bCs/>
+          <w:sz w:val="26"/>
+          <w:szCs w:val="26"/>
+        </w:rPr>
+        <w:t>Cập nhật/xem lịch làm việc và hỗ trợ quá trình tiếp nhận bệnh nhân.</w:t>
+      </w:r>
+    </w:p>
+    <w:p>
+      <w:pPr>
+        <w:spacing w:after="120" w:line="240" w:lineRule="auto"/>
+        <w:jc w:val="both"/>
+        <w:rPr>
+          <w:rFonts w:ascii="Times New Roman" w:hAnsi="Times New Roman" w:cs="Times New Roman"/>
+          <w:b/>
+          <w:sz w:val="26"/>
+          <w:szCs w:val="26"/>
+          <w:lang w:val="vi-VN"/>
+        </w:rPr>
+      </w:pPr>
+      <w:r>
+        <w:rPr>
+          <w:rFonts w:ascii="Times New Roman" w:hAnsi="Times New Roman" w:cs="Times New Roman"/>
+          <w:b/>
+          <w:sz w:val="26"/>
+          <w:szCs w:val="26"/>
+          <w:lang w:val="vi-VN"/>
+        </w:rPr>
+        <w:t xml:space="preserve">Yêu cầu chức năng : </w:t>
+      </w:r>
+    </w:p>
+    <w:p>
+      <w:pPr>
+        <w:pStyle w:val="ListParagraph"/>
+        <w:numPr>
+          <w:ilvl w:val="0"/>
+          <w:numId w:val="10"/>
+        </w:numPr>
+        <w:spacing w:after="120" w:line="240" w:lineRule="auto"/>
+        <w:jc w:val="both"/>
+        <w:rPr>
+          <w:rFonts w:ascii="Times New Roman" w:hAnsi="Times New Roman" w:cs="Times New Roman"/>
+          <w:bCs/>
+          <w:sz w:val="26"/>
+          <w:szCs w:val="26"/>
+          <w:lang w:val="vi-VN"/>
+        </w:rPr>
+      </w:pPr>
+      <w:r>
+        <w:rPr>
+          <w:rFonts w:ascii="Times New Roman" w:hAnsi="Times New Roman" w:cs="Times New Roman"/>
+          <w:b/>
+          <w:sz w:val="26"/>
+          <w:szCs w:val="26"/>
+          <w:lang w:val="vi-VN"/>
+        </w:rPr>
+        <w:t>Lịch hẹn :</w:t>
+      </w:r>
+    </w:p>
+    <w:p>
+      <w:pPr>
+        <w:pStyle w:val="ListParagraph"/>
+        <w:numPr>
+          <w:ilvl w:val="1"/>
+          <w:numId w:val="10"/>
+        </w:numPr>
+        <w:spacing w:after="120"/>
+        <w:jc w:val="both"/>
+        <w:rPr>
+          <w:rFonts w:ascii="Times New Roman" w:hAnsi="Times New Roman" w:cs="Times New Roman"/>
+          <w:bCs/>
+          <w:sz w:val="26"/>
+          <w:szCs w:val="26"/>
+        </w:rPr>
+      </w:pPr>
+      <w:r>
+        <w:rPr>
+          <w:rFonts w:ascii="Times New Roman" w:hAnsi="Times New Roman" w:cs="Times New Roman"/>
+          <w:bCs/>
+          <w:sz w:val="26"/>
+          <w:szCs w:val="26"/>
+        </w:rPr>
+        <w:t xml:space="preserve"> </w:t>
+      </w:r>
+      <w:r>
+        <w:rPr>
+          <w:rFonts w:ascii="Times New Roman" w:hAnsi="Times New Roman" w:cs="Times New Roman"/>
+          <w:b/>
+          <w:bCs/>
+          <w:sz w:val="26"/>
+          <w:szCs w:val="26"/>
+        </w:rPr>
+        <w:t>Đặt lịch hẹn:</w:t>
+      </w:r>
+      <w:r>
+        <w:rPr>
+          <w:rFonts w:ascii="Times New Roman" w:hAnsi="Times New Roman" w:cs="Times New Roman"/>
+          <w:bCs/>
+          <w:sz w:val="26"/>
+          <w:szCs w:val="26"/>
+        </w:rPr>
+        <w:t xml:space="preserve"> Cho phép nhân viên tạo lịch khám cho bệnh nhân, lựa chọn bác sĩ, ngày và giờ khám. </w:t>
+      </w:r>
+    </w:p>
+    <w:p>
+      <w:pPr>
+        <w:pStyle w:val="ListParagraph"/>
+        <w:numPr>
+          <w:ilvl w:val="1"/>
+          <w:numId w:val="10"/>
+        </w:numPr>
+        <w:spacing w:after="120"/>
+        <w:jc w:val="both"/>
+        <w:rPr>
+          <w:rFonts w:ascii="Times New Roman" w:hAnsi="Times New Roman" w:cs="Times New Roman"/>
+          <w:bCs/>
+          <w:sz w:val="26"/>
+          <w:szCs w:val="26"/>
+        </w:rPr>
+      </w:pPr>
+      <w:r>
+        <w:rPr>
+          <w:rFonts w:ascii="Times New Roman" w:hAnsi="Times New Roman" w:cs="Times New Roman"/>
+          <w:b/>
+          <w:bCs/>
+          <w:sz w:val="26"/>
+          <w:szCs w:val="26"/>
+        </w:rPr>
+        <w:t>Xem lịch hẹn:</w:t>
+      </w:r>
+      <w:r>
+        <w:rPr>
+          <w:rFonts w:ascii="Times New Roman" w:hAnsi="Times New Roman" w:cs="Times New Roman"/>
+          <w:bCs/>
+          <w:sz w:val="26"/>
+          <w:szCs w:val="26"/>
+        </w:rPr>
+        <w:t xml:space="preserve"> Cho phép xem lịch theo ngày, bác sĩ, y tá và trạng thái. </w:t>
+      </w:r>
+    </w:p>
+    <w:p>
+      <w:pPr>
+        <w:pStyle w:val="ListParagraph"/>
+        <w:numPr>
+          <w:ilvl w:val="1"/>
+          <w:numId w:val="10"/>
+        </w:numPr>
+        <w:spacing w:after="120"/>
+        <w:jc w:val="both"/>
+        <w:rPr>
+          <w:rFonts w:ascii="Times New Roman" w:hAnsi="Times New Roman" w:cs="Times New Roman"/>
+          <w:bCs/>
+          <w:sz w:val="26"/>
+          <w:szCs w:val="26"/>
+        </w:rPr>
+      </w:pPr>
+      <w:r>
+        <w:rPr>
+          <w:rFonts w:ascii="Times New Roman" w:hAnsi="Times New Roman" w:cs="Times New Roman"/>
+          <w:b/>
+          <w:bCs/>
+          <w:sz w:val="26"/>
+          <w:szCs w:val="26"/>
+        </w:rPr>
+        <w:t>Cập nhật lịch hẹn:</w:t>
+      </w:r>
+      <w:r>
+        <w:rPr>
+          <w:rFonts w:ascii="Times New Roman" w:hAnsi="Times New Roman" w:cs="Times New Roman"/>
+          <w:bCs/>
+          <w:sz w:val="26"/>
+          <w:szCs w:val="26"/>
+        </w:rPr>
+        <w:t xml:space="preserve"> Cho phép thay đổi thời gian, bác sĩ, y tá hoặc thông tin bệnh nhân. </w:t>
+      </w:r>
+    </w:p>
+    <w:p>
+      <w:pPr>
+        <w:pStyle w:val="ListParagraph"/>
+        <w:numPr>
+          <w:ilvl w:val="1"/>
+          <w:numId w:val="10"/>
+        </w:numPr>
+        <w:spacing w:after="120"/>
+        <w:jc w:val="both"/>
+        <w:rPr>
+          <w:rFonts w:ascii="Times New Roman" w:hAnsi="Times New Roman" w:cs="Times New Roman"/>
+          <w:bCs/>
+          <w:sz w:val="26"/>
+          <w:szCs w:val="26"/>
+        </w:rPr>
+      </w:pPr>
+      <w:r>
+        <w:rPr>
+          <w:rFonts w:ascii="Times New Roman" w:hAnsi="Times New Roman" w:cs="Times New Roman"/>
+          <w:b/>
+          <w:bCs/>
+          <w:sz w:val="26"/>
+          <w:szCs w:val="26"/>
+        </w:rPr>
+        <w:t>Kiểm tra lịch trống:</w:t>
+      </w:r>
+      <w:r>
+        <w:rPr>
+          <w:rFonts w:ascii="Times New Roman" w:hAnsi="Times New Roman" w:cs="Times New Roman"/>
+          <w:bCs/>
+          <w:sz w:val="26"/>
+          <w:szCs w:val="26"/>
+        </w:rPr>
+        <w:t xml:space="preserve"> Hệ thống kiểm tra khung giờ còn trống trước khi tạo hoặc thay đổi lịch. </w:t>
+      </w:r>
+    </w:p>
+    <w:p>
+      <w:pPr>
+        <w:pStyle w:val="ListParagraph"/>
+        <w:numPr>
+          <w:ilvl w:val="1"/>
+          <w:numId w:val="10"/>
+        </w:numPr>
+        <w:spacing w:after="120"/>
+        <w:jc w:val="both"/>
+        <w:rPr>
+          <w:rFonts w:ascii="Times New Roman" w:hAnsi="Times New Roman" w:cs="Times New Roman"/>
+          <w:bCs/>
+          <w:sz w:val="26"/>
+          <w:szCs w:val="26"/>
+        </w:rPr>
+      </w:pPr>
+      <w:r>
+        <w:rPr>
+          <w:rFonts w:ascii="Times New Roman" w:hAnsi="Times New Roman" w:cs="Times New Roman"/>
+          <w:b/>
+          <w:bCs/>
+          <w:sz w:val="26"/>
+          <w:szCs w:val="26"/>
+        </w:rPr>
+        <w:t>Kiểm tra trùng lịch:</w:t>
+      </w:r>
+      <w:r>
+        <w:rPr>
+          <w:rFonts w:ascii="Times New Roman" w:hAnsi="Times New Roman" w:cs="Times New Roman"/>
+          <w:bCs/>
+          <w:sz w:val="26"/>
+          <w:szCs w:val="26"/>
+        </w:rPr>
+        <w:t xml:space="preserve"> Hệ thống phát hiện và ngăn chặn lịch bị trùng bác sĩ, y tá hoặc khung giờ. </w:t>
+      </w:r>
+    </w:p>
+    <w:p>
+      <w:pPr>
+        <w:pStyle w:val="ListParagraph"/>
+        <w:numPr>
+          <w:ilvl w:val="1"/>
+          <w:numId w:val="10"/>
+        </w:numPr>
+        <w:spacing w:after="120"/>
+        <w:jc w:val="both"/>
+        <w:rPr>
+          <w:rFonts w:ascii="Times New Roman" w:hAnsi="Times New Roman" w:cs="Times New Roman"/>
+          <w:bCs/>
+          <w:sz w:val="26"/>
+          <w:szCs w:val="26"/>
+        </w:rPr>
+      </w:pPr>
+      <w:r>
+        <w:rPr>
+          <w:rFonts w:ascii="Times New Roman" w:hAnsi="Times New Roman" w:cs="Times New Roman"/>
+          <w:b/>
+          <w:bCs/>
+          <w:sz w:val="26"/>
+          <w:szCs w:val="26"/>
+        </w:rPr>
+        <w:t>Xác nhận lịch:</w:t>
+      </w:r>
+      <w:r>
+        <w:rPr>
+          <w:rFonts w:ascii="Times New Roman" w:hAnsi="Times New Roman" w:cs="Times New Roman"/>
+          <w:bCs/>
+          <w:sz w:val="26"/>
+          <w:szCs w:val="26"/>
+        </w:rPr>
+        <w:t xml:space="preserve"> Cho phép nhân viên xác nhận lịch với bệnh nhân và cập nhật trạng thái. </w:t>
+      </w:r>
+    </w:p>
+    <w:p>
+      <w:pPr>
+        <w:pStyle w:val="ListParagraph"/>
+        <w:numPr>
+          <w:ilvl w:val="1"/>
+          <w:numId w:val="10"/>
+        </w:numPr>
+        <w:spacing w:after="120"/>
+        <w:jc w:val="both"/>
+        <w:rPr>
+          <w:rFonts w:ascii="Times New Roman" w:hAnsi="Times New Roman" w:cs="Times New Roman"/>
+          <w:bCs/>
+          <w:sz w:val="26"/>
+          <w:szCs w:val="26"/>
+        </w:rPr>
+      </w:pPr>
+      <w:r>
+        <w:rPr>
+          <w:rFonts w:ascii="Times New Roman" w:hAnsi="Times New Roman" w:cs="Times New Roman"/>
+          <w:b/>
+          <w:bCs/>
+          <w:sz w:val="26"/>
+          <w:szCs w:val="26"/>
+        </w:rPr>
+        <w:t>Hủy lịch:</w:t>
+      </w:r>
+      <w:r>
+        <w:rPr>
+          <w:rFonts w:ascii="Times New Roman" w:hAnsi="Times New Roman" w:cs="Times New Roman"/>
+          <w:bCs/>
+          <w:sz w:val="26"/>
+          <w:szCs w:val="26"/>
+        </w:rPr>
+        <w:t xml:space="preserve"> Cho phép hủy lịch và ghi nhận lý do hủy. </w:t>
+      </w:r>
+    </w:p>
+    <w:p>
+      <w:pPr>
+        <w:pStyle w:val="ListParagraph"/>
+        <w:numPr>
+          <w:ilvl w:val="1"/>
+          <w:numId w:val="10"/>
+        </w:numPr>
+        <w:spacing w:after="120" w:line="240" w:lineRule="auto"/>
+        <w:jc w:val="both"/>
+        <w:rPr>
+          <w:rFonts w:ascii="Times New Roman" w:hAnsi="Times New Roman" w:cs="Times New Roman"/>
+          <w:bCs/>
+          <w:sz w:val="26"/>
+          <w:szCs w:val="26"/>
+          <w:lang w:val="vi-VN"/>
+        </w:rPr>
+      </w:pPr>
+      <w:r>
+        <w:rPr>
+          <w:rFonts w:ascii="Times New Roman" w:hAnsi="Times New Roman" w:cs="Times New Roman"/>
+          <w:b/>
+          <w:bCs/>
+          <w:sz w:val="26"/>
+          <w:szCs w:val="26"/>
+        </w:rPr>
+        <w:t>Cập nhật trạng thái lịch:</w:t>
+      </w:r>
+      <w:r>
+        <w:rPr>
+          <w:rFonts w:ascii="Times New Roman" w:hAnsi="Times New Roman" w:cs="Times New Roman"/>
+          <w:bCs/>
+          <w:sz w:val="26"/>
+          <w:szCs w:val="26"/>
+        </w:rPr>
+        <w:t xml:space="preserve"> Quản lý các trạng thái như Chờ xác nhận → Đã xác nhận → Đã check-in → Đã tiếp nhận / Đã hủy.</w:t>
+      </w:r>
+    </w:p>
+    <w:p>
+      <w:pPr>
+        <w:pStyle w:val="ListParagraph"/>
+        <w:numPr>
+          <w:ilvl w:val="0"/>
+          <w:numId w:val="10"/>
+        </w:numPr>
+        <w:spacing w:after="120" w:line="240" w:lineRule="auto"/>
+        <w:jc w:val="both"/>
+        <w:rPr>
+          <w:rFonts w:ascii="Times New Roman" w:hAnsi="Times New Roman" w:cs="Times New Roman"/>
+          <w:bCs/>
+          <w:sz w:val="26"/>
+          <w:szCs w:val="26"/>
+          <w:lang w:val="vi-VN"/>
+        </w:rPr>
+      </w:pPr>
+      <w:r>
+        <w:rPr>
+          <w:rFonts w:ascii="Times New Roman" w:hAnsi="Times New Roman" w:cs="Times New Roman"/>
+          <w:b/>
+          <w:bCs/>
+          <w:sz w:val="26"/>
+          <w:szCs w:val="26"/>
+          <w:lang w:val="vi-VN"/>
+        </w:rPr>
+        <w:t xml:space="preserve">Tiếp nhận : </w:t>
+      </w:r>
+    </w:p>
+    <w:p>
+      <w:pPr>
+        <w:pStyle w:val="ListParagraph"/>
+        <w:numPr>
+          <w:ilvl w:val="1"/>
+          <w:numId w:val="10"/>
+        </w:numPr>
+        <w:spacing w:after="120"/>
+        <w:jc w:val="both"/>
+        <w:rPr>
+          <w:rFonts w:ascii="Times New Roman" w:hAnsi="Times New Roman" w:cs="Times New Roman"/>
+          <w:bCs/>
+          <w:sz w:val="26"/>
+          <w:szCs w:val="26"/>
+        </w:rPr>
+      </w:pPr>
+      <w:r>
+        <w:rPr>
+          <w:rFonts w:ascii="Times New Roman" w:hAnsi="Times New Roman" w:cs="Times New Roman"/>
+          <w:b/>
+          <w:bCs/>
+          <w:sz w:val="26"/>
+          <w:szCs w:val="26"/>
+        </w:rPr>
+        <w:t>Check-in bệnh nhân:</w:t>
+      </w:r>
+      <w:r>
+        <w:rPr>
+          <w:rFonts w:ascii="Times New Roman" w:hAnsi="Times New Roman" w:cs="Times New Roman"/>
+          <w:bCs/>
+          <w:sz w:val="26"/>
+          <w:szCs w:val="26"/>
+        </w:rPr>
+        <w:t xml:space="preserve"> Cho phép nhân viên kiểm tra lịch hẹn và xác nhận bệnh nhân đã đến. </w:t>
+      </w:r>
+    </w:p>
+    <w:p>
+      <w:pPr>
+        <w:pStyle w:val="ListParagraph"/>
+        <w:numPr>
+          <w:ilvl w:val="1"/>
+          <w:numId w:val="10"/>
+        </w:numPr>
+        <w:spacing w:after="120"/>
+        <w:jc w:val="both"/>
+        <w:rPr>
+          <w:rFonts w:ascii="Times New Roman" w:hAnsi="Times New Roman" w:cs="Times New Roman"/>
+          <w:bCs/>
+          <w:sz w:val="26"/>
+          <w:szCs w:val="26"/>
+        </w:rPr>
+      </w:pPr>
+      <w:r>
+        <w:rPr>
+          <w:rFonts w:ascii="Times New Roman" w:hAnsi="Times New Roman" w:cs="Times New Roman"/>
+          <w:b/>
+          <w:bCs/>
+          <w:sz w:val="26"/>
+          <w:szCs w:val="26"/>
+        </w:rPr>
+        <w:t>Tra cứu thông tin bệnh nhân:</w:t>
+      </w:r>
+      <w:r>
+        <w:rPr>
+          <w:rFonts w:ascii="Times New Roman" w:hAnsi="Times New Roman" w:cs="Times New Roman"/>
+          <w:bCs/>
+          <w:sz w:val="26"/>
+          <w:szCs w:val="26"/>
+        </w:rPr>
+        <w:t xml:space="preserve"> Tìm kiếm bệnh nhân bằng họ tên, số điện thoại hoặc thông tin lịch hẹn. </w:t>
+      </w:r>
+    </w:p>
+    <w:p>
+      <w:pPr>
+        <w:pStyle w:val="ListParagraph"/>
+        <w:numPr>
+          <w:ilvl w:val="1"/>
+          <w:numId w:val="10"/>
+        </w:numPr>
+        <w:spacing w:after="120"/>
+        <w:jc w:val="both"/>
+        <w:rPr>
+          <w:rFonts w:ascii="Times New Roman" w:hAnsi="Times New Roman" w:cs="Times New Roman"/>
+          <w:bCs/>
+          <w:sz w:val="26"/>
+          <w:szCs w:val="26"/>
+        </w:rPr>
+      </w:pPr>
+      <w:r>
+        <w:rPr>
+          <w:rFonts w:ascii="Times New Roman" w:hAnsi="Times New Roman" w:cs="Times New Roman"/>
+          <w:b/>
+          <w:bCs/>
+          <w:sz w:val="26"/>
+          <w:szCs w:val="26"/>
+        </w:rPr>
+        <w:t>Kiểm tra hồ sơ bệnh nhân:</w:t>
+      </w:r>
+      <w:r>
+        <w:rPr>
+          <w:rFonts w:ascii="Times New Roman" w:hAnsi="Times New Roman" w:cs="Times New Roman"/>
+          <w:bCs/>
+          <w:sz w:val="26"/>
+          <w:szCs w:val="26"/>
+        </w:rPr>
+        <w:t xml:space="preserve"> Kiểm tra và bổ sung thông tin còn thiếu. </w:t>
+      </w:r>
+    </w:p>
+    <w:p>
+      <w:pPr>
+        <w:pStyle w:val="ListParagraph"/>
+        <w:numPr>
+          <w:ilvl w:val="1"/>
+          <w:numId w:val="10"/>
+        </w:numPr>
+        <w:spacing w:after="120"/>
+        <w:jc w:val="both"/>
+        <w:rPr>
+          <w:rFonts w:ascii="Times New Roman" w:hAnsi="Times New Roman" w:cs="Times New Roman"/>
+          <w:sz w:val="26"/>
+          <w:szCs w:val="26"/>
+        </w:rPr>
+      </w:pPr>
+      <w:r>
+        <w:rPr>
+          <w:rFonts w:ascii="Times New Roman" w:hAnsi="Times New Roman" w:cs="Times New Roman"/>
+          <w:b/>
+          <w:bCs/>
+          <w:sz w:val="26"/>
+          <w:szCs w:val="26"/>
+        </w:rPr>
+        <w:t>Tiếp nhận bệnh nhân:</w:t>
+      </w:r>
+      <w:r>
+        <w:rPr>
+          <w:rFonts w:ascii="Times New Roman" w:hAnsi="Times New Roman" w:cs="Times New Roman"/>
+          <w:bCs/>
+          <w:sz w:val="26"/>
+          <w:szCs w:val="26"/>
+        </w:rPr>
+        <w:t xml:space="preserve"> Cập nhật trạng thái bệnh nhân thành </w:t>
+      </w:r>
+      <w:r>
+        <w:rPr>
+          <w:rFonts w:ascii="Times New Roman" w:hAnsi="Times New Roman" w:cs="Times New Roman"/>
+          <w:sz w:val="26"/>
+          <w:szCs w:val="26"/>
+        </w:rPr>
+        <w:t xml:space="preserve">đang chờ khám/đã tiếp nhận. </w:t>
+      </w:r>
+    </w:p>
+    <w:p>
+      <w:pPr>
+        <w:pStyle w:val="ListParagraph"/>
+        <w:numPr>
+          <w:ilvl w:val="1"/>
+          <w:numId w:val="10"/>
+        </w:numPr>
+        <w:spacing w:after="120"/>
+        <w:jc w:val="both"/>
+        <w:rPr>
+          <w:rFonts w:ascii="Times New Roman" w:hAnsi="Times New Roman" w:cs="Times New Roman"/>
+          <w:bCs/>
+          <w:sz w:val="26"/>
+          <w:szCs w:val="26"/>
+        </w:rPr>
+      </w:pPr>
+      <w:r>
+        <w:rPr>
+          <w:rFonts w:ascii="Times New Roman" w:hAnsi="Times New Roman" w:cs="Times New Roman"/>
+          <w:b/>
+          <w:bCs/>
+          <w:sz w:val="26"/>
+          <w:szCs w:val="26"/>
+        </w:rPr>
+        <w:t>Phân phòng và bác sĩ:</w:t>
+      </w:r>
+      <w:r>
+        <w:rPr>
+          <w:rFonts w:ascii="Times New Roman" w:hAnsi="Times New Roman" w:cs="Times New Roman"/>
+          <w:bCs/>
+          <w:sz w:val="26"/>
+          <w:szCs w:val="26"/>
+        </w:rPr>
+        <w:t xml:space="preserve"> Xác định phòng khám và bác sĩ phụ trách theo lịch hẹn. </w:t>
+      </w:r>
+    </w:p>
+    <w:p>
+      <w:pPr>
+        <w:pStyle w:val="ListParagraph"/>
+        <w:numPr>
+          <w:ilvl w:val="1"/>
+          <w:numId w:val="10"/>
+        </w:numPr>
+        <w:spacing w:after="120"/>
+        <w:jc w:val="both"/>
+        <w:rPr>
+          <w:rFonts w:ascii="Times New Roman" w:hAnsi="Times New Roman" w:cs="Times New Roman"/>
+          <w:bCs/>
+          <w:sz w:val="26"/>
+          <w:szCs w:val="26"/>
+        </w:rPr>
+      </w:pPr>
+      <w:r>
+        <w:rPr>
+          <w:rFonts w:ascii="Times New Roman" w:hAnsi="Times New Roman" w:cs="Times New Roman"/>
+          <w:b/>
+          <w:bCs/>
+          <w:sz w:val="26"/>
+          <w:szCs w:val="26"/>
+        </w:rPr>
+        <w:t>Thông báo bệnh nhân cho bác sĩ/y tá:</w:t>
+      </w:r>
+      <w:r>
+        <w:rPr>
+          <w:rFonts w:ascii="Times New Roman" w:hAnsi="Times New Roman" w:cs="Times New Roman"/>
+          <w:bCs/>
+          <w:sz w:val="26"/>
+          <w:szCs w:val="26"/>
+        </w:rPr>
+        <w:t xml:space="preserve"> Thông báo khi bệnh nhân đã check-in và sẵn sàng được tiếp nhận. </w:t>
+      </w:r>
+    </w:p>
+    <w:p>
+      <w:pPr>
+        <w:pStyle w:val="ListParagraph"/>
+        <w:numPr>
+          <w:ilvl w:val="1"/>
+          <w:numId w:val="10"/>
+        </w:numPr>
+        <w:spacing w:after="120" w:line="240" w:lineRule="auto"/>
+        <w:jc w:val="both"/>
+        <w:rPr>
+          <w:rFonts w:ascii="Times New Roman" w:hAnsi="Times New Roman" w:cs="Times New Roman"/>
+          <w:bCs/>
+          <w:sz w:val="26"/>
+          <w:szCs w:val="26"/>
+          <w:lang w:val="vi-VN"/>
+        </w:rPr>
+      </w:pPr>
+      <w:r>
+        <w:rPr>
+          <w:rFonts w:ascii="Times New Roman" w:hAnsi="Times New Roman" w:cs="Times New Roman"/>
+          <w:b/>
+          <w:bCs/>
+          <w:sz w:val="26"/>
+          <w:szCs w:val="26"/>
+        </w:rPr>
+        <w:t>Theo dõi danh sách bệnh nhân chờ khám:</w:t>
+      </w:r>
+      <w:r>
+        <w:rPr>
+          <w:rFonts w:ascii="Times New Roman" w:hAnsi="Times New Roman" w:cs="Times New Roman"/>
+          <w:bCs/>
+          <w:sz w:val="26"/>
+          <w:szCs w:val="26"/>
+        </w:rPr>
+        <w:t xml:space="preserve"> Cho phép nhân viên và bác sĩ xem danh sách bệnh nhân đã check-in/chờ khám.</w:t>
+      </w:r>
+    </w:p>
+    <w:p>
+      <w:pPr>
+        <w:spacing w:after="120" w:line="240" w:lineRule="auto"/>
+        <w:jc w:val="both"/>
+        <w:rPr>
+          <w:rFonts w:ascii="Times New Roman" w:hAnsi="Times New Roman" w:cs="Times New Roman"/>
+          <w:b/>
+          <w:sz w:val="26"/>
+          <w:szCs w:val="26"/>
+          <w:lang w:val="vi-VN"/>
+        </w:rPr>
+      </w:pPr>
+      <w:r>
+        <w:rPr>
+          <w:rFonts w:ascii="Times New Roman" w:hAnsi="Times New Roman" w:cs="Times New Roman"/>
+          <w:b/>
+          <w:sz w:val="26"/>
+          <w:szCs w:val="26"/>
+          <w:lang w:val="vi-VN"/>
+        </w:rPr>
+        <w:t>Yêu cầu phi chức năng :</w:t>
+      </w:r>
+    </w:p>
+    <w:tbl>
+      <w:tblPr>
+        <w:tblStyle w:val="TableGrid"/>
+        <w:tblW w:w="0" w:type="auto"/>
+        <w:tblLook w:val="04A0" w:firstRow="1" w:lastRow="0" w:firstColumn="1" w:lastColumn="0" w:noHBand="0" w:noVBand="1"/>
+      </w:tblPr>
+      <w:tblGrid>
+        <w:gridCol w:w="5122"/>
+        <w:gridCol w:w="5123"/>
+      </w:tblGrid>
+      <w:tr>
+        <w:tc>
+          <w:tcPr>
+            <w:tcW w:w="5122" w:type="dxa"/>
+          </w:tcPr>
+          <w:p>
+            <w:pPr>
+              <w:spacing w:after="120"/>
+              <w:jc w:val="both"/>
+              <w:rPr>
+                <w:rFonts w:ascii="Times New Roman" w:hAnsi="Times New Roman" w:cs="Times New Roman"/>
+                <w:b/>
+                <w:i/>
+                <w:iCs/>
+                <w:sz w:val="26"/>
+                <w:szCs w:val="26"/>
+                <w:lang w:val="vi-VN"/>
+              </w:rPr>
+            </w:pPr>
+            <w:r>
+              <w:rPr>
+                <w:rFonts w:ascii="Times New Roman" w:hAnsi="Times New Roman" w:cs="Times New Roman"/>
+                <w:b/>
+                <w:i/>
+                <w:iCs/>
+                <w:sz w:val="26"/>
+                <w:szCs w:val="26"/>
+              </w:rPr>
+              <w:lastRenderedPageBreak/>
+              <w:t>Nhóm</w:t>
+            </w:r>
+          </w:p>
+        </w:tc>
+        <w:tc>
+          <w:tcPr>
+            <w:tcW w:w="5123" w:type="dxa"/>
+          </w:tcPr>
+          <w:p>
+            <w:pPr>
+              <w:spacing w:after="120"/>
+              <w:jc w:val="both"/>
+              <w:rPr>
+                <w:rFonts w:ascii="Times New Roman" w:hAnsi="Times New Roman" w:cs="Times New Roman"/>
+                <w:b/>
+                <w:i/>
+                <w:iCs/>
+                <w:sz w:val="26"/>
+                <w:szCs w:val="26"/>
+                <w:lang w:val="vi-VN"/>
+              </w:rPr>
+            </w:pPr>
+            <w:r>
+              <w:rPr>
+                <w:rFonts w:ascii="Times New Roman" w:hAnsi="Times New Roman" w:cs="Times New Roman"/>
+                <w:b/>
+                <w:i/>
+                <w:iCs/>
+                <w:sz w:val="26"/>
+                <w:szCs w:val="26"/>
+              </w:rPr>
+              <w:t>Yêu cầu phi chức năng</w:t>
+            </w:r>
+          </w:p>
+        </w:tc>
+      </w:tr>
+      <w:tr>
+        <w:tc>
+          <w:tcPr>
+            <w:tcW w:w="5122" w:type="dxa"/>
+          </w:tcPr>
+          <w:p>
+            <w:pPr>
+              <w:spacing w:after="120"/>
+              <w:jc w:val="both"/>
+              <w:rPr>
+                <w:rFonts w:ascii="Times New Roman" w:hAnsi="Times New Roman" w:cs="Times New Roman"/>
+                <w:bCs/>
+                <w:sz w:val="26"/>
+                <w:szCs w:val="26"/>
+                <w:lang w:val="vi-VN"/>
+              </w:rPr>
+            </w:pPr>
+            <w:r>
+              <w:rPr>
+                <w:rFonts w:ascii="Times New Roman" w:hAnsi="Times New Roman" w:cs="Times New Roman"/>
+                <w:bCs/>
+                <w:sz w:val="26"/>
+                <w:szCs w:val="26"/>
+              </w:rPr>
+              <w:t>Hiệu năng (Performance)</w:t>
+            </w:r>
+          </w:p>
+        </w:tc>
+        <w:tc>
+          <w:tcPr>
+            <w:tcW w:w="5123" w:type="dxa"/>
+          </w:tcPr>
+          <w:p>
+            <w:pPr>
+              <w:spacing w:after="120"/>
+              <w:jc w:val="both"/>
+              <w:rPr>
+                <w:rFonts w:ascii="Times New Roman" w:hAnsi="Times New Roman" w:cs="Times New Roman"/>
+                <w:bCs/>
+                <w:sz w:val="26"/>
+                <w:szCs w:val="26"/>
+                <w:lang w:val="vi-VN"/>
+              </w:rPr>
+            </w:pPr>
+            <w:r>
+              <w:rPr>
+                <w:rFonts w:ascii="Times New Roman" w:hAnsi="Times New Roman" w:cs="Times New Roman"/>
+                <w:bCs/>
+                <w:sz w:val="26"/>
+                <w:szCs w:val="26"/>
+              </w:rPr>
+              <w:t>P</w:t>
+            </w:r>
+            <w:r>
+              <w:rPr>
+                <w:rFonts w:ascii="Times New Roman" w:hAnsi="Times New Roman" w:cs="Times New Roman"/>
+                <w:bCs/>
+                <w:sz w:val="26"/>
+                <w:szCs w:val="26"/>
+              </w:rPr>
+              <w:t xml:space="preserve">hản hồi các thao tác xem, tìm kiếm, tạo hoặc cập nhật lịch hẹn trong khoảng </w:t>
+            </w:r>
+            <w:r>
+              <w:rPr>
+                <w:rFonts w:ascii="Times New Roman" w:hAnsi="Times New Roman" w:cs="Times New Roman"/>
+                <w:sz w:val="26"/>
+                <w:szCs w:val="26"/>
+              </w:rPr>
+              <w:t>1–2 giây</w:t>
+            </w:r>
+          </w:p>
+        </w:tc>
+      </w:tr>
+      <w:tr>
+        <w:tc>
+          <w:tcPr>
+            <w:tcW w:w="5122" w:type="dxa"/>
+          </w:tcPr>
+          <w:p>
+            <w:pPr>
+              <w:spacing w:after="120"/>
+              <w:jc w:val="both"/>
+              <w:rPr>
+                <w:rFonts w:ascii="Times New Roman" w:hAnsi="Times New Roman" w:cs="Times New Roman"/>
+                <w:bCs/>
+                <w:sz w:val="26"/>
+                <w:szCs w:val="26"/>
+                <w:lang w:val="vi-VN"/>
+              </w:rPr>
+            </w:pPr>
+            <w:r>
+              <w:rPr>
+                <w:rFonts w:ascii="Times New Roman" w:hAnsi="Times New Roman" w:cs="Times New Roman"/>
+                <w:bCs/>
+                <w:sz w:val="26"/>
+                <w:szCs w:val="26"/>
+              </w:rPr>
+              <w:t>Bảo mật (Security)</w:t>
+            </w:r>
+          </w:p>
+        </w:tc>
+        <w:tc>
+          <w:tcPr>
+            <w:tcW w:w="5123" w:type="dxa"/>
+          </w:tcPr>
+          <w:p>
+            <w:pPr>
+              <w:spacing w:after="120"/>
+              <w:jc w:val="both"/>
+              <w:rPr>
+                <w:rFonts w:ascii="Times New Roman" w:hAnsi="Times New Roman" w:cs="Times New Roman"/>
+                <w:bCs/>
+                <w:sz w:val="26"/>
+                <w:szCs w:val="26"/>
+                <w:lang w:val="vi-VN"/>
+              </w:rPr>
+            </w:pPr>
+            <w:r>
+              <w:rPr>
+                <w:rFonts w:ascii="Times New Roman" w:hAnsi="Times New Roman" w:cs="Times New Roman"/>
+                <w:bCs/>
+                <w:sz w:val="26"/>
+                <w:szCs w:val="26"/>
+              </w:rPr>
+              <w:t>Chỉ người dùng được cấp quyền mới có thể xem hoặc chỉnh sửa thông tin lịch hẹn và bệnh nhân.</w:t>
+            </w:r>
+          </w:p>
+        </w:tc>
+      </w:tr>
+      <w:tr>
+        <w:tc>
+          <w:tcPr>
+            <w:tcW w:w="5122" w:type="dxa"/>
+          </w:tcPr>
+          <w:p>
+            <w:pPr>
+              <w:spacing w:after="120"/>
+              <w:jc w:val="both"/>
+              <w:rPr>
+                <w:rFonts w:ascii="Times New Roman" w:hAnsi="Times New Roman" w:cs="Times New Roman"/>
+                <w:bCs/>
+                <w:sz w:val="26"/>
+                <w:szCs w:val="26"/>
+                <w:lang w:val="vi-VN"/>
+              </w:rPr>
+            </w:pPr>
+            <w:r>
+              <w:rPr>
+                <w:rFonts w:ascii="Times New Roman" w:hAnsi="Times New Roman" w:cs="Times New Roman"/>
+                <w:bCs/>
+                <w:sz w:val="26"/>
+                <w:szCs w:val="26"/>
+              </w:rPr>
+              <w:t>Phân quyền (Authorization)</w:t>
+            </w:r>
+          </w:p>
+        </w:tc>
+        <w:tc>
+          <w:tcPr>
+            <w:tcW w:w="5123" w:type="dxa"/>
+          </w:tcPr>
+          <w:p>
+            <w:pPr>
+              <w:spacing w:after="120"/>
+              <w:jc w:val="both"/>
+              <w:rPr>
+                <w:rFonts w:ascii="Times New Roman" w:hAnsi="Times New Roman" w:cs="Times New Roman"/>
+                <w:bCs/>
+                <w:sz w:val="26"/>
+                <w:szCs w:val="26"/>
+                <w:lang w:val="vi-VN"/>
+              </w:rPr>
+            </w:pPr>
+            <w:r>
+              <w:rPr>
+                <w:rFonts w:ascii="Times New Roman" w:hAnsi="Times New Roman" w:cs="Times New Roman"/>
+                <w:bCs/>
+                <w:sz w:val="26"/>
+                <w:szCs w:val="26"/>
+              </w:rPr>
+              <w:t>Nhân viên, bác sĩ và y tá chỉ được thực hiện các chức năng phù hợp với vai trò của mình.</w:t>
+            </w:r>
+          </w:p>
+        </w:tc>
+      </w:tr>
+      <w:tr>
+        <w:tc>
+          <w:tcPr>
+            <w:tcW w:w="5122" w:type="dxa"/>
+          </w:tcPr>
+          <w:p>
+            <w:pPr>
+              <w:spacing w:after="120"/>
+              <w:jc w:val="both"/>
+              <w:rPr>
+                <w:rFonts w:ascii="Times New Roman" w:hAnsi="Times New Roman" w:cs="Times New Roman"/>
+                <w:bCs/>
+                <w:sz w:val="26"/>
+                <w:szCs w:val="26"/>
+              </w:rPr>
+            </w:pPr>
+            <w:r>
+              <w:rPr>
+                <w:rFonts w:ascii="Times New Roman" w:hAnsi="Times New Roman" w:cs="Times New Roman"/>
+                <w:bCs/>
+                <w:sz w:val="26"/>
+                <w:szCs w:val="26"/>
+              </w:rPr>
+              <w:t>Toàn vẹn dữ liệu (Data Integrity)</w:t>
+            </w:r>
+          </w:p>
+        </w:tc>
+        <w:tc>
+          <w:tcPr>
+            <w:tcW w:w="5123" w:type="dxa"/>
+          </w:tcPr>
+          <w:p>
+            <w:pPr>
+              <w:spacing w:after="120"/>
+              <w:jc w:val="both"/>
+              <w:rPr>
+                <w:rFonts w:ascii="Times New Roman" w:hAnsi="Times New Roman" w:cs="Times New Roman"/>
+                <w:bCs/>
+                <w:sz w:val="26"/>
+                <w:szCs w:val="26"/>
+                <w:lang w:val="vi-VN"/>
+              </w:rPr>
+            </w:pPr>
+            <w:r>
+              <w:rPr>
+                <w:rFonts w:ascii="Times New Roman" w:hAnsi="Times New Roman" w:cs="Times New Roman"/>
+                <w:bCs/>
+                <w:sz w:val="26"/>
+                <w:szCs w:val="26"/>
+              </w:rPr>
+              <w:t xml:space="preserve">đảm bảo thông tin lịch hẹn chính xác, không cho phép </w:t>
+            </w:r>
+            <w:r>
+              <w:rPr>
+                <w:rFonts w:ascii="Times New Roman" w:hAnsi="Times New Roman" w:cs="Times New Roman"/>
+                <w:sz w:val="26"/>
+                <w:szCs w:val="26"/>
+              </w:rPr>
+              <w:t>trùng lịch</w:t>
+            </w:r>
+          </w:p>
+        </w:tc>
+      </w:tr>
+      <w:tr>
+        <w:tc>
+          <w:tcPr>
+            <w:tcW w:w="5122" w:type="dxa"/>
+          </w:tcPr>
+          <w:p>
+            <w:pPr>
+              <w:spacing w:after="120"/>
+              <w:jc w:val="both"/>
+              <w:rPr>
+                <w:rFonts w:ascii="Times New Roman" w:hAnsi="Times New Roman" w:cs="Times New Roman"/>
+                <w:bCs/>
+                <w:sz w:val="26"/>
+                <w:szCs w:val="26"/>
+              </w:rPr>
+            </w:pPr>
+            <w:r>
+              <w:rPr>
+                <w:rFonts w:ascii="Times New Roman" w:hAnsi="Times New Roman" w:cs="Times New Roman"/>
+                <w:bCs/>
+                <w:sz w:val="26"/>
+                <w:szCs w:val="26"/>
+              </w:rPr>
+              <w:t>Độ tin cậy (Reliability)</w:t>
+            </w:r>
+          </w:p>
+        </w:tc>
+        <w:tc>
+          <w:tcPr>
+            <w:tcW w:w="5123" w:type="dxa"/>
+          </w:tcPr>
+          <w:p>
+            <w:pPr>
+              <w:spacing w:after="120"/>
+              <w:jc w:val="both"/>
+              <w:rPr>
+                <w:rFonts w:ascii="Times New Roman" w:hAnsi="Times New Roman" w:cs="Times New Roman"/>
+                <w:bCs/>
+                <w:sz w:val="26"/>
+                <w:szCs w:val="26"/>
+                <w:lang w:val="vi-VN"/>
+              </w:rPr>
+            </w:pPr>
+            <w:r>
+              <w:rPr>
+                <w:rFonts w:ascii="Times New Roman" w:hAnsi="Times New Roman" w:cs="Times New Roman"/>
+                <w:bCs/>
+                <w:sz w:val="26"/>
+                <w:szCs w:val="26"/>
+              </w:rPr>
+              <w:t>hao tác tạo, cập nhật, xác nhận hoặc hủy lịch phải được lưu chính xác, tránh mất dữ liệu khi xảy ra lỗi.</w:t>
+            </w:r>
+          </w:p>
+        </w:tc>
+      </w:tr>
+      <w:tr>
+        <w:tc>
+          <w:tcPr>
+            <w:tcW w:w="5122" w:type="dxa"/>
+          </w:tcPr>
+          <w:p>
+            <w:pPr>
+              <w:spacing w:after="120"/>
+              <w:jc w:val="both"/>
+              <w:rPr>
+                <w:rFonts w:ascii="Times New Roman" w:hAnsi="Times New Roman" w:cs="Times New Roman"/>
+                <w:bCs/>
+                <w:sz w:val="26"/>
+                <w:szCs w:val="26"/>
+              </w:rPr>
+            </w:pPr>
+            <w:r>
+              <w:rPr>
+                <w:rFonts w:ascii="Times New Roman" w:hAnsi="Times New Roman" w:cs="Times New Roman"/>
+                <w:bCs/>
+                <w:sz w:val="26"/>
+                <w:szCs w:val="26"/>
+              </w:rPr>
+              <w:t>Tính sẵn sàng (Availability)</w:t>
+            </w:r>
+          </w:p>
+        </w:tc>
+        <w:tc>
+          <w:tcPr>
+            <w:tcW w:w="5123" w:type="dxa"/>
+          </w:tcPr>
+          <w:p>
+            <w:pPr>
+              <w:spacing w:after="120"/>
+              <w:jc w:val="both"/>
+              <w:rPr>
+                <w:rFonts w:ascii="Times New Roman" w:hAnsi="Times New Roman" w:cs="Times New Roman"/>
+                <w:bCs/>
+                <w:sz w:val="26"/>
+                <w:szCs w:val="26"/>
+                <w:lang w:val="vi-VN"/>
+              </w:rPr>
+            </w:pPr>
+            <w:r>
+              <w:rPr>
+                <w:rFonts w:ascii="Times New Roman" w:hAnsi="Times New Roman" w:cs="Times New Roman"/>
+                <w:bCs/>
+                <w:sz w:val="26"/>
+                <w:szCs w:val="26"/>
+              </w:rPr>
+              <w:t>Hệ thống cần hoạt động ổn định trong thời gian phòng khám tiếp nhận bệnh nhân.</w:t>
+            </w:r>
+          </w:p>
+        </w:tc>
+      </w:tr>
+      <w:tr>
+        <w:tc>
+          <w:tcPr>
+            <w:tcW w:w="5122" w:type="dxa"/>
+          </w:tcPr>
+          <w:p>
+            <w:pPr>
+              <w:spacing w:after="120"/>
+              <w:jc w:val="both"/>
+              <w:rPr>
+                <w:rFonts w:ascii="Times New Roman" w:hAnsi="Times New Roman" w:cs="Times New Roman"/>
+                <w:bCs/>
+                <w:sz w:val="26"/>
+                <w:szCs w:val="26"/>
+              </w:rPr>
+            </w:pPr>
+            <w:r>
+              <w:rPr>
+                <w:rFonts w:ascii="Times New Roman" w:hAnsi="Times New Roman" w:cs="Times New Roman"/>
+                <w:bCs/>
+                <w:sz w:val="26"/>
+                <w:szCs w:val="26"/>
+              </w:rPr>
+              <w:t>Dễ sử dụng (Usability)</w:t>
+            </w:r>
+          </w:p>
+        </w:tc>
+        <w:tc>
+          <w:tcPr>
+            <w:tcW w:w="5123" w:type="dxa"/>
+          </w:tcPr>
+          <w:p>
+            <w:pPr>
+              <w:spacing w:after="120"/>
+              <w:jc w:val="both"/>
+              <w:rPr>
+                <w:rFonts w:ascii="Times New Roman" w:hAnsi="Times New Roman" w:cs="Times New Roman"/>
+                <w:bCs/>
+                <w:sz w:val="26"/>
+                <w:szCs w:val="26"/>
+                <w:lang w:val="vi-VN"/>
+              </w:rPr>
+            </w:pPr>
+            <w:r>
+              <w:rPr>
+                <w:rFonts w:ascii="Times New Roman" w:hAnsi="Times New Roman" w:cs="Times New Roman"/>
+                <w:bCs/>
+                <w:sz w:val="26"/>
+                <w:szCs w:val="26"/>
+              </w:rPr>
+              <w:t>Nhân viên có thể nhanh chóng tìm kiếm bệnh nhân, kiểm tra lịch và thực hiện check-in mà không cần nhiều thao tác.</w:t>
+            </w:r>
+          </w:p>
+        </w:tc>
+      </w:tr>
+    </w:tbl>
+    <w:p>
+      <w:pPr>
+        <w:spacing w:after="120" w:line="240" w:lineRule="auto"/>
+        <w:jc w:val="both"/>
+        <w:rPr>
+          <w:rFonts w:ascii="Times New Roman" w:hAnsi="Times New Roman" w:cs="Times New Roman"/>
+          <w:bCs/>
+          <w:sz w:val="26"/>
+          <w:szCs w:val="26"/>
+          <w:lang w:val="vi-VN"/>
         </w:rPr>
       </w:pPr>
     </w:p>
@@ -6549,9 +8003,7 @@
     </w:p>
     <w:p>
       <w:pPr>
-        <w:pStyle w:val="ListParagraph"/>
         <w:spacing w:after="120" w:line="240" w:lineRule="auto"/>
-        <w:ind w:left="284"/>
         <w:jc w:val="both"/>
         <w:rPr>
           <w:rFonts w:ascii="Times New Roman" w:hAnsi="Times New Roman" w:cs="Times New Roman"/>
@@ -7325,6 +8777,119 @@
     </w:lvl>
   </w:abstractNum>
   <w:abstractNum w:abstractNumId="3" w15:restartNumberingAfterBreak="0">
+    <w:nsid w:val="49B852CC"/>
+    <w:multiLevelType w:val="hybridMultilevel"/>
+    <w:tmpl w:val="3768E4CC"/>
+    <w:lvl w:ilvl="0" w:tplc="04090001">
+      <w:start w:val="1"/>
+      <w:numFmt w:val="bullet"/>
+      <w:lvlText w:val=""/>
+      <w:lvlJc w:val="left"/>
+      <w:pPr>
+        <w:ind w:left="720" w:hanging="360"/>
+      </w:pPr>
+      <w:rPr>
+        <w:rFonts w:ascii="Symbol" w:hAnsi="Symbol" w:hint="default"/>
+      </w:rPr>
+    </w:lvl>
+    <w:lvl w:ilvl="1" w:tplc="04090003" w:tentative="1">
+      <w:start w:val="1"/>
+      <w:numFmt w:val="bullet"/>
+      <w:lvlText w:val="o"/>
+      <w:lvlJc w:val="left"/>
+      <w:pPr>
+        <w:ind w:left="1440" w:hanging="360"/>
+      </w:pPr>
+      <w:rPr>
+        <w:rFonts w:ascii="Courier New" w:hAnsi="Courier New" w:cs="Courier New" w:hint="default"/>
+      </w:rPr>
+    </w:lvl>
+    <w:lvl w:ilvl="2" w:tplc="04090005" w:tentative="1">
+      <w:start w:val="1"/>
+      <w:numFmt w:val="bullet"/>
+      <w:lvlText w:val=""/>
+      <w:lvlJc w:val="left"/>
+      <w:pPr>
+        <w:ind w:left="2160" w:hanging="360"/>
+      </w:pPr>
+      <w:rPr>
+        <w:rFonts w:ascii="Wingdings" w:hAnsi="Wingdings" w:hint="default"/>
+      </w:rPr>
+    </w:lvl>
+    <w:lvl w:ilvl="3" w:tplc="04090001" w:tentative="1">
+      <w:start w:val="1"/>
+      <w:numFmt w:val="bullet"/>
+      <w:lvlText w:val=""/>
+      <w:lvlJc w:val="left"/>
+      <w:pPr>
+        <w:ind w:left="2880" w:hanging="360"/>
+      </w:pPr>
+      <w:rPr>
+        <w:rFonts w:ascii="Symbol" w:hAnsi="Symbol" w:hint="default"/>
+      </w:rPr>
+    </w:lvl>
+    <w:lvl w:ilvl="4" w:tplc="04090003" w:tentative="1">
+      <w:start w:val="1"/>
+      <w:numFmt w:val="bullet"/>
+      <w:lvlText w:val="o"/>
+      <w:lvlJc w:val="left"/>
+      <w:pPr>
+        <w:ind w:left="3600" w:hanging="360"/>
+      </w:pPr>
+      <w:rPr>
+        <w:rFonts w:ascii="Courier New" w:hAnsi="Courier New" w:cs="Courier New" w:hint="default"/>
+      </w:rPr>
+    </w:lvl>
+    <w:lvl w:ilvl="5" w:tplc="04090005" w:tentative="1">
+      <w:start w:val="1"/>
+      <w:numFmt w:val="bullet"/>
+      <w:lvlText w:val=""/>
+      <w:lvlJc w:val="left"/>
+      <w:pPr>
+        <w:ind w:left="4320" w:hanging="360"/>
+      </w:pPr>
+      <w:rPr>
+        <w:rFonts w:ascii="Wingdings" w:hAnsi="Wingdings" w:hint="default"/>
+      </w:rPr>
+    </w:lvl>
+    <w:lvl w:ilvl="6" w:tplc="04090001" w:tentative="1">
+      <w:start w:val="1"/>
+      <w:numFmt w:val="bullet"/>
+      <w:lvlText w:val=""/>
+      <w:lvlJc w:val="left"/>
+      <w:pPr>
+        <w:ind w:left="5040" w:hanging="360"/>
+      </w:pPr>
+      <w:rPr>
+        <w:rFonts w:ascii="Symbol" w:hAnsi="Symbol" w:hint="default"/>
+      </w:rPr>
+    </w:lvl>
+    <w:lvl w:ilvl="7" w:tplc="04090003" w:tentative="1">
+      <w:start w:val="1"/>
+      <w:numFmt w:val="bullet"/>
+      <w:lvlText w:val="o"/>
+      <w:lvlJc w:val="left"/>
+      <w:pPr>
+        <w:ind w:left="5760" w:hanging="360"/>
+      </w:pPr>
+      <w:rPr>
+        <w:rFonts w:ascii="Courier New" w:hAnsi="Courier New" w:cs="Courier New" w:hint="default"/>
+      </w:rPr>
+    </w:lvl>
+    <w:lvl w:ilvl="8" w:tplc="04090005" w:tentative="1">
+      <w:start w:val="1"/>
+      <w:numFmt w:val="bullet"/>
+      <w:lvlText w:val=""/>
+      <w:lvlJc w:val="left"/>
+      <w:pPr>
+        <w:ind w:left="6480" w:hanging="360"/>
+      </w:pPr>
+      <w:rPr>
+        <w:rFonts w:ascii="Wingdings" w:hAnsi="Wingdings" w:hint="default"/>
+      </w:rPr>
+    </w:lvl>
+  </w:abstractNum>
+  <w:abstractNum w:abstractNumId="4" w15:restartNumberingAfterBreak="0">
     <w:nsid w:val="53FD5395"/>
     <w:multiLevelType w:val="hybridMultilevel"/>
     <w:tmpl w:val="A2DA055C"/>
@@ -7413,7 +8978,7 @@
       </w:pPr>
     </w:lvl>
   </w:abstractNum>
-  <w:abstractNum w:abstractNumId="4" w15:restartNumberingAfterBreak="0">
+  <w:abstractNum w:abstractNumId="5" w15:restartNumberingAfterBreak="0">
     <w:nsid w:val="59FD1723"/>
     <w:multiLevelType w:val="hybridMultilevel"/>
     <w:tmpl w:val="8990CF0E"/>
@@ -7553,7 +9118,7 @@
       </w:rPr>
     </w:lvl>
   </w:abstractNum>
-  <w:abstractNum w:abstractNumId="5" w15:restartNumberingAfterBreak="0">
+  <w:abstractNum w:abstractNumId="6" w15:restartNumberingAfterBreak="0">
     <w:nsid w:val="64107A9D"/>
     <w:multiLevelType w:val="hybridMultilevel"/>
     <w:tmpl w:val="9CDC545A"/>
@@ -7642,7 +9207,7 @@
       </w:pPr>
     </w:lvl>
   </w:abstractNum>
-  <w:abstractNum w:abstractNumId="6" w15:restartNumberingAfterBreak="0">
+  <w:abstractNum w:abstractNumId="7" w15:restartNumberingAfterBreak="0">
     <w:nsid w:val="664646E2"/>
     <w:multiLevelType w:val="hybridMultilevel"/>
     <w:tmpl w:val="96EAF268"/>
@@ -7731,7 +9296,119 @@
       </w:pPr>
     </w:lvl>
   </w:abstractNum>
-  <w:abstractNum w:abstractNumId="7" w15:restartNumberingAfterBreak="0">
+  <w:abstractNum w:abstractNumId="8" w15:restartNumberingAfterBreak="0">
+    <w:nsid w:val="6ABE4E6B"/>
+    <w:multiLevelType w:val="hybridMultilevel"/>
+    <w:tmpl w:val="C1929978"/>
+    <w:lvl w:ilvl="0" w:tplc="1542DD70">
+      <w:numFmt w:val="bullet"/>
+      <w:lvlText w:val="-"/>
+      <w:lvlJc w:val="left"/>
+      <w:pPr>
+        <w:ind w:left="720" w:hanging="360"/>
+      </w:pPr>
+      <w:rPr>
+        <w:rFonts w:ascii="Times New Roman" w:eastAsiaTheme="minorHAnsi" w:hAnsi="Times New Roman" w:cs="Times New Roman" w:hint="default"/>
+      </w:rPr>
+    </w:lvl>
+    <w:lvl w:ilvl="1" w:tplc="04090003">
+      <w:start w:val="1"/>
+      <w:numFmt w:val="bullet"/>
+      <w:lvlText w:val="o"/>
+      <w:lvlJc w:val="left"/>
+      <w:pPr>
+        <w:ind w:left="1440" w:hanging="360"/>
+      </w:pPr>
+      <w:rPr>
+        <w:rFonts w:ascii="Courier New" w:hAnsi="Courier New" w:cs="Courier New" w:hint="default"/>
+      </w:rPr>
+    </w:lvl>
+    <w:lvl w:ilvl="2" w:tplc="04090005" w:tentative="1">
+      <w:start w:val="1"/>
+      <w:numFmt w:val="bullet"/>
+      <w:lvlText w:val=""/>
+      <w:lvlJc w:val="left"/>
+      <w:pPr>
+        <w:ind w:left="2160" w:hanging="360"/>
+      </w:pPr>
+      <w:rPr>
+        <w:rFonts w:ascii="Wingdings" w:hAnsi="Wingdings" w:hint="default"/>
+      </w:rPr>
+    </w:lvl>
+    <w:lvl w:ilvl="3" w:tplc="04090001" w:tentative="1">
+      <w:start w:val="1"/>
+      <w:numFmt w:val="bullet"/>
+      <w:lvlText w:val=""/>
+      <w:lvlJc w:val="left"/>
+      <w:pPr>
+        <w:ind w:left="2880" w:hanging="360"/>
+      </w:pPr>
+      <w:rPr>
+        <w:rFonts w:ascii="Symbol" w:hAnsi="Symbol" w:hint="default"/>
+      </w:rPr>
+    </w:lvl>
+    <w:lvl w:ilvl="4" w:tplc="04090003" w:tentative="1">
+      <w:start w:val="1"/>
+      <w:numFmt w:val="bullet"/>
+      <w:lvlText w:val="o"/>
+      <w:lvlJc w:val="left"/>
+      <w:pPr>
+        <w:ind w:left="3600" w:hanging="360"/>
+      </w:pPr>
+      <w:rPr>
+        <w:rFonts w:ascii="Courier New" w:hAnsi="Courier New" w:cs="Courier New" w:hint="default"/>
+      </w:rPr>
+    </w:lvl>
+    <w:lvl w:ilvl="5" w:tplc="04090005" w:tentative="1">
+      <w:start w:val="1"/>
+      <w:numFmt w:val="bullet"/>
+      <w:lvlText w:val=""/>
+      <w:lvlJc w:val="left"/>
+      <w:pPr>
+        <w:ind w:left="4320" w:hanging="360"/>
+      </w:pPr>
+      <w:rPr>
+        <w:rFonts w:ascii="Wingdings" w:hAnsi="Wingdings" w:hint="default"/>
+      </w:rPr>
+    </w:lvl>
+    <w:lvl w:ilvl="6" w:tplc="04090001" w:tentative="1">
+      <w:start w:val="1"/>
+      <w:numFmt w:val="bullet"/>
+      <w:lvlText w:val=""/>
+      <w:lvlJc w:val="left"/>
+      <w:pPr>
+        <w:ind w:left="5040" w:hanging="360"/>
+      </w:pPr>
+      <w:rPr>
+        <w:rFonts w:ascii="Symbol" w:hAnsi="Symbol" w:hint="default"/>
+      </w:rPr>
+    </w:lvl>
+    <w:lvl w:ilvl="7" w:tplc="04090003" w:tentative="1">
+      <w:start w:val="1"/>
+      <w:numFmt w:val="bullet"/>
+      <w:lvlText w:val="o"/>
+      <w:lvlJc w:val="left"/>
+      <w:pPr>
+        <w:ind w:left="5760" w:hanging="360"/>
+      </w:pPr>
+      <w:rPr>
+        <w:rFonts w:ascii="Courier New" w:hAnsi="Courier New" w:cs="Courier New" w:hint="default"/>
+      </w:rPr>
+    </w:lvl>
+    <w:lvl w:ilvl="8" w:tplc="04090005" w:tentative="1">
+      <w:start w:val="1"/>
+      <w:numFmt w:val="bullet"/>
+      <w:lvlText w:val=""/>
+      <w:lvlJc w:val="left"/>
+      <w:pPr>
+        <w:ind w:left="6480" w:hanging="360"/>
+      </w:pPr>
+      <w:rPr>
+        <w:rFonts w:ascii="Wingdings" w:hAnsi="Wingdings" w:hint="default"/>
+      </w:rPr>
+    </w:lvl>
+  </w:abstractNum>
+  <w:abstractNum w:abstractNumId="9" w15:restartNumberingAfterBreak="0">
     <w:nsid w:val="79BF5A33"/>
     <w:multiLevelType w:val="hybridMultilevel"/>
     <w:tmpl w:val="F466ABF6"/>
@@ -7821,19 +9498,19 @@
     </w:lvl>
   </w:abstractNum>
   <w:num w:numId="1" w16cid:durableId="350884850">
-    <w:abstractNumId w:val="7"/>
+    <w:abstractNumId w:val="9"/>
   </w:num>
   <w:num w:numId="2" w16cid:durableId="1043478131">
     <w:abstractNumId w:val="2"/>
   </w:num>
   <w:num w:numId="3" w16cid:durableId="1185749737">
-    <w:abstractNumId w:val="4"/>
+    <w:abstractNumId w:val="5"/>
   </w:num>
   <w:num w:numId="4" w16cid:durableId="963776825">
-    <w:abstractNumId w:val="6"/>
+    <w:abstractNumId w:val="7"/>
   </w:num>
   <w:num w:numId="5" w16cid:durableId="872424141">
-    <w:abstractNumId w:val="3"/>
+    <w:abstractNumId w:val="4"/>
   </w:num>
   <w:num w:numId="6" w16cid:durableId="1549294638">
     <w:abstractNumId w:val="1"/>
@@ -7842,7 +9519,13 @@
     <w:abstractNumId w:val="0"/>
   </w:num>
   <w:num w:numId="8" w16cid:durableId="1260599312">
-    <w:abstractNumId w:val="5"/>
+    <w:abstractNumId w:val="6"/>
+  </w:num>
+  <w:num w:numId="9" w16cid:durableId="1990665183">
+    <w:abstractNumId w:val="3"/>
+  </w:num>
+  <w:num w:numId="10" w16cid:durableId="1934894442">
+    <w:abstractNumId w:val="8"/>
   </w:num>
 </w:numbering>
 </file>
@@ -8346,6 +10029,17 @@
     <w:uiPriority w:val="99"/>
     <w:rsid w:val="0007450D"/>
   </w:style>
+  <w:style w:type="character" w:styleId="Strong">
+    <w:name w:val="Strong"/>
+    <w:basedOn w:val="DefaultParagraphFont"/>
+    <w:uiPriority w:val="22"/>
+    <w:qFormat/>
+    <w:rsid w:val="00814CBB"/>
+    <w:rPr>
+      <w:b/>
+      <w:bCs/>
+    </w:rPr>
+  </w:style>
 </w:styles>
 </file>
 

</xml_diff>